<commit_message>
working through the buttons
</commit_message>
<xml_diff>
--- a/Instructions.docx
+++ b/Instructions.docx
@@ -233,25 +233,7 @@
         <w:rPr>
           <w:lang w:val="en-US"/>
         </w:rPr>
-        <w:t xml:space="preserve"> (DV </w:t>
-      </w:r>
-      <w:r>
-        <w:rPr>
-          <w:lang w:val="en-US"/>
-        </w:rPr>
-        <w:t>up 5mm</w:t>
-      </w:r>
-      <w:r>
-        <w:rPr>
-          <w:lang w:val="en-US"/>
-        </w:rPr>
-        <w:t xml:space="preserve">) – moves to relative zero with DV moving </w:t>
-      </w:r>
-      <w:r>
-        <w:rPr>
-          <w:lang w:val="en-US"/>
-        </w:rPr>
-        <w:t>up 5mm</w:t>
+        <w:t xml:space="preserve"> (DV up 5mm) – moves to relative zero with DV moving up 5mm</w:t>
       </w:r>
     </w:p>
     <w:p>
@@ -411,19 +393,7 @@
         <w:rPr>
           <w:lang w:val="en-US"/>
         </w:rPr>
-        <w:t xml:space="preserve">Return </w:t>
-      </w:r>
-      <w:r>
-        <w:rPr>
-          <w:lang w:val="en-US"/>
-        </w:rPr>
-        <w:t>DV</w:t>
-      </w:r>
-      <w:r>
-        <w:rPr>
-          <w:lang w:val="en-US"/>
-        </w:rPr>
-        <w:t xml:space="preserve"> – </w:t>
+        <w:t xml:space="preserve">Return DV – </w:t>
       </w:r>
       <w:proofErr w:type="gramStart"/>
       <w:r>
@@ -437,37 +407,7 @@
         <w:rPr>
           <w:lang w:val="en-US"/>
         </w:rPr>
-        <w:t xml:space="preserve"> position does not move once retracted will return </w:t>
-      </w:r>
-      <w:r>
-        <w:rPr>
-          <w:lang w:val="en-US"/>
-        </w:rPr>
-        <w:t>DV</w:t>
-      </w:r>
-      <w:r>
-        <w:rPr>
-          <w:lang w:val="en-US"/>
-        </w:rPr>
-        <w:t xml:space="preserve"> to </w:t>
-      </w:r>
-      <w:r>
-        <w:rPr>
-          <w:lang w:val="en-US"/>
-        </w:rPr>
-        <w:t xml:space="preserve">1.5mm up from </w:t>
-      </w:r>
-      <w:r>
-        <w:rPr>
-          <w:lang w:val="en-US"/>
-        </w:rPr>
-        <w:t xml:space="preserve">previous </w:t>
-      </w:r>
-      <w:r>
-        <w:rPr>
-          <w:lang w:val="en-US"/>
-        </w:rPr>
-        <w:t>location</w:t>
+        <w:t xml:space="preserve"> position does not move once retracted will return DV to 1.5mm up from previous location</w:t>
       </w:r>
     </w:p>
     <w:p>
@@ -930,8 +870,577 @@
           <w:lang w:val="en-US"/>
         </w:rPr>
         <w:tab/>
-        <w:t>Use the toggle to select the speed, no other buttons required.</w:t>
-      </w:r>
+        <w:t xml:space="preserve">Use the toggle to select the speed, no other buttons </w:t>
+      </w:r>
+      <w:proofErr w:type="gramStart"/>
+      <w:r>
+        <w:rPr>
+          <w:lang w:val="en-US"/>
+        </w:rPr>
+        <w:t>required</w:t>
+      </w:r>
+      <w:proofErr w:type="gramEnd"/>
+      <w:r>
+        <w:rPr>
+          <w:lang w:val="en-US"/>
+        </w:rPr>
+        <w:t>.</w:t>
+      </w:r>
+    </w:p>
+    <w:p>
+      <w:pPr>
+        <w:spacing w:line="240" w:lineRule="auto"/>
+        <w:rPr>
+          <w:lang w:val="en-US"/>
+        </w:rPr>
+      </w:pPr>
+    </w:p>
+    <w:p>
+      <w:pPr>
+        <w:spacing w:line="240" w:lineRule="auto"/>
+        <w:rPr>
+          <w:lang w:val="en-US"/>
+        </w:rPr>
+      </w:pPr>
+      <w:r>
+        <w:rPr>
+          <w:lang w:val="en-US"/>
+        </w:rPr>
+        <w:t>Automated Movements:</w:t>
+      </w:r>
+    </w:p>
+    <w:p>
+      <w:pPr>
+        <w:spacing w:line="240" w:lineRule="auto"/>
+        <w:rPr>
+          <w:lang w:val="en-US"/>
+        </w:rPr>
+      </w:pPr>
+      <w:r>
+        <w:rPr>
+          <w:lang w:val="en-US"/>
+        </w:rPr>
+        <w:tab/>
+      </w:r>
+      <w:proofErr w:type="spellStart"/>
+      <w:r>
+        <w:rPr>
+          <w:lang w:val="en-US"/>
+        </w:rPr>
+        <w:t>StereoPylot</w:t>
+      </w:r>
+      <w:proofErr w:type="spellEnd"/>
+      <w:r>
+        <w:rPr>
+          <w:lang w:val="en-US"/>
+        </w:rPr>
+        <w:t xml:space="preserve"> SR</w:t>
+      </w:r>
+    </w:p>
+    <w:p>
+      <w:pPr>
+        <w:spacing w:line="240" w:lineRule="auto"/>
+        <w:rPr>
+          <w:lang w:val="en-US"/>
+        </w:rPr>
+      </w:pPr>
+      <w:r>
+        <w:rPr>
+          <w:lang w:val="en-US"/>
+        </w:rPr>
+        <w:tab/>
+      </w:r>
+      <w:r>
+        <w:rPr>
+          <w:lang w:val="en-US"/>
+        </w:rPr>
+        <w:tab/>
+        <w:t xml:space="preserve">3 methods of automated movement </w:t>
+      </w:r>
+    </w:p>
+    <w:p>
+      <w:pPr>
+        <w:pStyle w:val="ListParagraph"/>
+        <w:numPr>
+          <w:ilvl w:val="0"/>
+          <w:numId w:val="6"/>
+        </w:numPr>
+        <w:spacing w:line="240" w:lineRule="auto"/>
+        <w:rPr>
+          <w:lang w:val="en-US"/>
+        </w:rPr>
+      </w:pPr>
+      <w:proofErr w:type="spellStart"/>
+      <w:r>
+        <w:rPr>
+          <w:lang w:val="en-US"/>
+        </w:rPr>
+        <w:t>MakeI</w:t>
+      </w:r>
+      <w:r>
+        <w:rPr>
+          <w:lang w:val="en-US"/>
+        </w:rPr>
+        <w:t>t</w:t>
+      </w:r>
+      <w:r>
+        <w:rPr>
+          <w:lang w:val="en-US"/>
+        </w:rPr>
+        <w:t>So</w:t>
+      </w:r>
+      <w:proofErr w:type="spellEnd"/>
+      <w:r>
+        <w:rPr>
+          <w:lang w:val="en-US"/>
+        </w:rPr>
+        <w:t xml:space="preserve"> - </w:t>
+      </w:r>
+      <w:r>
+        <w:rPr>
+          <w:lang w:val="en-US"/>
+        </w:rPr>
+        <w:t xml:space="preserve">Move to X,Y, and Z via </w:t>
+      </w:r>
+      <w:r>
+        <w:rPr>
+          <w:lang w:val="en-US"/>
+        </w:rPr>
+        <w:t>manual entry or from list.</w:t>
+      </w:r>
+    </w:p>
+    <w:p>
+      <w:pPr>
+        <w:pStyle w:val="ListParagraph"/>
+        <w:numPr>
+          <w:ilvl w:val="0"/>
+          <w:numId w:val="6"/>
+        </w:numPr>
+        <w:spacing w:line="240" w:lineRule="auto"/>
+        <w:rPr>
+          <w:lang w:val="en-US"/>
+        </w:rPr>
+      </w:pPr>
+      <w:r>
+        <w:rPr>
+          <w:lang w:val="en-US"/>
+        </w:rPr>
+        <w:t>DV insert – Move to DV depth from entry from list</w:t>
+      </w:r>
+    </w:p>
+    <w:p>
+      <w:pPr>
+        <w:pStyle w:val="ListParagraph"/>
+        <w:numPr>
+          <w:ilvl w:val="0"/>
+          <w:numId w:val="6"/>
+        </w:numPr>
+        <w:spacing w:line="240" w:lineRule="auto"/>
+        <w:rPr>
+          <w:lang w:val="en-US"/>
+        </w:rPr>
+      </w:pPr>
+      <w:proofErr w:type="spellStart"/>
+      <w:r>
+        <w:rPr>
+          <w:lang w:val="en-US"/>
+        </w:rPr>
+        <w:t>Withdrawl</w:t>
+      </w:r>
+      <w:proofErr w:type="spellEnd"/>
+      <w:r>
+        <w:rPr>
+          <w:lang w:val="en-US"/>
+        </w:rPr>
+        <w:t xml:space="preserve"> – Withdraw based on parameters from list</w:t>
+      </w:r>
+    </w:p>
+    <w:p>
+      <w:pPr>
+        <w:pStyle w:val="ListParagraph"/>
+        <w:numPr>
+          <w:ilvl w:val="0"/>
+          <w:numId w:val="4"/>
+        </w:numPr>
+        <w:spacing w:line="240" w:lineRule="auto"/>
+        <w:rPr>
+          <w:lang w:val="en-US"/>
+        </w:rPr>
+      </w:pPr>
+      <w:r>
+        <w:rPr>
+          <w:lang w:val="en-US"/>
+        </w:rPr>
+        <w:t>Disengage safety</w:t>
+      </w:r>
+    </w:p>
+    <w:p>
+      <w:pPr>
+        <w:pStyle w:val="ListParagraph"/>
+        <w:numPr>
+          <w:ilvl w:val="0"/>
+          <w:numId w:val="4"/>
+        </w:numPr>
+        <w:spacing w:line="240" w:lineRule="auto"/>
+        <w:rPr>
+          <w:lang w:val="en-US"/>
+        </w:rPr>
+      </w:pPr>
+      <w:r>
+        <w:rPr>
+          <w:lang w:val="en-US"/>
+        </w:rPr>
+        <w:t>Select desired movement (</w:t>
+      </w:r>
+      <w:proofErr w:type="spellStart"/>
+      <w:r>
+        <w:rPr>
+          <w:lang w:val="en-US"/>
+        </w:rPr>
+        <w:t>MakeItSo</w:t>
+      </w:r>
+      <w:proofErr w:type="spellEnd"/>
+      <w:r>
+        <w:rPr>
+          <w:lang w:val="en-US"/>
+        </w:rPr>
+        <w:t>, DV insert, Withdraw) within 4 seconds</w:t>
+      </w:r>
+    </w:p>
+    <w:p>
+      <w:pPr>
+        <w:pStyle w:val="ListParagraph"/>
+        <w:numPr>
+          <w:ilvl w:val="0"/>
+          <w:numId w:val="4"/>
+        </w:numPr>
+        <w:spacing w:line="240" w:lineRule="auto"/>
+        <w:rPr>
+          <w:lang w:val="en-US"/>
+        </w:rPr>
+      </w:pPr>
+      <w:r>
+        <w:rPr>
+          <w:lang w:val="en-US"/>
+        </w:rPr>
+        <w:t>Press Engage within 4 seconds of selecting the movement</w:t>
+      </w:r>
+      <w:r>
+        <w:rPr>
+          <w:lang w:val="en-US"/>
+        </w:rPr>
+        <w:t xml:space="preserve"> selection</w:t>
+      </w:r>
+    </w:p>
+    <w:p>
+      <w:pPr>
+        <w:pStyle w:val="ListParagraph"/>
+        <w:numPr>
+          <w:ilvl w:val="0"/>
+          <w:numId w:val="4"/>
+        </w:numPr>
+        <w:spacing w:line="240" w:lineRule="auto"/>
+        <w:rPr>
+          <w:lang w:val="en-US"/>
+        </w:rPr>
+      </w:pPr>
+      <w:r>
+        <w:rPr>
+          <w:lang w:val="en-US"/>
+        </w:rPr>
+        <w:t>T</w:t>
+      </w:r>
+      <w:r>
+        <w:rPr>
+          <w:lang w:val="en-US"/>
+        </w:rPr>
+        <w:t>o</w:t>
+      </w:r>
+      <w:r>
+        <w:rPr>
+          <w:lang w:val="en-US"/>
+        </w:rPr>
+        <w:t xml:space="preserve"> STOP automated movement</w:t>
+      </w:r>
+      <w:r>
+        <w:rPr>
+          <w:lang w:val="en-US"/>
+        </w:rPr>
+        <w:t xml:space="preserve"> of DV insert or </w:t>
+      </w:r>
+      <w:proofErr w:type="spellStart"/>
+      <w:r>
+        <w:rPr>
+          <w:lang w:val="en-US"/>
+        </w:rPr>
+        <w:t>Withdrawl</w:t>
+      </w:r>
+      <w:proofErr w:type="spellEnd"/>
+    </w:p>
+    <w:p>
+      <w:pPr>
+        <w:pStyle w:val="ListParagraph"/>
+        <w:numPr>
+          <w:ilvl w:val="1"/>
+          <w:numId w:val="4"/>
+        </w:numPr>
+        <w:spacing w:line="240" w:lineRule="auto"/>
+        <w:rPr>
+          <w:lang w:val="en-US"/>
+        </w:rPr>
+      </w:pPr>
+      <w:r>
+        <w:rPr>
+          <w:lang w:val="en-US"/>
+        </w:rPr>
+        <w:t xml:space="preserve">Press </w:t>
+      </w:r>
+      <w:r>
+        <w:rPr>
+          <w:lang w:val="en-US"/>
+        </w:rPr>
+        <w:t>Disa</w:t>
+      </w:r>
+      <w:r>
+        <w:rPr>
+          <w:lang w:val="en-US"/>
+        </w:rPr>
+        <w:t xml:space="preserve">ble </w:t>
+      </w:r>
+      <w:r>
+        <w:rPr>
+          <w:lang w:val="en-US"/>
+        </w:rPr>
+        <w:t>S</w:t>
+      </w:r>
+      <w:r>
+        <w:rPr>
+          <w:lang w:val="en-US"/>
+        </w:rPr>
+        <w:t>tepper button OR Safety Disengage</w:t>
+      </w:r>
+      <w:r>
+        <w:rPr>
+          <w:lang w:val="en-US"/>
+        </w:rPr>
+        <w:t xml:space="preserve"> (to </w:t>
+      </w:r>
+      <w:r>
+        <w:rPr>
+          <w:lang w:val="en-US"/>
+        </w:rPr>
+        <w:t xml:space="preserve">soft stop without </w:t>
+      </w:r>
+      <w:r>
+        <w:rPr>
+          <w:lang w:val="en-US"/>
+        </w:rPr>
+        <w:t>having to re-zero)</w:t>
+      </w:r>
+    </w:p>
+    <w:p>
+      <w:pPr>
+        <w:spacing w:line="240" w:lineRule="auto"/>
+        <w:rPr>
+          <w:lang w:val="en-US"/>
+        </w:rPr>
+      </w:pPr>
+    </w:p>
+    <w:p>
+      <w:pPr>
+        <w:spacing w:line="240" w:lineRule="auto"/>
+        <w:ind w:firstLine="720"/>
+        <w:rPr>
+          <w:lang w:val="en-US"/>
+        </w:rPr>
+      </w:pPr>
+      <w:proofErr w:type="spellStart"/>
+      <w:r>
+        <w:rPr>
+          <w:lang w:val="en-US"/>
+        </w:rPr>
+        <w:t>StereoPylot</w:t>
+      </w:r>
+      <w:proofErr w:type="spellEnd"/>
+    </w:p>
+    <w:p>
+      <w:pPr>
+        <w:spacing w:line="240" w:lineRule="auto"/>
+        <w:rPr>
+          <w:lang w:val="en-US"/>
+        </w:rPr>
+      </w:pPr>
+      <w:r>
+        <w:rPr>
+          <w:lang w:val="en-US"/>
+        </w:rPr>
+        <w:tab/>
+      </w:r>
+      <w:r>
+        <w:rPr>
+          <w:lang w:val="en-US"/>
+        </w:rPr>
+        <w:tab/>
+        <w:t xml:space="preserve">1 </w:t>
+      </w:r>
+      <w:proofErr w:type="gramStart"/>
+      <w:r>
+        <w:rPr>
+          <w:lang w:val="en-US"/>
+        </w:rPr>
+        <w:t>methods</w:t>
+      </w:r>
+      <w:proofErr w:type="gramEnd"/>
+      <w:r>
+        <w:rPr>
+          <w:lang w:val="en-US"/>
+        </w:rPr>
+        <w:t xml:space="preserve"> of automated movement </w:t>
+      </w:r>
+    </w:p>
+    <w:p>
+      <w:pPr>
+        <w:pStyle w:val="ListParagraph"/>
+        <w:numPr>
+          <w:ilvl w:val="0"/>
+          <w:numId w:val="6"/>
+        </w:numPr>
+        <w:spacing w:line="240" w:lineRule="auto"/>
+        <w:rPr>
+          <w:lang w:val="en-US"/>
+        </w:rPr>
+      </w:pPr>
+      <w:proofErr w:type="spellStart"/>
+      <w:r>
+        <w:rPr>
+          <w:lang w:val="en-US"/>
+        </w:rPr>
+        <w:t>MakeIsSo</w:t>
+      </w:r>
+      <w:proofErr w:type="spellEnd"/>
+      <w:r>
+        <w:rPr>
+          <w:lang w:val="en-US"/>
+        </w:rPr>
+        <w:t xml:space="preserve"> - Move to </w:t>
+      </w:r>
+      <w:proofErr w:type="gramStart"/>
+      <w:r>
+        <w:rPr>
+          <w:lang w:val="en-US"/>
+        </w:rPr>
+        <w:t>X,Y</w:t>
+      </w:r>
+      <w:proofErr w:type="gramEnd"/>
+      <w:r>
+        <w:rPr>
+          <w:lang w:val="en-US"/>
+        </w:rPr>
+        <w:t>, and Z via manual entry or from list.</w:t>
+      </w:r>
+    </w:p>
+    <w:p>
+      <w:pPr>
+        <w:pStyle w:val="ListParagraph"/>
+        <w:spacing w:line="240" w:lineRule="auto"/>
+        <w:ind w:left="2160"/>
+        <w:rPr>
+          <w:lang w:val="en-US"/>
+        </w:rPr>
+      </w:pPr>
+    </w:p>
+    <w:p>
+      <w:pPr>
+        <w:pStyle w:val="ListParagraph"/>
+        <w:numPr>
+          <w:ilvl w:val="0"/>
+          <w:numId w:val="4"/>
+        </w:numPr>
+        <w:spacing w:line="240" w:lineRule="auto"/>
+        <w:rPr>
+          <w:lang w:val="en-US"/>
+        </w:rPr>
+      </w:pPr>
+      <w:r>
+        <w:rPr>
+          <w:lang w:val="en-US"/>
+        </w:rPr>
+        <w:t>Using the keypad</w:t>
+      </w:r>
+    </w:p>
+    <w:p>
+      <w:pPr>
+        <w:pStyle w:val="ListParagraph"/>
+        <w:numPr>
+          <w:ilvl w:val="0"/>
+          <w:numId w:val="4"/>
+        </w:numPr>
+        <w:spacing w:line="240" w:lineRule="auto"/>
+        <w:rPr>
+          <w:lang w:val="en-US"/>
+        </w:rPr>
+      </w:pPr>
+      <w:r>
+        <w:rPr>
+          <w:lang w:val="en-US"/>
+        </w:rPr>
+        <w:t>Select (or enter) the desired coordinates</w:t>
+      </w:r>
+    </w:p>
+    <w:p>
+      <w:pPr>
+        <w:pStyle w:val="ListParagraph"/>
+        <w:numPr>
+          <w:ilvl w:val="0"/>
+          <w:numId w:val="4"/>
+        </w:numPr>
+        <w:spacing w:line="240" w:lineRule="auto"/>
+        <w:rPr>
+          <w:lang w:val="en-US"/>
+        </w:rPr>
+      </w:pPr>
+      <w:r>
+        <w:rPr>
+          <w:lang w:val="en-US"/>
+        </w:rPr>
+        <w:t>check Make It So checkbox</w:t>
+      </w:r>
+    </w:p>
+    <w:p>
+      <w:pPr>
+        <w:pStyle w:val="ListParagraph"/>
+        <w:numPr>
+          <w:ilvl w:val="0"/>
+          <w:numId w:val="4"/>
+        </w:numPr>
+        <w:spacing w:line="240" w:lineRule="auto"/>
+        <w:rPr>
+          <w:lang w:val="en-US"/>
+        </w:rPr>
+      </w:pPr>
+      <w:r>
+        <w:rPr>
+          <w:lang w:val="en-US"/>
+        </w:rPr>
+        <w:t>press Engage button</w:t>
+      </w:r>
+    </w:p>
+    <w:p>
+      <w:pPr>
+        <w:spacing w:line="240" w:lineRule="auto"/>
+        <w:rPr>
+          <w:lang w:val="en-US"/>
+        </w:rPr>
+      </w:pPr>
+    </w:p>
+    <w:p>
+      <w:pPr>
+        <w:spacing w:line="240" w:lineRule="auto"/>
+        <w:ind w:left="720"/>
+        <w:rPr>
+          <w:lang w:val="en-US"/>
+        </w:rPr>
+      </w:pPr>
     </w:p>
     <w:sectPr>
       <w:pgSz w:w="12240" w:h="15840"/>
@@ -1170,6 +1679,118 @@
     </w:lvl>
   </w:abstractNum>
   <w:abstractNum w:abstractNumId="2" w15:restartNumberingAfterBreak="0">
+    <w:nsid w:val="283A678C"/>
+    <w:multiLevelType w:val="hybridMultilevel"/>
+    <w:tmpl w:val="0F0C7ECC"/>
+    <w:lvl w:ilvl="0" w:tplc="52B8C94C">
+      <w:numFmt w:val="bullet"/>
+      <w:lvlText w:val="-"/>
+      <w:lvlJc w:val="left"/>
+      <w:pPr>
+        <w:ind w:left="1440" w:hanging="360"/>
+      </w:pPr>
+      <w:rPr>
+        <w:rFonts w:ascii="Aptos" w:eastAsiaTheme="minorHAnsi" w:hAnsi="Aptos" w:cstheme="minorBidi" w:hint="default"/>
+      </w:rPr>
+    </w:lvl>
+    <w:lvl w:ilvl="1" w:tplc="10090003" w:tentative="1">
+      <w:start w:val="1"/>
+      <w:numFmt w:val="bullet"/>
+      <w:lvlText w:val="o"/>
+      <w:lvlJc w:val="left"/>
+      <w:pPr>
+        <w:ind w:left="2160" w:hanging="360"/>
+      </w:pPr>
+      <w:rPr>
+        <w:rFonts w:ascii="Courier New" w:hAnsi="Courier New" w:cs="Courier New" w:hint="default"/>
+      </w:rPr>
+    </w:lvl>
+    <w:lvl w:ilvl="2" w:tplc="10090005" w:tentative="1">
+      <w:start w:val="1"/>
+      <w:numFmt w:val="bullet"/>
+      <w:lvlText w:val=""/>
+      <w:lvlJc w:val="left"/>
+      <w:pPr>
+        <w:ind w:left="2880" w:hanging="360"/>
+      </w:pPr>
+      <w:rPr>
+        <w:rFonts w:ascii="Wingdings" w:hAnsi="Wingdings" w:hint="default"/>
+      </w:rPr>
+    </w:lvl>
+    <w:lvl w:ilvl="3" w:tplc="10090001" w:tentative="1">
+      <w:start w:val="1"/>
+      <w:numFmt w:val="bullet"/>
+      <w:lvlText w:val=""/>
+      <w:lvlJc w:val="left"/>
+      <w:pPr>
+        <w:ind w:left="3600" w:hanging="360"/>
+      </w:pPr>
+      <w:rPr>
+        <w:rFonts w:ascii="Symbol" w:hAnsi="Symbol" w:hint="default"/>
+      </w:rPr>
+    </w:lvl>
+    <w:lvl w:ilvl="4" w:tplc="10090003" w:tentative="1">
+      <w:start w:val="1"/>
+      <w:numFmt w:val="bullet"/>
+      <w:lvlText w:val="o"/>
+      <w:lvlJc w:val="left"/>
+      <w:pPr>
+        <w:ind w:left="4320" w:hanging="360"/>
+      </w:pPr>
+      <w:rPr>
+        <w:rFonts w:ascii="Courier New" w:hAnsi="Courier New" w:cs="Courier New" w:hint="default"/>
+      </w:rPr>
+    </w:lvl>
+    <w:lvl w:ilvl="5" w:tplc="10090005" w:tentative="1">
+      <w:start w:val="1"/>
+      <w:numFmt w:val="bullet"/>
+      <w:lvlText w:val=""/>
+      <w:lvlJc w:val="left"/>
+      <w:pPr>
+        <w:ind w:left="5040" w:hanging="360"/>
+      </w:pPr>
+      <w:rPr>
+        <w:rFonts w:ascii="Wingdings" w:hAnsi="Wingdings" w:hint="default"/>
+      </w:rPr>
+    </w:lvl>
+    <w:lvl w:ilvl="6" w:tplc="10090001" w:tentative="1">
+      <w:start w:val="1"/>
+      <w:numFmt w:val="bullet"/>
+      <w:lvlText w:val=""/>
+      <w:lvlJc w:val="left"/>
+      <w:pPr>
+        <w:ind w:left="5760" w:hanging="360"/>
+      </w:pPr>
+      <w:rPr>
+        <w:rFonts w:ascii="Symbol" w:hAnsi="Symbol" w:hint="default"/>
+      </w:rPr>
+    </w:lvl>
+    <w:lvl w:ilvl="7" w:tplc="10090003" w:tentative="1">
+      <w:start w:val="1"/>
+      <w:numFmt w:val="bullet"/>
+      <w:lvlText w:val="o"/>
+      <w:lvlJc w:val="left"/>
+      <w:pPr>
+        <w:ind w:left="6480" w:hanging="360"/>
+      </w:pPr>
+      <w:rPr>
+        <w:rFonts w:ascii="Courier New" w:hAnsi="Courier New" w:cs="Courier New" w:hint="default"/>
+      </w:rPr>
+    </w:lvl>
+    <w:lvl w:ilvl="8" w:tplc="10090005" w:tentative="1">
+      <w:start w:val="1"/>
+      <w:numFmt w:val="bullet"/>
+      <w:lvlText w:val=""/>
+      <w:lvlJc w:val="left"/>
+      <w:pPr>
+        <w:ind w:left="7200" w:hanging="360"/>
+      </w:pPr>
+      <w:rPr>
+        <w:rFonts w:ascii="Wingdings" w:hAnsi="Wingdings" w:hint="default"/>
+      </w:rPr>
+    </w:lvl>
+  </w:abstractNum>
+  <w:abstractNum w:abstractNumId="3" w15:restartNumberingAfterBreak="0">
     <w:nsid w:val="2BDB2443"/>
     <w:multiLevelType w:val="hybridMultilevel"/>
     <w:tmpl w:val="AB962256"/>
@@ -1282,7 +1903,120 @@
       </w:rPr>
     </w:lvl>
   </w:abstractNum>
-  <w:abstractNum w:abstractNumId="3" w15:restartNumberingAfterBreak="0">
+  <w:abstractNum w:abstractNumId="4" w15:restartNumberingAfterBreak="0">
+    <w:nsid w:val="3DCB6445"/>
+    <w:multiLevelType w:val="hybridMultilevel"/>
+    <w:tmpl w:val="4E1E6278"/>
+    <w:lvl w:ilvl="0" w:tplc="10090001">
+      <w:start w:val="1"/>
+      <w:numFmt w:val="bullet"/>
+      <w:lvlText w:val=""/>
+      <w:lvlJc w:val="left"/>
+      <w:pPr>
+        <w:ind w:left="2160" w:hanging="360"/>
+      </w:pPr>
+      <w:rPr>
+        <w:rFonts w:ascii="Symbol" w:hAnsi="Symbol" w:hint="default"/>
+      </w:rPr>
+    </w:lvl>
+    <w:lvl w:ilvl="1" w:tplc="10090003" w:tentative="1">
+      <w:start w:val="1"/>
+      <w:numFmt w:val="bullet"/>
+      <w:lvlText w:val="o"/>
+      <w:lvlJc w:val="left"/>
+      <w:pPr>
+        <w:ind w:left="2880" w:hanging="360"/>
+      </w:pPr>
+      <w:rPr>
+        <w:rFonts w:ascii="Courier New" w:hAnsi="Courier New" w:cs="Courier New" w:hint="default"/>
+      </w:rPr>
+    </w:lvl>
+    <w:lvl w:ilvl="2" w:tplc="10090005" w:tentative="1">
+      <w:start w:val="1"/>
+      <w:numFmt w:val="bullet"/>
+      <w:lvlText w:val=""/>
+      <w:lvlJc w:val="left"/>
+      <w:pPr>
+        <w:ind w:left="3600" w:hanging="360"/>
+      </w:pPr>
+      <w:rPr>
+        <w:rFonts w:ascii="Wingdings" w:hAnsi="Wingdings" w:hint="default"/>
+      </w:rPr>
+    </w:lvl>
+    <w:lvl w:ilvl="3" w:tplc="10090001" w:tentative="1">
+      <w:start w:val="1"/>
+      <w:numFmt w:val="bullet"/>
+      <w:lvlText w:val=""/>
+      <w:lvlJc w:val="left"/>
+      <w:pPr>
+        <w:ind w:left="4320" w:hanging="360"/>
+      </w:pPr>
+      <w:rPr>
+        <w:rFonts w:ascii="Symbol" w:hAnsi="Symbol" w:hint="default"/>
+      </w:rPr>
+    </w:lvl>
+    <w:lvl w:ilvl="4" w:tplc="10090003" w:tentative="1">
+      <w:start w:val="1"/>
+      <w:numFmt w:val="bullet"/>
+      <w:lvlText w:val="o"/>
+      <w:lvlJc w:val="left"/>
+      <w:pPr>
+        <w:ind w:left="5040" w:hanging="360"/>
+      </w:pPr>
+      <w:rPr>
+        <w:rFonts w:ascii="Courier New" w:hAnsi="Courier New" w:cs="Courier New" w:hint="default"/>
+      </w:rPr>
+    </w:lvl>
+    <w:lvl w:ilvl="5" w:tplc="10090005" w:tentative="1">
+      <w:start w:val="1"/>
+      <w:numFmt w:val="bullet"/>
+      <w:lvlText w:val=""/>
+      <w:lvlJc w:val="left"/>
+      <w:pPr>
+        <w:ind w:left="5760" w:hanging="360"/>
+      </w:pPr>
+      <w:rPr>
+        <w:rFonts w:ascii="Wingdings" w:hAnsi="Wingdings" w:hint="default"/>
+      </w:rPr>
+    </w:lvl>
+    <w:lvl w:ilvl="6" w:tplc="10090001" w:tentative="1">
+      <w:start w:val="1"/>
+      <w:numFmt w:val="bullet"/>
+      <w:lvlText w:val=""/>
+      <w:lvlJc w:val="left"/>
+      <w:pPr>
+        <w:ind w:left="6480" w:hanging="360"/>
+      </w:pPr>
+      <w:rPr>
+        <w:rFonts w:ascii="Symbol" w:hAnsi="Symbol" w:hint="default"/>
+      </w:rPr>
+    </w:lvl>
+    <w:lvl w:ilvl="7" w:tplc="10090003" w:tentative="1">
+      <w:start w:val="1"/>
+      <w:numFmt w:val="bullet"/>
+      <w:lvlText w:val="o"/>
+      <w:lvlJc w:val="left"/>
+      <w:pPr>
+        <w:ind w:left="7200" w:hanging="360"/>
+      </w:pPr>
+      <w:rPr>
+        <w:rFonts w:ascii="Courier New" w:hAnsi="Courier New" w:cs="Courier New" w:hint="default"/>
+      </w:rPr>
+    </w:lvl>
+    <w:lvl w:ilvl="8" w:tplc="10090005" w:tentative="1">
+      <w:start w:val="1"/>
+      <w:numFmt w:val="bullet"/>
+      <w:lvlText w:val=""/>
+      <w:lvlJc w:val="left"/>
+      <w:pPr>
+        <w:ind w:left="7920" w:hanging="360"/>
+      </w:pPr>
+      <w:rPr>
+        <w:rFonts w:ascii="Wingdings" w:hAnsi="Wingdings" w:hint="default"/>
+      </w:rPr>
+    </w:lvl>
+  </w:abstractNum>
+  <w:abstractNum w:abstractNumId="5" w15:restartNumberingAfterBreak="0">
     <w:nsid w:val="43D46DDE"/>
     <w:multiLevelType w:val="hybridMultilevel"/>
     <w:tmpl w:val="3AEC037A"/>
@@ -1394,7 +2128,7 @@
       </w:rPr>
     </w:lvl>
   </w:abstractNum>
-  <w:abstractNum w:abstractNumId="4" w15:restartNumberingAfterBreak="0">
+  <w:abstractNum w:abstractNumId="6" w15:restartNumberingAfterBreak="0">
     <w:nsid w:val="759B0D3D"/>
     <w:multiLevelType w:val="hybridMultilevel"/>
     <w:tmpl w:val="DCC04EDC"/>
@@ -1507,19 +2241,25 @@
     </w:lvl>
   </w:abstractNum>
   <w:num w:numId="1" w16cid:durableId="1240558416">
-    <w:abstractNumId w:val="2"/>
+    <w:abstractNumId w:val="3"/>
   </w:num>
   <w:num w:numId="2" w16cid:durableId="129132324">
-    <w:abstractNumId w:val="4"/>
+    <w:abstractNumId w:val="6"/>
   </w:num>
   <w:num w:numId="3" w16cid:durableId="186720899">
-    <w:abstractNumId w:val="3"/>
+    <w:abstractNumId w:val="5"/>
   </w:num>
   <w:num w:numId="4" w16cid:durableId="430710235">
     <w:abstractNumId w:val="0"/>
   </w:num>
   <w:num w:numId="5" w16cid:durableId="1909416290">
     <w:abstractNumId w:val="1"/>
+  </w:num>
+  <w:num w:numId="6" w16cid:durableId="930045525">
+    <w:abstractNumId w:val="4"/>
+  </w:num>
+  <w:num w:numId="7" w16cid:durableId="1969819095">
+    <w:abstractNumId w:val="2"/>
   </w:num>
 </w:numbering>
 </file>
@@ -1924,7 +2664,7 @@
   <w:style w:type="paragraph" w:default="1" w:styleId="Normal">
     <w:name w:val="Normal"/>
     <w:qFormat/>
-    <w:rsid w:val="00D3067B"/>
+    <w:rsid w:val="009A6CF3"/>
   </w:style>
   <w:style w:type="paragraph" w:styleId="Heading1">
     <w:name w:val="heading 1"/>

</xml_diff>

<commit_message>
relative zeros ok, speed ok, encoder change
</commit_message>
<xml_diff>
--- a/Instructions.docx
+++ b/Instructions.docx
@@ -653,33 +653,218 @@
           <w:lang w:val="en-US"/>
         </w:rPr>
       </w:pPr>
+      <w:r>
+        <w:rPr>
+          <w:lang w:val="en-US"/>
+        </w:rPr>
+        <w:t>Disen</w:t>
+      </w:r>
+      <w:r>
+        <w:rPr>
+          <w:lang w:val="en-US"/>
+        </w:rPr>
+        <w:t>gage</w:t>
+      </w:r>
+      <w:r>
+        <w:rPr>
+          <w:lang w:val="en-US"/>
+        </w:rPr>
+        <w:t xml:space="preserve"> safe</w:t>
+      </w:r>
+      <w:r>
+        <w:rPr>
+          <w:lang w:val="en-US"/>
+        </w:rPr>
+        <w:t>ty and press Species Select to switch between Mouse and Rat</w:t>
+      </w:r>
+    </w:p>
+    <w:p>
+      <w:pPr>
+        <w:spacing w:line="240" w:lineRule="auto"/>
+        <w:rPr>
+          <w:lang w:val="en-US"/>
+        </w:rPr>
+      </w:pPr>
+      <w:r>
+        <w:rPr>
+          <w:lang w:val="en-US"/>
+        </w:rPr>
+        <w:t>Switching Offsets</w:t>
+      </w:r>
+    </w:p>
+    <w:p>
+      <w:pPr>
+        <w:spacing w:line="240" w:lineRule="auto"/>
+        <w:rPr>
+          <w:lang w:val="en-US"/>
+        </w:rPr>
+      </w:pPr>
+      <w:r>
+        <w:rPr>
+          <w:lang w:val="en-US"/>
+        </w:rPr>
+        <w:tab/>
+      </w:r>
+      <w:r>
+        <w:rPr>
+          <w:lang w:val="en-US"/>
+        </w:rPr>
+        <w:t xml:space="preserve">For best results </w:t>
+      </w:r>
+      <w:r>
+        <w:rPr>
+          <w:lang w:val="en-US"/>
+        </w:rPr>
+        <w:t>move back to relative zero (Bregma) before changing</w:t>
+      </w:r>
+    </w:p>
+    <w:p>
+      <w:pPr>
+        <w:spacing w:line="240" w:lineRule="auto"/>
+        <w:ind w:left="720"/>
+        <w:rPr>
+          <w:lang w:val="en-US"/>
+        </w:rPr>
+      </w:pPr>
       <w:proofErr w:type="spellStart"/>
       <w:r>
         <w:rPr>
           <w:lang w:val="en-US"/>
         </w:rPr>
-        <w:t>Disenage</w:t>
+        <w:t>StereoPylot</w:t>
       </w:r>
       <w:proofErr w:type="spellEnd"/>
       <w:r>
         <w:rPr>
           <w:lang w:val="en-US"/>
         </w:rPr>
-        <w:t xml:space="preserve"> safety and press Species Select to switch between Mouse and Rat</w:t>
-      </w:r>
-    </w:p>
-    <w:p>
-      <w:pPr>
-        <w:spacing w:line="240" w:lineRule="auto"/>
-        <w:rPr>
-          <w:lang w:val="en-US"/>
-        </w:rPr>
-      </w:pPr>
-      <w:r>
-        <w:rPr>
-          <w:lang w:val="en-US"/>
-        </w:rPr>
-        <w:t>Switching Offsets</w:t>
+        <w:t xml:space="preserve"> SR</w:t>
+      </w:r>
+    </w:p>
+    <w:p>
+      <w:pPr>
+        <w:pStyle w:val="ListParagraph"/>
+        <w:numPr>
+          <w:ilvl w:val="0"/>
+          <w:numId w:val="5"/>
+        </w:numPr>
+        <w:spacing w:line="240" w:lineRule="auto"/>
+        <w:rPr>
+          <w:lang w:val="en-US"/>
+        </w:rPr>
+      </w:pPr>
+      <w:r>
+        <w:rPr>
+          <w:lang w:val="en-US"/>
+        </w:rPr>
+        <w:t>Move the toggle switch to the desired offset</w:t>
+      </w:r>
+    </w:p>
+    <w:p>
+      <w:pPr>
+        <w:pStyle w:val="ListParagraph"/>
+        <w:numPr>
+          <w:ilvl w:val="0"/>
+          <w:numId w:val="5"/>
+        </w:numPr>
+        <w:spacing w:line="240" w:lineRule="auto"/>
+        <w:rPr>
+          <w:lang w:val="en-US"/>
+        </w:rPr>
+      </w:pPr>
+      <w:r>
+        <w:rPr>
+          <w:lang w:val="en-US"/>
+        </w:rPr>
+        <w:t>Disengage safety</w:t>
+      </w:r>
+    </w:p>
+    <w:p>
+      <w:pPr>
+        <w:pStyle w:val="ListParagraph"/>
+        <w:numPr>
+          <w:ilvl w:val="0"/>
+          <w:numId w:val="5"/>
+        </w:numPr>
+        <w:spacing w:line="240" w:lineRule="auto"/>
+        <w:rPr>
+          <w:lang w:val="en-US"/>
+        </w:rPr>
+      </w:pPr>
+      <w:r>
+        <w:rPr>
+          <w:lang w:val="en-US"/>
+        </w:rPr>
+        <w:t>Press Pre-set position button</w:t>
+      </w:r>
+    </w:p>
+    <w:p>
+      <w:pPr>
+        <w:spacing w:line="240" w:lineRule="auto"/>
+        <w:ind w:firstLine="720"/>
+        <w:rPr>
+          <w:lang w:val="en-US"/>
+        </w:rPr>
+      </w:pPr>
+      <w:proofErr w:type="spellStart"/>
+      <w:r>
+        <w:rPr>
+          <w:lang w:val="en-US"/>
+        </w:rPr>
+        <w:t>StereoPylot</w:t>
+      </w:r>
+      <w:proofErr w:type="spellEnd"/>
+    </w:p>
+    <w:p>
+      <w:pPr>
+        <w:pStyle w:val="ListParagraph"/>
+        <w:numPr>
+          <w:ilvl w:val="0"/>
+          <w:numId w:val="4"/>
+        </w:numPr>
+        <w:spacing w:line="240" w:lineRule="auto"/>
+        <w:rPr>
+          <w:lang w:val="en-US"/>
+        </w:rPr>
+      </w:pPr>
+      <w:r>
+        <w:rPr>
+          <w:lang w:val="en-US"/>
+        </w:rPr>
+        <w:t>Disengage safety</w:t>
+      </w:r>
+    </w:p>
+    <w:p>
+      <w:pPr>
+        <w:pStyle w:val="ListParagraph"/>
+        <w:numPr>
+          <w:ilvl w:val="0"/>
+          <w:numId w:val="4"/>
+        </w:numPr>
+        <w:spacing w:line="240" w:lineRule="auto"/>
+        <w:rPr>
+          <w:lang w:val="en-US"/>
+        </w:rPr>
+      </w:pPr>
+      <w:r>
+        <w:rPr>
+          <w:lang w:val="en-US"/>
+        </w:rPr>
+        <w:t>Select the offset</w:t>
+      </w:r>
+    </w:p>
+    <w:p>
+      <w:pPr>
+        <w:spacing w:line="240" w:lineRule="auto"/>
+        <w:rPr>
+          <w:lang w:val="en-US"/>
+        </w:rPr>
+      </w:pPr>
+      <w:r>
+        <w:rPr>
+          <w:lang w:val="en-US"/>
+        </w:rPr>
+        <w:t>Speed</w:t>
       </w:r>
     </w:p>
     <w:p>
@@ -699,23 +884,58 @@
         <w:rPr>
           <w:lang w:val="en-US"/>
         </w:rPr>
-        <w:t xml:space="preserve">For best results </w:t>
-      </w:r>
-      <w:r>
-        <w:rPr>
-          <w:lang w:val="en-US"/>
-        </w:rPr>
-        <w:t>move back to relative zero (Bregma) before changing</w:t>
-      </w:r>
-    </w:p>
-    <w:p>
-      <w:pPr>
-        <w:spacing w:line="240" w:lineRule="auto"/>
-        <w:ind w:left="720"/>
-        <w:rPr>
-          <w:lang w:val="en-US"/>
-        </w:rPr>
-      </w:pPr>
+        <w:t xml:space="preserve">Use the toggle to select the speed, no other buttons </w:t>
+      </w:r>
+      <w:proofErr w:type="gramStart"/>
+      <w:r>
+        <w:rPr>
+          <w:lang w:val="en-US"/>
+        </w:rPr>
+        <w:t>required</w:t>
+      </w:r>
+      <w:proofErr w:type="gramEnd"/>
+      <w:r>
+        <w:rPr>
+          <w:lang w:val="en-US"/>
+        </w:rPr>
+        <w:t>.</w:t>
+      </w:r>
+    </w:p>
+    <w:p>
+      <w:pPr>
+        <w:spacing w:line="240" w:lineRule="auto"/>
+        <w:rPr>
+          <w:lang w:val="en-US"/>
+        </w:rPr>
+      </w:pPr>
+    </w:p>
+    <w:p>
+      <w:pPr>
+        <w:spacing w:line="240" w:lineRule="auto"/>
+        <w:rPr>
+          <w:lang w:val="en-US"/>
+        </w:rPr>
+      </w:pPr>
+      <w:r>
+        <w:rPr>
+          <w:lang w:val="en-US"/>
+        </w:rPr>
+        <w:t>Automated Movements:</w:t>
+      </w:r>
+    </w:p>
+    <w:p>
+      <w:pPr>
+        <w:spacing w:line="240" w:lineRule="auto"/>
+        <w:rPr>
+          <w:lang w:val="en-US"/>
+        </w:rPr>
+      </w:pPr>
+      <w:r>
+        <w:rPr>
+          <w:lang w:val="en-US"/>
+        </w:rPr>
+        <w:tab/>
+      </w:r>
       <w:proofErr w:type="spellStart"/>
       <w:r>
         <w:rPr>
@@ -733,133 +953,6 @@
     </w:p>
     <w:p>
       <w:pPr>
-        <w:pStyle w:val="ListParagraph"/>
-        <w:numPr>
-          <w:ilvl w:val="0"/>
-          <w:numId w:val="5"/>
-        </w:numPr>
-        <w:spacing w:line="240" w:lineRule="auto"/>
-        <w:rPr>
-          <w:lang w:val="en-US"/>
-        </w:rPr>
-      </w:pPr>
-      <w:r>
-        <w:rPr>
-          <w:lang w:val="en-US"/>
-        </w:rPr>
-        <w:lastRenderedPageBreak/>
-        <w:t>Move the toggle switch to the desired offset</w:t>
-      </w:r>
-    </w:p>
-    <w:p>
-      <w:pPr>
-        <w:pStyle w:val="ListParagraph"/>
-        <w:numPr>
-          <w:ilvl w:val="0"/>
-          <w:numId w:val="5"/>
-        </w:numPr>
-        <w:spacing w:line="240" w:lineRule="auto"/>
-        <w:rPr>
-          <w:lang w:val="en-US"/>
-        </w:rPr>
-      </w:pPr>
-      <w:r>
-        <w:rPr>
-          <w:lang w:val="en-US"/>
-        </w:rPr>
-        <w:t>Disengage safety</w:t>
-      </w:r>
-    </w:p>
-    <w:p>
-      <w:pPr>
-        <w:pStyle w:val="ListParagraph"/>
-        <w:numPr>
-          <w:ilvl w:val="0"/>
-          <w:numId w:val="5"/>
-        </w:numPr>
-        <w:spacing w:line="240" w:lineRule="auto"/>
-        <w:rPr>
-          <w:lang w:val="en-US"/>
-        </w:rPr>
-      </w:pPr>
-      <w:r>
-        <w:rPr>
-          <w:lang w:val="en-US"/>
-        </w:rPr>
-        <w:t>Press Pre-set position button</w:t>
-      </w:r>
-    </w:p>
-    <w:p>
-      <w:pPr>
-        <w:spacing w:line="240" w:lineRule="auto"/>
-        <w:ind w:firstLine="720"/>
-        <w:rPr>
-          <w:lang w:val="en-US"/>
-        </w:rPr>
-      </w:pPr>
-      <w:proofErr w:type="spellStart"/>
-      <w:r>
-        <w:rPr>
-          <w:lang w:val="en-US"/>
-        </w:rPr>
-        <w:t>StereoPylot</w:t>
-      </w:r>
-      <w:proofErr w:type="spellEnd"/>
-    </w:p>
-    <w:p>
-      <w:pPr>
-        <w:pStyle w:val="ListParagraph"/>
-        <w:numPr>
-          <w:ilvl w:val="0"/>
-          <w:numId w:val="4"/>
-        </w:numPr>
-        <w:spacing w:line="240" w:lineRule="auto"/>
-        <w:rPr>
-          <w:lang w:val="en-US"/>
-        </w:rPr>
-      </w:pPr>
-      <w:r>
-        <w:rPr>
-          <w:lang w:val="en-US"/>
-        </w:rPr>
-        <w:t>Disengage safety</w:t>
-      </w:r>
-    </w:p>
-    <w:p>
-      <w:pPr>
-        <w:pStyle w:val="ListParagraph"/>
-        <w:numPr>
-          <w:ilvl w:val="0"/>
-          <w:numId w:val="4"/>
-        </w:numPr>
-        <w:spacing w:line="240" w:lineRule="auto"/>
-        <w:rPr>
-          <w:lang w:val="en-US"/>
-        </w:rPr>
-      </w:pPr>
-      <w:r>
-        <w:rPr>
-          <w:lang w:val="en-US"/>
-        </w:rPr>
-        <w:t>Select the offset</w:t>
-      </w:r>
-    </w:p>
-    <w:p>
-      <w:pPr>
-        <w:spacing w:line="240" w:lineRule="auto"/>
-        <w:rPr>
-          <w:lang w:val="en-US"/>
-        </w:rPr>
-      </w:pPr>
-      <w:r>
-        <w:rPr>
-          <w:lang w:val="en-US"/>
-        </w:rPr>
-        <w:t>Speed</w:t>
-      </w:r>
-    </w:p>
-    <w:p>
-      <w:pPr>
         <w:spacing w:line="240" w:lineRule="auto"/>
         <w:rPr>
           <w:lang w:val="en-US"/>
@@ -870,91 +963,17 @@
           <w:lang w:val="en-US"/>
         </w:rPr>
         <w:tab/>
-        <w:t xml:space="preserve">Use the toggle to select the speed, no other buttons </w:t>
-      </w:r>
-      <w:proofErr w:type="gramStart"/>
-      <w:r>
-        <w:rPr>
-          <w:lang w:val="en-US"/>
-        </w:rPr>
-        <w:t>required</w:t>
-      </w:r>
-      <w:proofErr w:type="gramEnd"/>
-      <w:r>
-        <w:rPr>
-          <w:lang w:val="en-US"/>
-        </w:rPr>
-        <w:t>.</w:t>
-      </w:r>
-    </w:p>
-    <w:p>
-      <w:pPr>
-        <w:spacing w:line="240" w:lineRule="auto"/>
-        <w:rPr>
-          <w:lang w:val="en-US"/>
-        </w:rPr>
-      </w:pPr>
-    </w:p>
-    <w:p>
-      <w:pPr>
-        <w:spacing w:line="240" w:lineRule="auto"/>
-        <w:rPr>
-          <w:lang w:val="en-US"/>
-        </w:rPr>
-      </w:pPr>
-      <w:r>
-        <w:rPr>
-          <w:lang w:val="en-US"/>
-        </w:rPr>
-        <w:t>Automated Movements:</w:t>
-      </w:r>
-    </w:p>
-    <w:p>
-      <w:pPr>
-        <w:spacing w:line="240" w:lineRule="auto"/>
-        <w:rPr>
-          <w:lang w:val="en-US"/>
-        </w:rPr>
-      </w:pPr>
+      </w:r>
       <w:r>
         <w:rPr>
           <w:lang w:val="en-US"/>
         </w:rPr>
         <w:tab/>
       </w:r>
-      <w:proofErr w:type="spellStart"/>
-      <w:r>
-        <w:rPr>
-          <w:lang w:val="en-US"/>
-        </w:rPr>
-        <w:t>StereoPylot</w:t>
-      </w:r>
-      <w:proofErr w:type="spellEnd"/>
-      <w:r>
-        <w:rPr>
-          <w:lang w:val="en-US"/>
-        </w:rPr>
-        <w:t xml:space="preserve"> SR</w:t>
-      </w:r>
-    </w:p>
-    <w:p>
-      <w:pPr>
-        <w:spacing w:line="240" w:lineRule="auto"/>
-        <w:rPr>
-          <w:lang w:val="en-US"/>
-        </w:rPr>
-      </w:pPr>
-      <w:r>
-        <w:rPr>
-          <w:lang w:val="en-US"/>
-        </w:rPr>
-        <w:tab/>
-      </w:r>
-      <w:r>
-        <w:rPr>
-          <w:lang w:val="en-US"/>
-        </w:rPr>
-        <w:tab/>
+      <w:r>
+        <w:rPr>
+          <w:lang w:val="en-US"/>
+        </w:rPr>
         <w:t xml:space="preserve">3 methods of automated movement </w:t>
       </w:r>
     </w:p>
@@ -1263,6 +1282,11 @@
           <w:lang w:val="en-US"/>
         </w:rPr>
         <w:tab/>
+      </w:r>
+      <w:r>
+        <w:rPr>
+          <w:lang w:val="en-US"/>
+        </w:rPr>
         <w:t xml:space="preserve">1 </w:t>
       </w:r>
       <w:proofErr w:type="gramStart"/>
@@ -1425,7 +1449,7 @@
       </w:pPr>
     </w:p>
     <w:sectPr>
-      <w:pgSz w:w="12240" w:h="15840"/>
+      <w:pgSz w:w="12240" w:h="15840" w:orient="portrait"/>
       <w:pgMar w:top="1440" w:right="1440" w:bottom="1440" w:left="1440" w:header="708" w:footer="708" w:gutter="0"/>
       <w:cols w:space="708"/>
       <w:docGrid w:linePitch="360"/>
@@ -1448,7 +1472,7 @@
         <w:ind w:left="1080" w:hanging="360"/>
       </w:pPr>
       <w:rPr>
-        <w:rFonts w:ascii="Aptos" w:eastAsiaTheme="minorHAnsi" w:hAnsi="Aptos" w:cstheme="minorBidi" w:hint="default"/>
+        <w:rFonts w:hint="default" w:ascii="Aptos" w:hAnsi="Aptos" w:eastAsiaTheme="minorHAnsi" w:cstheme="minorBidi"/>
       </w:rPr>
     </w:lvl>
     <w:lvl w:ilvl="1" w:tplc="10090003">
@@ -1460,7 +1484,7 @@
         <w:ind w:left="1440" w:hanging="360"/>
       </w:pPr>
       <w:rPr>
-        <w:rFonts w:ascii="Courier New" w:hAnsi="Courier New" w:cs="Courier New" w:hint="default"/>
+        <w:rFonts w:hint="default" w:ascii="Courier New" w:hAnsi="Courier New" w:cs="Courier New"/>
       </w:rPr>
     </w:lvl>
     <w:lvl w:ilvl="2" w:tplc="10090005" w:tentative="1">
@@ -1472,7 +1496,7 @@
         <w:ind w:left="2160" w:hanging="360"/>
       </w:pPr>
       <w:rPr>
-        <w:rFonts w:ascii="Wingdings" w:hAnsi="Wingdings" w:hint="default"/>
+        <w:rFonts w:hint="default" w:ascii="Wingdings" w:hAnsi="Wingdings"/>
       </w:rPr>
     </w:lvl>
     <w:lvl w:ilvl="3" w:tplc="10090001" w:tentative="1">
@@ -1484,7 +1508,7 @@
         <w:ind w:left="2880" w:hanging="360"/>
       </w:pPr>
       <w:rPr>
-        <w:rFonts w:ascii="Symbol" w:hAnsi="Symbol" w:hint="default"/>
+        <w:rFonts w:hint="default" w:ascii="Symbol" w:hAnsi="Symbol"/>
       </w:rPr>
     </w:lvl>
     <w:lvl w:ilvl="4" w:tplc="10090003" w:tentative="1">
@@ -1496,7 +1520,7 @@
         <w:ind w:left="3600" w:hanging="360"/>
       </w:pPr>
       <w:rPr>
-        <w:rFonts w:ascii="Courier New" w:hAnsi="Courier New" w:cs="Courier New" w:hint="default"/>
+        <w:rFonts w:hint="default" w:ascii="Courier New" w:hAnsi="Courier New" w:cs="Courier New"/>
       </w:rPr>
     </w:lvl>
     <w:lvl w:ilvl="5" w:tplc="10090005" w:tentative="1">
@@ -1508,7 +1532,7 @@
         <w:ind w:left="4320" w:hanging="360"/>
       </w:pPr>
       <w:rPr>
-        <w:rFonts w:ascii="Wingdings" w:hAnsi="Wingdings" w:hint="default"/>
+        <w:rFonts w:hint="default" w:ascii="Wingdings" w:hAnsi="Wingdings"/>
       </w:rPr>
     </w:lvl>
     <w:lvl w:ilvl="6" w:tplc="10090001" w:tentative="1">
@@ -1520,7 +1544,7 @@
         <w:ind w:left="5040" w:hanging="360"/>
       </w:pPr>
       <w:rPr>
-        <w:rFonts w:ascii="Symbol" w:hAnsi="Symbol" w:hint="default"/>
+        <w:rFonts w:hint="default" w:ascii="Symbol" w:hAnsi="Symbol"/>
       </w:rPr>
     </w:lvl>
     <w:lvl w:ilvl="7" w:tplc="10090003" w:tentative="1">
@@ -1532,7 +1556,7 @@
         <w:ind w:left="5760" w:hanging="360"/>
       </w:pPr>
       <w:rPr>
-        <w:rFonts w:ascii="Courier New" w:hAnsi="Courier New" w:cs="Courier New" w:hint="default"/>
+        <w:rFonts w:hint="default" w:ascii="Courier New" w:hAnsi="Courier New" w:cs="Courier New"/>
       </w:rPr>
     </w:lvl>
     <w:lvl w:ilvl="8" w:tplc="10090005" w:tentative="1">
@@ -1544,7 +1568,7 @@
         <w:ind w:left="6480" w:hanging="360"/>
       </w:pPr>
       <w:rPr>
-        <w:rFonts w:ascii="Wingdings" w:hAnsi="Wingdings" w:hint="default"/>
+        <w:rFonts w:hint="default" w:ascii="Wingdings" w:hAnsi="Wingdings"/>
       </w:rPr>
     </w:lvl>
   </w:abstractNum>
@@ -1560,7 +1584,7 @@
         <w:ind w:left="1080" w:hanging="360"/>
       </w:pPr>
       <w:rPr>
-        <w:rFonts w:ascii="Aptos" w:eastAsiaTheme="minorHAnsi" w:hAnsi="Aptos" w:cstheme="minorBidi" w:hint="default"/>
+        <w:rFonts w:hint="default" w:ascii="Aptos" w:hAnsi="Aptos" w:eastAsiaTheme="minorHAnsi" w:cstheme="minorBidi"/>
       </w:rPr>
     </w:lvl>
     <w:lvl w:ilvl="1" w:tplc="10090003" w:tentative="1">
@@ -1572,7 +1596,7 @@
         <w:ind w:left="1440" w:hanging="360"/>
       </w:pPr>
       <w:rPr>
-        <w:rFonts w:ascii="Courier New" w:hAnsi="Courier New" w:cs="Courier New" w:hint="default"/>
+        <w:rFonts w:hint="default" w:ascii="Courier New" w:hAnsi="Courier New" w:cs="Courier New"/>
       </w:rPr>
     </w:lvl>
     <w:lvl w:ilvl="2" w:tplc="10090005" w:tentative="1">
@@ -1584,7 +1608,7 @@
         <w:ind w:left="2160" w:hanging="360"/>
       </w:pPr>
       <w:rPr>
-        <w:rFonts w:ascii="Wingdings" w:hAnsi="Wingdings" w:hint="default"/>
+        <w:rFonts w:hint="default" w:ascii="Wingdings" w:hAnsi="Wingdings"/>
       </w:rPr>
     </w:lvl>
     <w:lvl w:ilvl="3" w:tplc="10090001" w:tentative="1">
@@ -1596,7 +1620,7 @@
         <w:ind w:left="2880" w:hanging="360"/>
       </w:pPr>
       <w:rPr>
-        <w:rFonts w:ascii="Symbol" w:hAnsi="Symbol" w:hint="default"/>
+        <w:rFonts w:hint="default" w:ascii="Symbol" w:hAnsi="Symbol"/>
       </w:rPr>
     </w:lvl>
     <w:lvl w:ilvl="4" w:tplc="10090003" w:tentative="1">
@@ -1608,7 +1632,7 @@
         <w:ind w:left="3600" w:hanging="360"/>
       </w:pPr>
       <w:rPr>
-        <w:rFonts w:ascii="Courier New" w:hAnsi="Courier New" w:cs="Courier New" w:hint="default"/>
+        <w:rFonts w:hint="default" w:ascii="Courier New" w:hAnsi="Courier New" w:cs="Courier New"/>
       </w:rPr>
     </w:lvl>
     <w:lvl w:ilvl="5" w:tplc="10090005" w:tentative="1">
@@ -1620,7 +1644,7 @@
         <w:ind w:left="4320" w:hanging="360"/>
       </w:pPr>
       <w:rPr>
-        <w:rFonts w:ascii="Wingdings" w:hAnsi="Wingdings" w:hint="default"/>
+        <w:rFonts w:hint="default" w:ascii="Wingdings" w:hAnsi="Wingdings"/>
       </w:rPr>
     </w:lvl>
     <w:lvl w:ilvl="6" w:tplc="10090001" w:tentative="1">
@@ -1632,7 +1656,7 @@
         <w:ind w:left="5040" w:hanging="360"/>
       </w:pPr>
       <w:rPr>
-        <w:rFonts w:ascii="Symbol" w:hAnsi="Symbol" w:hint="default"/>
+        <w:rFonts w:hint="default" w:ascii="Symbol" w:hAnsi="Symbol"/>
       </w:rPr>
     </w:lvl>
     <w:lvl w:ilvl="7" w:tplc="10090003" w:tentative="1">
@@ -1644,7 +1668,7 @@
         <w:ind w:left="5760" w:hanging="360"/>
       </w:pPr>
       <w:rPr>
-        <w:rFonts w:ascii="Courier New" w:hAnsi="Courier New" w:cs="Courier New" w:hint="default"/>
+        <w:rFonts w:hint="default" w:ascii="Courier New" w:hAnsi="Courier New" w:cs="Courier New"/>
       </w:rPr>
     </w:lvl>
     <w:lvl w:ilvl="8" w:tplc="10090005" w:tentative="1">
@@ -1656,7 +1680,7 @@
         <w:ind w:left="6480" w:hanging="360"/>
       </w:pPr>
       <w:rPr>
-        <w:rFonts w:ascii="Wingdings" w:hAnsi="Wingdings" w:hint="default"/>
+        <w:rFonts w:hint="default" w:ascii="Wingdings" w:hAnsi="Wingdings"/>
       </w:rPr>
     </w:lvl>
   </w:abstractNum>
@@ -1672,7 +1696,7 @@
         <w:ind w:left="1440" w:hanging="360"/>
       </w:pPr>
       <w:rPr>
-        <w:rFonts w:ascii="Aptos" w:eastAsiaTheme="minorHAnsi" w:hAnsi="Aptos" w:cstheme="minorBidi" w:hint="default"/>
+        <w:rFonts w:hint="default" w:ascii="Aptos" w:hAnsi="Aptos" w:eastAsiaTheme="minorHAnsi" w:cstheme="minorBidi"/>
       </w:rPr>
     </w:lvl>
     <w:lvl w:ilvl="1" w:tplc="10090003" w:tentative="1">
@@ -1684,7 +1708,7 @@
         <w:ind w:left="2160" w:hanging="360"/>
       </w:pPr>
       <w:rPr>
-        <w:rFonts w:ascii="Courier New" w:hAnsi="Courier New" w:cs="Courier New" w:hint="default"/>
+        <w:rFonts w:hint="default" w:ascii="Courier New" w:hAnsi="Courier New" w:cs="Courier New"/>
       </w:rPr>
     </w:lvl>
     <w:lvl w:ilvl="2" w:tplc="10090005" w:tentative="1">
@@ -1696,7 +1720,7 @@
         <w:ind w:left="2880" w:hanging="360"/>
       </w:pPr>
       <w:rPr>
-        <w:rFonts w:ascii="Wingdings" w:hAnsi="Wingdings" w:hint="default"/>
+        <w:rFonts w:hint="default" w:ascii="Wingdings" w:hAnsi="Wingdings"/>
       </w:rPr>
     </w:lvl>
     <w:lvl w:ilvl="3" w:tplc="10090001" w:tentative="1">
@@ -1708,7 +1732,7 @@
         <w:ind w:left="3600" w:hanging="360"/>
       </w:pPr>
       <w:rPr>
-        <w:rFonts w:ascii="Symbol" w:hAnsi="Symbol" w:hint="default"/>
+        <w:rFonts w:hint="default" w:ascii="Symbol" w:hAnsi="Symbol"/>
       </w:rPr>
     </w:lvl>
     <w:lvl w:ilvl="4" w:tplc="10090003" w:tentative="1">
@@ -1720,7 +1744,7 @@
         <w:ind w:left="4320" w:hanging="360"/>
       </w:pPr>
       <w:rPr>
-        <w:rFonts w:ascii="Courier New" w:hAnsi="Courier New" w:cs="Courier New" w:hint="default"/>
+        <w:rFonts w:hint="default" w:ascii="Courier New" w:hAnsi="Courier New" w:cs="Courier New"/>
       </w:rPr>
     </w:lvl>
     <w:lvl w:ilvl="5" w:tplc="10090005" w:tentative="1">
@@ -1732,7 +1756,7 @@
         <w:ind w:left="5040" w:hanging="360"/>
       </w:pPr>
       <w:rPr>
-        <w:rFonts w:ascii="Wingdings" w:hAnsi="Wingdings" w:hint="default"/>
+        <w:rFonts w:hint="default" w:ascii="Wingdings" w:hAnsi="Wingdings"/>
       </w:rPr>
     </w:lvl>
     <w:lvl w:ilvl="6" w:tplc="10090001" w:tentative="1">
@@ -1744,7 +1768,7 @@
         <w:ind w:left="5760" w:hanging="360"/>
       </w:pPr>
       <w:rPr>
-        <w:rFonts w:ascii="Symbol" w:hAnsi="Symbol" w:hint="default"/>
+        <w:rFonts w:hint="default" w:ascii="Symbol" w:hAnsi="Symbol"/>
       </w:rPr>
     </w:lvl>
     <w:lvl w:ilvl="7" w:tplc="10090003" w:tentative="1">
@@ -1756,7 +1780,7 @@
         <w:ind w:left="6480" w:hanging="360"/>
       </w:pPr>
       <w:rPr>
-        <w:rFonts w:ascii="Courier New" w:hAnsi="Courier New" w:cs="Courier New" w:hint="default"/>
+        <w:rFonts w:hint="default" w:ascii="Courier New" w:hAnsi="Courier New" w:cs="Courier New"/>
       </w:rPr>
     </w:lvl>
     <w:lvl w:ilvl="8" w:tplc="10090005" w:tentative="1">
@@ -1768,7 +1792,7 @@
         <w:ind w:left="7200" w:hanging="360"/>
       </w:pPr>
       <w:rPr>
-        <w:rFonts w:ascii="Wingdings" w:hAnsi="Wingdings" w:hint="default"/>
+        <w:rFonts w:hint="default" w:ascii="Wingdings" w:hAnsi="Wingdings"/>
       </w:rPr>
     </w:lvl>
   </w:abstractNum>
@@ -1785,7 +1809,7 @@
         <w:ind w:left="720" w:hanging="360"/>
       </w:pPr>
       <w:rPr>
-        <w:rFonts w:ascii="Symbol" w:hAnsi="Symbol" w:hint="default"/>
+        <w:rFonts w:hint="default" w:ascii="Symbol" w:hAnsi="Symbol"/>
       </w:rPr>
     </w:lvl>
     <w:lvl w:ilvl="1" w:tplc="10090003" w:tentative="1">
@@ -1797,7 +1821,7 @@
         <w:ind w:left="1440" w:hanging="360"/>
       </w:pPr>
       <w:rPr>
-        <w:rFonts w:ascii="Courier New" w:hAnsi="Courier New" w:cs="Courier New" w:hint="default"/>
+        <w:rFonts w:hint="default" w:ascii="Courier New" w:hAnsi="Courier New" w:cs="Courier New"/>
       </w:rPr>
     </w:lvl>
     <w:lvl w:ilvl="2" w:tplc="10090005" w:tentative="1">
@@ -1809,7 +1833,7 @@
         <w:ind w:left="2160" w:hanging="360"/>
       </w:pPr>
       <w:rPr>
-        <w:rFonts w:ascii="Wingdings" w:hAnsi="Wingdings" w:hint="default"/>
+        <w:rFonts w:hint="default" w:ascii="Wingdings" w:hAnsi="Wingdings"/>
       </w:rPr>
     </w:lvl>
     <w:lvl w:ilvl="3" w:tplc="10090001" w:tentative="1">
@@ -1821,7 +1845,7 @@
         <w:ind w:left="2880" w:hanging="360"/>
       </w:pPr>
       <w:rPr>
-        <w:rFonts w:ascii="Symbol" w:hAnsi="Symbol" w:hint="default"/>
+        <w:rFonts w:hint="default" w:ascii="Symbol" w:hAnsi="Symbol"/>
       </w:rPr>
     </w:lvl>
     <w:lvl w:ilvl="4" w:tplc="10090003" w:tentative="1">
@@ -1833,7 +1857,7 @@
         <w:ind w:left="3600" w:hanging="360"/>
       </w:pPr>
       <w:rPr>
-        <w:rFonts w:ascii="Courier New" w:hAnsi="Courier New" w:cs="Courier New" w:hint="default"/>
+        <w:rFonts w:hint="default" w:ascii="Courier New" w:hAnsi="Courier New" w:cs="Courier New"/>
       </w:rPr>
     </w:lvl>
     <w:lvl w:ilvl="5" w:tplc="10090005" w:tentative="1">
@@ -1845,7 +1869,7 @@
         <w:ind w:left="4320" w:hanging="360"/>
       </w:pPr>
       <w:rPr>
-        <w:rFonts w:ascii="Wingdings" w:hAnsi="Wingdings" w:hint="default"/>
+        <w:rFonts w:hint="default" w:ascii="Wingdings" w:hAnsi="Wingdings"/>
       </w:rPr>
     </w:lvl>
     <w:lvl w:ilvl="6" w:tplc="10090001" w:tentative="1">
@@ -1857,7 +1881,7 @@
         <w:ind w:left="5040" w:hanging="360"/>
       </w:pPr>
       <w:rPr>
-        <w:rFonts w:ascii="Symbol" w:hAnsi="Symbol" w:hint="default"/>
+        <w:rFonts w:hint="default" w:ascii="Symbol" w:hAnsi="Symbol"/>
       </w:rPr>
     </w:lvl>
     <w:lvl w:ilvl="7" w:tplc="10090003" w:tentative="1">
@@ -1869,7 +1893,7 @@
         <w:ind w:left="5760" w:hanging="360"/>
       </w:pPr>
       <w:rPr>
-        <w:rFonts w:ascii="Courier New" w:hAnsi="Courier New" w:cs="Courier New" w:hint="default"/>
+        <w:rFonts w:hint="default" w:ascii="Courier New" w:hAnsi="Courier New" w:cs="Courier New"/>
       </w:rPr>
     </w:lvl>
     <w:lvl w:ilvl="8" w:tplc="10090005" w:tentative="1">
@@ -1881,7 +1905,7 @@
         <w:ind w:left="6480" w:hanging="360"/>
       </w:pPr>
       <w:rPr>
-        <w:rFonts w:ascii="Wingdings" w:hAnsi="Wingdings" w:hint="default"/>
+        <w:rFonts w:hint="default" w:ascii="Wingdings" w:hAnsi="Wingdings"/>
       </w:rPr>
     </w:lvl>
   </w:abstractNum>
@@ -1898,7 +1922,7 @@
         <w:ind w:left="2160" w:hanging="360"/>
       </w:pPr>
       <w:rPr>
-        <w:rFonts w:ascii="Symbol" w:hAnsi="Symbol" w:hint="default"/>
+        <w:rFonts w:hint="default" w:ascii="Symbol" w:hAnsi="Symbol"/>
       </w:rPr>
     </w:lvl>
     <w:lvl w:ilvl="1" w:tplc="10090003" w:tentative="1">
@@ -1910,7 +1934,7 @@
         <w:ind w:left="2880" w:hanging="360"/>
       </w:pPr>
       <w:rPr>
-        <w:rFonts w:ascii="Courier New" w:hAnsi="Courier New" w:cs="Courier New" w:hint="default"/>
+        <w:rFonts w:hint="default" w:ascii="Courier New" w:hAnsi="Courier New" w:cs="Courier New"/>
       </w:rPr>
     </w:lvl>
     <w:lvl w:ilvl="2" w:tplc="10090005" w:tentative="1">
@@ -1922,7 +1946,7 @@
         <w:ind w:left="3600" w:hanging="360"/>
       </w:pPr>
       <w:rPr>
-        <w:rFonts w:ascii="Wingdings" w:hAnsi="Wingdings" w:hint="default"/>
+        <w:rFonts w:hint="default" w:ascii="Wingdings" w:hAnsi="Wingdings"/>
       </w:rPr>
     </w:lvl>
     <w:lvl w:ilvl="3" w:tplc="10090001" w:tentative="1">
@@ -1934,7 +1958,7 @@
         <w:ind w:left="4320" w:hanging="360"/>
       </w:pPr>
       <w:rPr>
-        <w:rFonts w:ascii="Symbol" w:hAnsi="Symbol" w:hint="default"/>
+        <w:rFonts w:hint="default" w:ascii="Symbol" w:hAnsi="Symbol"/>
       </w:rPr>
     </w:lvl>
     <w:lvl w:ilvl="4" w:tplc="10090003" w:tentative="1">
@@ -1946,7 +1970,7 @@
         <w:ind w:left="5040" w:hanging="360"/>
       </w:pPr>
       <w:rPr>
-        <w:rFonts w:ascii="Courier New" w:hAnsi="Courier New" w:cs="Courier New" w:hint="default"/>
+        <w:rFonts w:hint="default" w:ascii="Courier New" w:hAnsi="Courier New" w:cs="Courier New"/>
       </w:rPr>
     </w:lvl>
     <w:lvl w:ilvl="5" w:tplc="10090005" w:tentative="1">
@@ -1958,7 +1982,7 @@
         <w:ind w:left="5760" w:hanging="360"/>
       </w:pPr>
       <w:rPr>
-        <w:rFonts w:ascii="Wingdings" w:hAnsi="Wingdings" w:hint="default"/>
+        <w:rFonts w:hint="default" w:ascii="Wingdings" w:hAnsi="Wingdings"/>
       </w:rPr>
     </w:lvl>
     <w:lvl w:ilvl="6" w:tplc="10090001" w:tentative="1">
@@ -1970,7 +1994,7 @@
         <w:ind w:left="6480" w:hanging="360"/>
       </w:pPr>
       <w:rPr>
-        <w:rFonts w:ascii="Symbol" w:hAnsi="Symbol" w:hint="default"/>
+        <w:rFonts w:hint="default" w:ascii="Symbol" w:hAnsi="Symbol"/>
       </w:rPr>
     </w:lvl>
     <w:lvl w:ilvl="7" w:tplc="10090003" w:tentative="1">
@@ -1982,7 +2006,7 @@
         <w:ind w:left="7200" w:hanging="360"/>
       </w:pPr>
       <w:rPr>
-        <w:rFonts w:ascii="Courier New" w:hAnsi="Courier New" w:cs="Courier New" w:hint="default"/>
+        <w:rFonts w:hint="default" w:ascii="Courier New" w:hAnsi="Courier New" w:cs="Courier New"/>
       </w:rPr>
     </w:lvl>
     <w:lvl w:ilvl="8" w:tplc="10090005" w:tentative="1">
@@ -1994,7 +2018,7 @@
         <w:ind w:left="7920" w:hanging="360"/>
       </w:pPr>
       <w:rPr>
-        <w:rFonts w:ascii="Wingdings" w:hAnsi="Wingdings" w:hint="default"/>
+        <w:rFonts w:hint="default" w:ascii="Wingdings" w:hAnsi="Wingdings"/>
       </w:rPr>
     </w:lvl>
   </w:abstractNum>
@@ -2010,7 +2034,7 @@
         <w:ind w:left="1080" w:hanging="360"/>
       </w:pPr>
       <w:rPr>
-        <w:rFonts w:ascii="Aptos" w:eastAsiaTheme="minorHAnsi" w:hAnsi="Aptos" w:cstheme="minorBidi" w:hint="default"/>
+        <w:rFonts w:hint="default" w:ascii="Aptos" w:hAnsi="Aptos" w:eastAsiaTheme="minorHAnsi" w:cstheme="minorBidi"/>
       </w:rPr>
     </w:lvl>
     <w:lvl w:ilvl="1" w:tplc="10090003" w:tentative="1">
@@ -2022,7 +2046,7 @@
         <w:ind w:left="1440" w:hanging="360"/>
       </w:pPr>
       <w:rPr>
-        <w:rFonts w:ascii="Courier New" w:hAnsi="Courier New" w:cs="Courier New" w:hint="default"/>
+        <w:rFonts w:hint="default" w:ascii="Courier New" w:hAnsi="Courier New" w:cs="Courier New"/>
       </w:rPr>
     </w:lvl>
     <w:lvl w:ilvl="2" w:tplc="10090005" w:tentative="1">
@@ -2034,7 +2058,7 @@
         <w:ind w:left="2160" w:hanging="360"/>
       </w:pPr>
       <w:rPr>
-        <w:rFonts w:ascii="Wingdings" w:hAnsi="Wingdings" w:hint="default"/>
+        <w:rFonts w:hint="default" w:ascii="Wingdings" w:hAnsi="Wingdings"/>
       </w:rPr>
     </w:lvl>
     <w:lvl w:ilvl="3" w:tplc="10090001" w:tentative="1">
@@ -2046,7 +2070,7 @@
         <w:ind w:left="2880" w:hanging="360"/>
       </w:pPr>
       <w:rPr>
-        <w:rFonts w:ascii="Symbol" w:hAnsi="Symbol" w:hint="default"/>
+        <w:rFonts w:hint="default" w:ascii="Symbol" w:hAnsi="Symbol"/>
       </w:rPr>
     </w:lvl>
     <w:lvl w:ilvl="4" w:tplc="10090003" w:tentative="1">
@@ -2058,7 +2082,7 @@
         <w:ind w:left="3600" w:hanging="360"/>
       </w:pPr>
       <w:rPr>
-        <w:rFonts w:ascii="Courier New" w:hAnsi="Courier New" w:cs="Courier New" w:hint="default"/>
+        <w:rFonts w:hint="default" w:ascii="Courier New" w:hAnsi="Courier New" w:cs="Courier New"/>
       </w:rPr>
     </w:lvl>
     <w:lvl w:ilvl="5" w:tplc="10090005" w:tentative="1">
@@ -2070,7 +2094,7 @@
         <w:ind w:left="4320" w:hanging="360"/>
       </w:pPr>
       <w:rPr>
-        <w:rFonts w:ascii="Wingdings" w:hAnsi="Wingdings" w:hint="default"/>
+        <w:rFonts w:hint="default" w:ascii="Wingdings" w:hAnsi="Wingdings"/>
       </w:rPr>
     </w:lvl>
     <w:lvl w:ilvl="6" w:tplc="10090001" w:tentative="1">
@@ -2082,7 +2106,7 @@
         <w:ind w:left="5040" w:hanging="360"/>
       </w:pPr>
       <w:rPr>
-        <w:rFonts w:ascii="Symbol" w:hAnsi="Symbol" w:hint="default"/>
+        <w:rFonts w:hint="default" w:ascii="Symbol" w:hAnsi="Symbol"/>
       </w:rPr>
     </w:lvl>
     <w:lvl w:ilvl="7" w:tplc="10090003" w:tentative="1">
@@ -2094,7 +2118,7 @@
         <w:ind w:left="5760" w:hanging="360"/>
       </w:pPr>
       <w:rPr>
-        <w:rFonts w:ascii="Courier New" w:hAnsi="Courier New" w:cs="Courier New" w:hint="default"/>
+        <w:rFonts w:hint="default" w:ascii="Courier New" w:hAnsi="Courier New" w:cs="Courier New"/>
       </w:rPr>
     </w:lvl>
     <w:lvl w:ilvl="8" w:tplc="10090005" w:tentative="1">
@@ -2106,7 +2130,7 @@
         <w:ind w:left="6480" w:hanging="360"/>
       </w:pPr>
       <w:rPr>
-        <w:rFonts w:ascii="Wingdings" w:hAnsi="Wingdings" w:hint="default"/>
+        <w:rFonts w:hint="default" w:ascii="Wingdings" w:hAnsi="Wingdings"/>
       </w:rPr>
     </w:lvl>
   </w:abstractNum>
@@ -2122,7 +2146,7 @@
         <w:ind w:left="1080" w:hanging="360"/>
       </w:pPr>
       <w:rPr>
-        <w:rFonts w:ascii="Aptos" w:eastAsiaTheme="minorHAnsi" w:hAnsi="Aptos" w:cstheme="minorBidi" w:hint="default"/>
+        <w:rFonts w:hint="default" w:ascii="Aptos" w:hAnsi="Aptos" w:eastAsiaTheme="minorHAnsi" w:cstheme="minorBidi"/>
       </w:rPr>
     </w:lvl>
     <w:lvl w:ilvl="1" w:tplc="10090003" w:tentative="1">
@@ -2134,7 +2158,7 @@
         <w:ind w:left="1800" w:hanging="360"/>
       </w:pPr>
       <w:rPr>
-        <w:rFonts w:ascii="Courier New" w:hAnsi="Courier New" w:cs="Courier New" w:hint="default"/>
+        <w:rFonts w:hint="default" w:ascii="Courier New" w:hAnsi="Courier New" w:cs="Courier New"/>
       </w:rPr>
     </w:lvl>
     <w:lvl w:ilvl="2" w:tplc="10090005" w:tentative="1">
@@ -2146,7 +2170,7 @@
         <w:ind w:left="2520" w:hanging="360"/>
       </w:pPr>
       <w:rPr>
-        <w:rFonts w:ascii="Wingdings" w:hAnsi="Wingdings" w:hint="default"/>
+        <w:rFonts w:hint="default" w:ascii="Wingdings" w:hAnsi="Wingdings"/>
       </w:rPr>
     </w:lvl>
     <w:lvl w:ilvl="3" w:tplc="10090001" w:tentative="1">
@@ -2158,7 +2182,7 @@
         <w:ind w:left="3240" w:hanging="360"/>
       </w:pPr>
       <w:rPr>
-        <w:rFonts w:ascii="Symbol" w:hAnsi="Symbol" w:hint="default"/>
+        <w:rFonts w:hint="default" w:ascii="Symbol" w:hAnsi="Symbol"/>
       </w:rPr>
     </w:lvl>
     <w:lvl w:ilvl="4" w:tplc="10090003" w:tentative="1">
@@ -2170,7 +2194,7 @@
         <w:ind w:left="3960" w:hanging="360"/>
       </w:pPr>
       <w:rPr>
-        <w:rFonts w:ascii="Courier New" w:hAnsi="Courier New" w:cs="Courier New" w:hint="default"/>
+        <w:rFonts w:hint="default" w:ascii="Courier New" w:hAnsi="Courier New" w:cs="Courier New"/>
       </w:rPr>
     </w:lvl>
     <w:lvl w:ilvl="5" w:tplc="10090005" w:tentative="1">
@@ -2182,7 +2206,7 @@
         <w:ind w:left="4680" w:hanging="360"/>
       </w:pPr>
       <w:rPr>
-        <w:rFonts w:ascii="Wingdings" w:hAnsi="Wingdings" w:hint="default"/>
+        <w:rFonts w:hint="default" w:ascii="Wingdings" w:hAnsi="Wingdings"/>
       </w:rPr>
     </w:lvl>
     <w:lvl w:ilvl="6" w:tplc="10090001" w:tentative="1">
@@ -2194,7 +2218,7 @@
         <w:ind w:left="5400" w:hanging="360"/>
       </w:pPr>
       <w:rPr>
-        <w:rFonts w:ascii="Symbol" w:hAnsi="Symbol" w:hint="default"/>
+        <w:rFonts w:hint="default" w:ascii="Symbol" w:hAnsi="Symbol"/>
       </w:rPr>
     </w:lvl>
     <w:lvl w:ilvl="7" w:tplc="10090003" w:tentative="1">
@@ -2206,7 +2230,7 @@
         <w:ind w:left="6120" w:hanging="360"/>
       </w:pPr>
       <w:rPr>
-        <w:rFonts w:ascii="Courier New" w:hAnsi="Courier New" w:cs="Courier New" w:hint="default"/>
+        <w:rFonts w:hint="default" w:ascii="Courier New" w:hAnsi="Courier New" w:cs="Courier New"/>
       </w:rPr>
     </w:lvl>
     <w:lvl w:ilvl="8" w:tplc="10090005" w:tentative="1">
@@ -2218,7 +2242,7 @@
         <w:ind w:left="6840" w:hanging="360"/>
       </w:pPr>
       <w:rPr>
-        <w:rFonts w:ascii="Wingdings" w:hAnsi="Wingdings" w:hint="default"/>
+        <w:rFonts w:hint="default" w:ascii="Wingdings" w:hAnsi="Wingdings"/>
       </w:rPr>
     </w:lvl>
   </w:abstractNum>
@@ -2247,11 +2271,11 @@
 </file>
 
 <file path=word/styles.xml><?xml version="1.0" encoding="utf-8"?>
-<w:styles xmlns:mc="http://schemas.openxmlformats.org/markup-compatibility/2006" xmlns:r="http://schemas.openxmlformats.org/officeDocument/2006/relationships" xmlns:w="http://schemas.openxmlformats.org/wordprocessingml/2006/main" xmlns:w14="http://schemas.microsoft.com/office/word/2010/wordml" xmlns:w15="http://schemas.microsoft.com/office/word/2012/wordml" xmlns:w16cex="http://schemas.microsoft.com/office/word/2018/wordml/cex" xmlns:w16cid="http://schemas.microsoft.com/office/word/2016/wordml/cid" xmlns:w16="http://schemas.microsoft.com/office/word/2018/wordml" xmlns:w16du="http://schemas.microsoft.com/office/word/2023/wordml/word16du" xmlns:w16sdtdh="http://schemas.microsoft.com/office/word/2020/wordml/sdtdatahash" xmlns:w16sdtfl="http://schemas.microsoft.com/office/word/2024/wordml/sdtformatlock" xmlns:w16se="http://schemas.microsoft.com/office/word/2015/wordml/symex" mc:Ignorable="w14 w15 w16se w16cid w16 w16cex w16sdtdh w16sdtfl w16du">
+<w:styles xmlns:wp14="http://schemas.microsoft.com/office/word/2010/wordprocessingDrawing" xmlns:mc="http://schemas.openxmlformats.org/markup-compatibility/2006" xmlns:r="http://schemas.openxmlformats.org/officeDocument/2006/relationships" xmlns:w="http://schemas.openxmlformats.org/wordprocessingml/2006/main" xmlns:w14="http://schemas.microsoft.com/office/word/2010/wordml" xmlns:w15="http://schemas.microsoft.com/office/word/2012/wordml" xmlns:w16cex="http://schemas.microsoft.com/office/word/2018/wordml/cex" xmlns:w16cid="http://schemas.microsoft.com/office/word/2016/wordml/cid" xmlns:w16="http://schemas.microsoft.com/office/word/2018/wordml" xmlns:w16du="http://schemas.microsoft.com/office/word/2023/wordml/word16du" xmlns:w16sdtdh="http://schemas.microsoft.com/office/word/2020/wordml/sdtdatahash" xmlns:w16sdtfl="http://schemas.microsoft.com/office/word/2024/wordml/sdtformatlock" xmlns:w16se="http://schemas.microsoft.com/office/word/2015/wordml/symex" mc:Ignorable="w14 w15 w16se w16cid w16 w16cex w16sdtdh w16sdtfl w16du wp14">
   <w:docDefaults>
     <w:rPrDefault>
       <w:rPr>
-        <w:rFonts w:asciiTheme="minorHAnsi" w:eastAsiaTheme="minorHAnsi" w:hAnsiTheme="minorHAnsi" w:cstheme="minorBidi"/>
+        <w:rFonts w:asciiTheme="minorHAnsi" w:hAnsiTheme="minorHAnsi" w:eastAsiaTheme="minorHAnsi" w:cstheme="minorBidi"/>
         <w:kern w:val="2"/>
         <w:sz w:val="24"/>
         <w:szCs w:val="24"/>
@@ -2268,14 +2292,14 @@
   <w:latentStyles w:defLockedState="0" w:defUIPriority="99" w:defSemiHidden="0" w:defUnhideWhenUsed="0" w:defQFormat="0" w:count="376">
     <w:lsdException w:name="Normal" w:uiPriority="0" w:qFormat="1"/>
     <w:lsdException w:name="heading 1" w:uiPriority="9" w:qFormat="1"/>
-    <w:lsdException w:name="heading 2" w:semiHidden="1" w:uiPriority="9" w:unhideWhenUsed="1" w:qFormat="1"/>
-    <w:lsdException w:name="heading 3" w:semiHidden="1" w:uiPriority="9" w:unhideWhenUsed="1" w:qFormat="1"/>
-    <w:lsdException w:name="heading 4" w:semiHidden="1" w:uiPriority="9" w:unhideWhenUsed="1" w:qFormat="1"/>
-    <w:lsdException w:name="heading 5" w:semiHidden="1" w:uiPriority="9" w:unhideWhenUsed="1" w:qFormat="1"/>
-    <w:lsdException w:name="heading 6" w:semiHidden="1" w:uiPriority="9" w:unhideWhenUsed="1" w:qFormat="1"/>
-    <w:lsdException w:name="heading 7" w:semiHidden="1" w:uiPriority="9" w:unhideWhenUsed="1" w:qFormat="1"/>
-    <w:lsdException w:name="heading 8" w:semiHidden="1" w:uiPriority="9" w:unhideWhenUsed="1" w:qFormat="1"/>
-    <w:lsdException w:name="heading 9" w:semiHidden="1" w:uiPriority="9" w:unhideWhenUsed="1" w:qFormat="1"/>
+    <w:lsdException w:name="heading 2" w:uiPriority="9" w:semiHidden="1" w:unhideWhenUsed="1" w:qFormat="1"/>
+    <w:lsdException w:name="heading 3" w:uiPriority="9" w:semiHidden="1" w:unhideWhenUsed="1" w:qFormat="1"/>
+    <w:lsdException w:name="heading 4" w:uiPriority="9" w:semiHidden="1" w:unhideWhenUsed="1" w:qFormat="1"/>
+    <w:lsdException w:name="heading 5" w:uiPriority="9" w:semiHidden="1" w:unhideWhenUsed="1" w:qFormat="1"/>
+    <w:lsdException w:name="heading 6" w:uiPriority="9" w:semiHidden="1" w:unhideWhenUsed="1" w:qFormat="1"/>
+    <w:lsdException w:name="heading 7" w:uiPriority="9" w:semiHidden="1" w:unhideWhenUsed="1" w:qFormat="1"/>
+    <w:lsdException w:name="heading 8" w:uiPriority="9" w:semiHidden="1" w:unhideWhenUsed="1" w:qFormat="1"/>
+    <w:lsdException w:name="heading 9" w:uiPriority="9" w:semiHidden="1" w:unhideWhenUsed="1" w:qFormat="1"/>
     <w:lsdException w:name="index 1" w:semiHidden="1" w:unhideWhenUsed="1"/>
     <w:lsdException w:name="index 2" w:semiHidden="1" w:unhideWhenUsed="1"/>
     <w:lsdException w:name="index 3" w:semiHidden="1" w:unhideWhenUsed="1"/>
@@ -2285,22 +2309,22 @@
     <w:lsdException w:name="index 7" w:semiHidden="1" w:unhideWhenUsed="1"/>
     <w:lsdException w:name="index 8" w:semiHidden="1" w:unhideWhenUsed="1"/>
     <w:lsdException w:name="index 9" w:semiHidden="1" w:unhideWhenUsed="1"/>
-    <w:lsdException w:name="toc 1" w:semiHidden="1" w:uiPriority="39" w:unhideWhenUsed="1"/>
-    <w:lsdException w:name="toc 2" w:semiHidden="1" w:uiPriority="39" w:unhideWhenUsed="1"/>
-    <w:lsdException w:name="toc 3" w:semiHidden="1" w:uiPriority="39" w:unhideWhenUsed="1"/>
-    <w:lsdException w:name="toc 4" w:semiHidden="1" w:uiPriority="39" w:unhideWhenUsed="1"/>
-    <w:lsdException w:name="toc 5" w:semiHidden="1" w:uiPriority="39" w:unhideWhenUsed="1"/>
-    <w:lsdException w:name="toc 6" w:semiHidden="1" w:uiPriority="39" w:unhideWhenUsed="1"/>
-    <w:lsdException w:name="toc 7" w:semiHidden="1" w:uiPriority="39" w:unhideWhenUsed="1"/>
-    <w:lsdException w:name="toc 8" w:semiHidden="1" w:uiPriority="39" w:unhideWhenUsed="1"/>
-    <w:lsdException w:name="toc 9" w:semiHidden="1" w:uiPriority="39" w:unhideWhenUsed="1"/>
+    <w:lsdException w:name="toc 1" w:uiPriority="39" w:semiHidden="1" w:unhideWhenUsed="1"/>
+    <w:lsdException w:name="toc 2" w:uiPriority="39" w:semiHidden="1" w:unhideWhenUsed="1"/>
+    <w:lsdException w:name="toc 3" w:uiPriority="39" w:semiHidden="1" w:unhideWhenUsed="1"/>
+    <w:lsdException w:name="toc 4" w:uiPriority="39" w:semiHidden="1" w:unhideWhenUsed="1"/>
+    <w:lsdException w:name="toc 5" w:uiPriority="39" w:semiHidden="1" w:unhideWhenUsed="1"/>
+    <w:lsdException w:name="toc 6" w:uiPriority="39" w:semiHidden="1" w:unhideWhenUsed="1"/>
+    <w:lsdException w:name="toc 7" w:uiPriority="39" w:semiHidden="1" w:unhideWhenUsed="1"/>
+    <w:lsdException w:name="toc 8" w:uiPriority="39" w:semiHidden="1" w:unhideWhenUsed="1"/>
+    <w:lsdException w:name="toc 9" w:uiPriority="39" w:semiHidden="1" w:unhideWhenUsed="1"/>
     <w:lsdException w:name="Normal Indent" w:semiHidden="1" w:unhideWhenUsed="1"/>
     <w:lsdException w:name="footnote text" w:semiHidden="1" w:unhideWhenUsed="1"/>
     <w:lsdException w:name="annotation text" w:semiHidden="1" w:unhideWhenUsed="1"/>
     <w:lsdException w:name="header" w:semiHidden="1" w:unhideWhenUsed="1"/>
     <w:lsdException w:name="footer" w:semiHidden="1" w:unhideWhenUsed="1"/>
     <w:lsdException w:name="index heading" w:semiHidden="1" w:unhideWhenUsed="1"/>
-    <w:lsdException w:name="caption" w:semiHidden="1" w:uiPriority="35" w:unhideWhenUsed="1" w:qFormat="1"/>
+    <w:lsdException w:name="caption" w:uiPriority="35" w:semiHidden="1" w:unhideWhenUsed="1" w:qFormat="1"/>
     <w:lsdException w:name="table of figures" w:semiHidden="1" w:unhideWhenUsed="1"/>
     <w:lsdException w:name="envelope address" w:semiHidden="1" w:unhideWhenUsed="1"/>
     <w:lsdException w:name="envelope return" w:semiHidden="1" w:unhideWhenUsed="1"/>
@@ -2331,7 +2355,7 @@
     <w:lsdException w:name="Title" w:uiPriority="10" w:qFormat="1"/>
     <w:lsdException w:name="Closing" w:semiHidden="1" w:unhideWhenUsed="1"/>
     <w:lsdException w:name="Signature" w:semiHidden="1" w:unhideWhenUsed="1"/>
-    <w:lsdException w:name="Default Paragraph Font" w:semiHidden="1" w:uiPriority="1" w:unhideWhenUsed="1"/>
+    <w:lsdException w:name="Default Paragraph Font" w:uiPriority="1" w:semiHidden="1" w:unhideWhenUsed="1"/>
     <w:lsdException w:name="Body Text" w:semiHidden="1" w:unhideWhenUsed="1"/>
     <w:lsdException w:name="Body Text Indent" w:semiHidden="1" w:unhideWhenUsed="1"/>
     <w:lsdException w:name="List Continue" w:semiHidden="1" w:unhideWhenUsed="1"/>
@@ -2531,8 +2555,8 @@
     <w:lsdException w:name="Subtle Reference" w:uiPriority="31" w:qFormat="1"/>
     <w:lsdException w:name="Intense Reference" w:uiPriority="32" w:qFormat="1"/>
     <w:lsdException w:name="Book Title" w:uiPriority="33" w:qFormat="1"/>
-    <w:lsdException w:name="Bibliography" w:semiHidden="1" w:uiPriority="37" w:unhideWhenUsed="1"/>
-    <w:lsdException w:name="TOC Heading" w:semiHidden="1" w:uiPriority="39" w:unhideWhenUsed="1" w:qFormat="1"/>
+    <w:lsdException w:name="Bibliography" w:uiPriority="37" w:semiHidden="1" w:unhideWhenUsed="1"/>
+    <w:lsdException w:name="TOC Heading" w:uiPriority="39" w:semiHidden="1" w:unhideWhenUsed="1" w:qFormat="1"/>
     <w:lsdException w:name="Plain Table 1" w:uiPriority="41"/>
     <w:lsdException w:name="Plain Table 2" w:uiPriority="42"/>
     <w:lsdException w:name="Plain Table 3" w:uiPriority="43"/>
@@ -2643,7 +2667,7 @@
     <w:lsdException w:name="Unresolved Mention" w:semiHidden="1" w:unhideWhenUsed="1"/>
     <w:lsdException w:name="Smart Link" w:semiHidden="1" w:unhideWhenUsed="1"/>
   </w:latentStyles>
-  <w:style w:type="paragraph" w:default="1" w:styleId="Normal">
+  <w:style w:type="paragraph" w:styleId="Normal" w:default="1">
     <w:name w:val="Normal"/>
     <w:qFormat/>
     <w:rsid w:val="009A6CF3"/>
@@ -2663,7 +2687,7 @@
       <w:outlineLvl w:val="0"/>
     </w:pPr>
     <w:rPr>
-      <w:rFonts w:asciiTheme="majorHAnsi" w:eastAsiaTheme="majorEastAsia" w:hAnsiTheme="majorHAnsi" w:cstheme="majorBidi"/>
+      <w:rFonts w:asciiTheme="majorHAnsi" w:hAnsiTheme="majorHAnsi" w:eastAsiaTheme="majorEastAsia" w:cstheme="majorBidi"/>
       <w:color w:val="0F4761" w:themeColor="accent1" w:themeShade="BF"/>
       <w:sz w:val="40"/>
       <w:szCs w:val="40"/>
@@ -2686,7 +2710,7 @@
       <w:outlineLvl w:val="1"/>
     </w:pPr>
     <w:rPr>
-      <w:rFonts w:asciiTheme="majorHAnsi" w:eastAsiaTheme="majorEastAsia" w:hAnsiTheme="majorHAnsi" w:cstheme="majorBidi"/>
+      <w:rFonts w:asciiTheme="majorHAnsi" w:hAnsiTheme="majorHAnsi" w:eastAsiaTheme="majorEastAsia" w:cstheme="majorBidi"/>
       <w:color w:val="0F4761" w:themeColor="accent1" w:themeShade="BF"/>
       <w:sz w:val="32"/>
       <w:szCs w:val="32"/>
@@ -2847,13 +2871,13 @@
       <w:color w:val="272727" w:themeColor="text1" w:themeTint="D8"/>
     </w:rPr>
   </w:style>
-  <w:style w:type="character" w:default="1" w:styleId="DefaultParagraphFont">
+  <w:style w:type="character" w:styleId="DefaultParagraphFont" w:default="1">
     <w:name w:val="Default Paragraph Font"/>
     <w:uiPriority w:val="1"/>
     <w:semiHidden/>
     <w:unhideWhenUsed/>
   </w:style>
-  <w:style w:type="table" w:default="1" w:styleId="TableNormal">
+  <w:style w:type="table" w:styleId="TableNormal" w:default="1">
     <w:name w:val="Normal Table"/>
     <w:uiPriority w:val="99"/>
     <w:semiHidden/>
@@ -2868,26 +2892,26 @@
       </w:tblCellMar>
     </w:tblPr>
   </w:style>
-  <w:style w:type="numbering" w:default="1" w:styleId="NoList">
+  <w:style w:type="numbering" w:styleId="NoList" w:default="1">
     <w:name w:val="No List"/>
     <w:uiPriority w:val="99"/>
     <w:semiHidden/>
     <w:unhideWhenUsed/>
   </w:style>
-  <w:style w:type="character" w:customStyle="1" w:styleId="Heading1Char">
+  <w:style w:type="character" w:styleId="Heading1Char" w:customStyle="1">
     <w:name w:val="Heading 1 Char"/>
     <w:basedOn w:val="DefaultParagraphFont"/>
     <w:link w:val="Heading1"/>
     <w:uiPriority w:val="9"/>
     <w:rsid w:val="00D3067B"/>
     <w:rPr>
-      <w:rFonts w:asciiTheme="majorHAnsi" w:eastAsiaTheme="majorEastAsia" w:hAnsiTheme="majorHAnsi" w:cstheme="majorBidi"/>
+      <w:rFonts w:asciiTheme="majorHAnsi" w:hAnsiTheme="majorHAnsi" w:eastAsiaTheme="majorEastAsia" w:cstheme="majorBidi"/>
       <w:color w:val="0F4761" w:themeColor="accent1" w:themeShade="BF"/>
       <w:sz w:val="40"/>
       <w:szCs w:val="40"/>
     </w:rPr>
   </w:style>
-  <w:style w:type="character" w:customStyle="1" w:styleId="Heading2Char">
+  <w:style w:type="character" w:styleId="Heading2Char" w:customStyle="1">
     <w:name w:val="Heading 2 Char"/>
     <w:basedOn w:val="DefaultParagraphFont"/>
     <w:link w:val="Heading2"/>
@@ -2895,13 +2919,13 @@
     <w:semiHidden/>
     <w:rsid w:val="00D3067B"/>
     <w:rPr>
-      <w:rFonts w:asciiTheme="majorHAnsi" w:eastAsiaTheme="majorEastAsia" w:hAnsiTheme="majorHAnsi" w:cstheme="majorBidi"/>
+      <w:rFonts w:asciiTheme="majorHAnsi" w:hAnsiTheme="majorHAnsi" w:eastAsiaTheme="majorEastAsia" w:cstheme="majorBidi"/>
       <w:color w:val="0F4761" w:themeColor="accent1" w:themeShade="BF"/>
       <w:sz w:val="32"/>
       <w:szCs w:val="32"/>
     </w:rPr>
   </w:style>
-  <w:style w:type="character" w:customStyle="1" w:styleId="Heading3Char">
+  <w:style w:type="character" w:styleId="Heading3Char" w:customStyle="1">
     <w:name w:val="Heading 3 Char"/>
     <w:basedOn w:val="DefaultParagraphFont"/>
     <w:link w:val="Heading3"/>
@@ -2915,7 +2939,7 @@
       <w:szCs w:val="28"/>
     </w:rPr>
   </w:style>
-  <w:style w:type="character" w:customStyle="1" w:styleId="Heading4Char">
+  <w:style w:type="character" w:styleId="Heading4Char" w:customStyle="1">
     <w:name w:val="Heading 4 Char"/>
     <w:basedOn w:val="DefaultParagraphFont"/>
     <w:link w:val="Heading4"/>
@@ -2929,7 +2953,7 @@
       <w:color w:val="0F4761" w:themeColor="accent1" w:themeShade="BF"/>
     </w:rPr>
   </w:style>
-  <w:style w:type="character" w:customStyle="1" w:styleId="Heading5Char">
+  <w:style w:type="character" w:styleId="Heading5Char" w:customStyle="1">
     <w:name w:val="Heading 5 Char"/>
     <w:basedOn w:val="DefaultParagraphFont"/>
     <w:link w:val="Heading5"/>
@@ -2941,7 +2965,7 @@
       <w:color w:val="0F4761" w:themeColor="accent1" w:themeShade="BF"/>
     </w:rPr>
   </w:style>
-  <w:style w:type="character" w:customStyle="1" w:styleId="Heading6Char">
+  <w:style w:type="character" w:styleId="Heading6Char" w:customStyle="1">
     <w:name w:val="Heading 6 Char"/>
     <w:basedOn w:val="DefaultParagraphFont"/>
     <w:link w:val="Heading6"/>
@@ -2955,7 +2979,7 @@
       <w:color w:val="595959" w:themeColor="text1" w:themeTint="A6"/>
     </w:rPr>
   </w:style>
-  <w:style w:type="character" w:customStyle="1" w:styleId="Heading7Char">
+  <w:style w:type="character" w:styleId="Heading7Char" w:customStyle="1">
     <w:name w:val="Heading 7 Char"/>
     <w:basedOn w:val="DefaultParagraphFont"/>
     <w:link w:val="Heading7"/>
@@ -2967,7 +2991,7 @@
       <w:color w:val="595959" w:themeColor="text1" w:themeTint="A6"/>
     </w:rPr>
   </w:style>
-  <w:style w:type="character" w:customStyle="1" w:styleId="Heading8Char">
+  <w:style w:type="character" w:styleId="Heading8Char" w:customStyle="1">
     <w:name w:val="Heading 8 Char"/>
     <w:basedOn w:val="DefaultParagraphFont"/>
     <w:link w:val="Heading8"/>
@@ -2981,7 +3005,7 @@
       <w:color w:val="272727" w:themeColor="text1" w:themeTint="D8"/>
     </w:rPr>
   </w:style>
-  <w:style w:type="character" w:customStyle="1" w:styleId="Heading9Char">
+  <w:style w:type="character" w:styleId="Heading9Char" w:customStyle="1">
     <w:name w:val="Heading 9 Char"/>
     <w:basedOn w:val="DefaultParagraphFont"/>
     <w:link w:val="Heading9"/>
@@ -3006,21 +3030,21 @@
       <w:contextualSpacing/>
     </w:pPr>
     <w:rPr>
-      <w:rFonts w:asciiTheme="majorHAnsi" w:eastAsiaTheme="majorEastAsia" w:hAnsiTheme="majorHAnsi" w:cstheme="majorBidi"/>
+      <w:rFonts w:asciiTheme="majorHAnsi" w:hAnsiTheme="majorHAnsi" w:eastAsiaTheme="majorEastAsia" w:cstheme="majorBidi"/>
       <w:spacing w:val="-10"/>
       <w:kern w:val="28"/>
       <w:sz w:val="56"/>
       <w:szCs w:val="56"/>
     </w:rPr>
   </w:style>
-  <w:style w:type="character" w:customStyle="1" w:styleId="TitleChar">
+  <w:style w:type="character" w:styleId="TitleChar" w:customStyle="1">
     <w:name w:val="Title Char"/>
     <w:basedOn w:val="DefaultParagraphFont"/>
     <w:link w:val="Title"/>
     <w:uiPriority w:val="10"/>
     <w:rsid w:val="00D3067B"/>
     <w:rPr>
-      <w:rFonts w:asciiTheme="majorHAnsi" w:eastAsiaTheme="majorEastAsia" w:hAnsiTheme="majorHAnsi" w:cstheme="majorBidi"/>
+      <w:rFonts w:asciiTheme="majorHAnsi" w:hAnsiTheme="majorHAnsi" w:eastAsiaTheme="majorEastAsia" w:cstheme="majorBidi"/>
       <w:spacing w:val="-10"/>
       <w:kern w:val="28"/>
       <w:sz w:val="56"/>
@@ -3048,7 +3072,7 @@
       <w:szCs w:val="28"/>
     </w:rPr>
   </w:style>
-  <w:style w:type="character" w:customStyle="1" w:styleId="SubtitleChar">
+  <w:style w:type="character" w:styleId="SubtitleChar" w:customStyle="1">
     <w:name w:val="Subtitle Char"/>
     <w:basedOn w:val="DefaultParagraphFont"/>
     <w:link w:val="Subtitle"/>
@@ -3080,7 +3104,7 @@
       <w:color w:val="404040" w:themeColor="text1" w:themeTint="BF"/>
     </w:rPr>
   </w:style>
-  <w:style w:type="character" w:customStyle="1" w:styleId="QuoteChar">
+  <w:style w:type="character" w:styleId="QuoteChar" w:customStyle="1">
     <w:name w:val="Quote Char"/>
     <w:basedOn w:val="DefaultParagraphFont"/>
     <w:link w:val="Quote"/>
@@ -3125,8 +3149,8 @@
     <w:rsid w:val="00D3067B"/>
     <w:pPr>
       <w:pBdr>
-        <w:top w:val="single" w:sz="4" w:space="10" w:color="0F4761" w:themeColor="accent1" w:themeShade="BF"/>
-        <w:bottom w:val="single" w:sz="4" w:space="10" w:color="0F4761" w:themeColor="accent1" w:themeShade="BF"/>
+        <w:top w:val="single" w:color="0F4761" w:themeColor="accent1" w:themeShade="BF" w:sz="4" w:space="10"/>
+        <w:bottom w:val="single" w:color="0F4761" w:themeColor="accent1" w:themeShade="BF" w:sz="4" w:space="10"/>
       </w:pBdr>
       <w:spacing w:before="360" w:after="360"/>
       <w:ind w:left="864" w:right="864"/>
@@ -3138,7 +3162,7 @@
       <w:color w:val="0F4761" w:themeColor="accent1" w:themeShade="BF"/>
     </w:rPr>
   </w:style>
-  <w:style w:type="character" w:customStyle="1" w:styleId="IntenseQuoteChar">
+  <w:style w:type="character" w:styleId="IntenseQuoteChar" w:customStyle="1">
     <w:name w:val="Intense Quote Char"/>
     <w:basedOn w:val="DefaultParagraphFont"/>
     <w:link w:val="IntenseQuote"/>
@@ -3168,7 +3192,7 @@
 </file>
 
 <file path=word/theme/theme1.xml><?xml version="1.0" encoding="utf-8"?>
-<a:theme xmlns:a="http://schemas.openxmlformats.org/drawingml/2006/main" name="Office Theme">
+<a:theme xmlns:a="http://schemas.openxmlformats.org/drawingml/2006/main" xmlns:thm15="http://schemas.microsoft.com/office/thememl/2012/main" name="Office Theme">
   <a:themeElements>
     <a:clrScheme name="Office">
       <a:dk1>

</xml_diff>

<commit_message>
working on the DV insert
</commit_message>
<xml_diff>
--- a/Instructions.docx
+++ b/Instructions.docx
@@ -42,15 +42,8 @@
           <w:lang w:val="en-US"/>
         </w:rPr>
         <w:tab/>
-      </w:r>
-      <w:proofErr w:type="spellStart"/>
-      <w:r>
-        <w:rPr>
-          <w:lang w:val="en-US"/>
-        </w:rPr>
         <w:t>StereoPylot</w:t>
       </w:r>
-      <w:proofErr w:type="spellEnd"/>
       <w:r>
         <w:rPr>
           <w:lang w:val="en-US"/>
@@ -112,21 +105,7 @@
         <w:rPr>
           <w:lang w:val="en-US"/>
         </w:rPr>
-        <w:t xml:space="preserve">Full retract – moves all 3 </w:t>
-      </w:r>
-      <w:proofErr w:type="gramStart"/>
-      <w:r>
-        <w:rPr>
-          <w:lang w:val="en-US"/>
-        </w:rPr>
-        <w:t>axis</w:t>
-      </w:r>
-      <w:proofErr w:type="gramEnd"/>
-      <w:r>
-        <w:rPr>
-          <w:lang w:val="en-US"/>
-        </w:rPr>
-        <w:t xml:space="preserve"> away from working area</w:t>
+        <w:t>Full retract – moves all 3 axis away from working area</w:t>
       </w:r>
     </w:p>
     <w:p>
@@ -145,21 +124,7 @@
         <w:rPr>
           <w:lang w:val="en-US"/>
         </w:rPr>
-        <w:t xml:space="preserve">ABS Zero – moves all 3 </w:t>
-      </w:r>
-      <w:proofErr w:type="gramStart"/>
-      <w:r>
-        <w:rPr>
-          <w:lang w:val="en-US"/>
-        </w:rPr>
-        <w:t>axis</w:t>
-      </w:r>
-      <w:proofErr w:type="gramEnd"/>
-      <w:r>
-        <w:rPr>
-          <w:lang w:val="en-US"/>
-        </w:rPr>
-        <w:t xml:space="preserve"> to towards the limit switch to </w:t>
+        <w:t xml:space="preserve">ABS Zero – moves all 3 axis to towards the limit switch to </w:t>
       </w:r>
       <w:r>
         <w:rPr>
@@ -180,33 +145,11 @@
           <w:lang w:val="en-US"/>
         </w:rPr>
       </w:pPr>
-      <w:proofErr w:type="spellStart"/>
-      <w:r>
-        <w:rPr>
-          <w:lang w:val="en-US"/>
-        </w:rPr>
-        <w:t>Rel.Zero</w:t>
-      </w:r>
-      <w:proofErr w:type="spellEnd"/>
-      <w:r>
-        <w:rPr>
-          <w:lang w:val="en-US"/>
-        </w:rPr>
-        <w:t xml:space="preserve"> (DV </w:t>
-      </w:r>
-      <w:proofErr w:type="spellStart"/>
-      <w:r>
-        <w:rPr>
-          <w:lang w:val="en-US"/>
-        </w:rPr>
-        <w:t>ABSzero</w:t>
-      </w:r>
-      <w:proofErr w:type="spellEnd"/>
-      <w:r>
-        <w:rPr>
-          <w:lang w:val="en-US"/>
-        </w:rPr>
-        <w:t>) – moves to relative zero with DV moving all the way up to ABS zero</w:t>
+      <w:r>
+        <w:rPr>
+          <w:lang w:val="en-US"/>
+        </w:rPr>
+        <w:t>Rel.Zero (DV ABSzero) – moves to relative zero with DV moving all the way up to ABS zero</w:t>
       </w:r>
     </w:p>
     <w:p>
@@ -221,19 +164,11 @@
           <w:lang w:val="en-US"/>
         </w:rPr>
       </w:pPr>
-      <w:proofErr w:type="spellStart"/>
-      <w:r>
-        <w:rPr>
-          <w:lang w:val="en-US"/>
-        </w:rPr>
-        <w:t>Rel.Zero</w:t>
-      </w:r>
-      <w:proofErr w:type="spellEnd"/>
-      <w:r>
-        <w:rPr>
-          <w:lang w:val="en-US"/>
-        </w:rPr>
-        <w:t xml:space="preserve"> (DV up 5mm) – moves to relative zero with DV moving up 5mm</w:t>
+      <w:r>
+        <w:rPr>
+          <w:lang w:val="en-US"/>
+        </w:rPr>
+        <w:t>Rel.Zero (DV up 5mm) – moves to relative zero with DV moving up 5mm</w:t>
       </w:r>
     </w:p>
     <w:p>
@@ -333,21 +268,7 @@
         <w:rPr>
           <w:lang w:val="en-US"/>
         </w:rPr>
-        <w:t xml:space="preserve">Return AP – </w:t>
-      </w:r>
-      <w:proofErr w:type="gramStart"/>
-      <w:r>
-        <w:rPr>
-          <w:lang w:val="en-US"/>
-        </w:rPr>
-        <w:t>as long as</w:t>
-      </w:r>
-      <w:proofErr w:type="gramEnd"/>
-      <w:r>
-        <w:rPr>
-          <w:lang w:val="en-US"/>
-        </w:rPr>
-        <w:t xml:space="preserve"> position does not move once retracted will return AP to previous location with DV up 2mm</w:t>
+        <w:t>Return AP – as long as position does not move once retracted will return AP to previous location with DV up 2mm</w:t>
       </w:r>
     </w:p>
     <w:p>
@@ -366,16 +287,8 @@
         <w:rPr>
           <w:lang w:val="en-US"/>
         </w:rPr>
-        <w:t xml:space="preserve">Retract DV – lifts DV up to </w:t>
-      </w:r>
-      <w:proofErr w:type="spellStart"/>
-      <w:r>
-        <w:rPr>
-          <w:lang w:val="en-US"/>
-        </w:rPr>
-        <w:t>ABSzero</w:t>
-      </w:r>
-      <w:proofErr w:type="spellEnd"/>
+        <w:t>Retract DV – lifts DV up to ABSzero</w:t>
+      </w:r>
     </w:p>
     <w:p>
       <w:pPr>
@@ -393,21 +306,7 @@
         <w:rPr>
           <w:lang w:val="en-US"/>
         </w:rPr>
-        <w:t xml:space="preserve">Return DV – </w:t>
-      </w:r>
-      <w:proofErr w:type="gramStart"/>
-      <w:r>
-        <w:rPr>
-          <w:lang w:val="en-US"/>
-        </w:rPr>
-        <w:t>as long as</w:t>
-      </w:r>
-      <w:proofErr w:type="gramEnd"/>
-      <w:r>
-        <w:rPr>
-          <w:lang w:val="en-US"/>
-        </w:rPr>
-        <w:t xml:space="preserve"> position does not move once retracted will return DV to 1.5mm up from previous location</w:t>
+        <w:t>Return DV – as long as position does not move once retracted will return DV to 1.5mm up from previous location</w:t>
       </w:r>
     </w:p>
     <w:p>
@@ -418,14 +317,12 @@
           <w:lang w:val="en-US"/>
         </w:rPr>
       </w:pPr>
-      <w:proofErr w:type="spellStart"/>
       <w:r>
         <w:rPr>
           <w:lang w:val="en-US"/>
         </w:rPr>
         <w:t>StereoPylot</w:t>
       </w:r>
-      <w:proofErr w:type="spellEnd"/>
     </w:p>
     <w:p>
       <w:pPr>
@@ -481,21 +378,7 @@
         <w:rPr>
           <w:lang w:val="en-US"/>
         </w:rPr>
-        <w:t xml:space="preserve">Full retract – moves all 3 </w:t>
-      </w:r>
-      <w:proofErr w:type="gramStart"/>
-      <w:r>
-        <w:rPr>
-          <w:lang w:val="en-US"/>
-        </w:rPr>
-        <w:t>axis</w:t>
-      </w:r>
-      <w:proofErr w:type="gramEnd"/>
-      <w:r>
-        <w:rPr>
-          <w:lang w:val="en-US"/>
-        </w:rPr>
-        <w:t xml:space="preserve"> away from working area</w:t>
+        <w:t>Full retract – moves all 3 axis away from working area</w:t>
       </w:r>
     </w:p>
     <w:p>
@@ -558,19 +441,11 @@
           <w:lang w:val="en-US"/>
         </w:rPr>
       </w:pPr>
-      <w:proofErr w:type="spellStart"/>
-      <w:r>
-        <w:rPr>
-          <w:lang w:val="en-US"/>
-        </w:rPr>
-        <w:t>StereoPylot</w:t>
-      </w:r>
-      <w:proofErr w:type="spellEnd"/>
-      <w:r>
-        <w:rPr>
-          <w:lang w:val="en-US"/>
-        </w:rPr>
-        <w:t xml:space="preserve"> SR</w:t>
+      <w:r>
+        <w:rPr>
+          <w:lang w:val="en-US"/>
+        </w:rPr>
+        <w:t>StereoPylot SR</w:t>
       </w:r>
     </w:p>
     <w:p>
@@ -604,19 +479,11 @@
           <w:lang w:val="en-US"/>
         </w:rPr>
       </w:pPr>
-      <w:proofErr w:type="gramStart"/>
-      <w:r>
-        <w:rPr>
-          <w:lang w:val="en-US"/>
-        </w:rPr>
-        <w:t>null</w:t>
-      </w:r>
-      <w:proofErr w:type="gramEnd"/>
-      <w:r>
-        <w:rPr>
-          <w:lang w:val="en-US"/>
-        </w:rPr>
-        <w:t xml:space="preserve"> will move DV up 1.5mm if Lambda movement is started</w:t>
+      <w:r>
+        <w:rPr>
+          <w:lang w:val="en-US"/>
+        </w:rPr>
+        <w:t>null will move DV up 1.5mm if Lambda movement is started</w:t>
       </w:r>
     </w:p>
     <w:p>
@@ -631,15 +498,8 @@
           <w:lang w:val="en-US"/>
         </w:rPr>
         <w:tab/>
-      </w:r>
-      <w:proofErr w:type="spellStart"/>
-      <w:r>
-        <w:rPr>
-          <w:lang w:val="en-US"/>
-        </w:rPr>
         <w:t>StereoPylot</w:t>
       </w:r>
-      <w:proofErr w:type="spellEnd"/>
     </w:p>
     <w:p>
       <w:pPr>
@@ -657,25 +517,13 @@
         <w:rPr>
           <w:lang w:val="en-US"/>
         </w:rPr>
-        <w:t>Disen</w:t>
-      </w:r>
-      <w:r>
-        <w:rPr>
-          <w:lang w:val="en-US"/>
-        </w:rPr>
-        <w:t>gage</w:t>
-      </w:r>
-      <w:r>
-        <w:rPr>
-          <w:lang w:val="en-US"/>
-        </w:rPr>
-        <w:t xml:space="preserve"> safe</w:t>
-      </w:r>
-      <w:r>
-        <w:rPr>
-          <w:lang w:val="en-US"/>
-        </w:rPr>
-        <w:t>ty and press Species Select to switch between Mouse and Rat</w:t>
+        <w:t>Disengage</w:t>
+      </w:r>
+      <w:r>
+        <w:rPr>
+          <w:lang w:val="en-US"/>
+        </w:rPr>
+        <w:t xml:space="preserve"> safety and press Species Select to switch between Mouse and Rat</w:t>
       </w:r>
     </w:p>
     <w:p>
@@ -726,46 +574,92 @@
           <w:lang w:val="en-US"/>
         </w:rPr>
       </w:pPr>
-      <w:proofErr w:type="spellStart"/>
+      <w:r>
+        <w:rPr>
+          <w:lang w:val="en-US"/>
+        </w:rPr>
+        <w:t>StereoPylot SR</w:t>
+      </w:r>
+    </w:p>
+    <w:p>
+      <w:pPr>
+        <w:pStyle w:val="ListParagraph"/>
+        <w:numPr>
+          <w:ilvl w:val="0"/>
+          <w:numId w:val="5"/>
+        </w:numPr>
+        <w:spacing w:line="240" w:lineRule="auto"/>
+        <w:rPr>
+          <w:lang w:val="en-US"/>
+        </w:rPr>
+      </w:pPr>
+      <w:r>
+        <w:rPr>
+          <w:lang w:val="en-US"/>
+        </w:rPr>
+        <w:lastRenderedPageBreak/>
+        <w:t>Move the toggle switch to the desired offset</w:t>
+      </w:r>
+    </w:p>
+    <w:p>
+      <w:pPr>
+        <w:pStyle w:val="ListParagraph"/>
+        <w:numPr>
+          <w:ilvl w:val="0"/>
+          <w:numId w:val="5"/>
+        </w:numPr>
+        <w:spacing w:line="240" w:lineRule="auto"/>
+        <w:rPr>
+          <w:lang w:val="en-US"/>
+        </w:rPr>
+      </w:pPr>
+      <w:r>
+        <w:rPr>
+          <w:lang w:val="en-US"/>
+        </w:rPr>
+        <w:t>Disengage safety</w:t>
+      </w:r>
+    </w:p>
+    <w:p>
+      <w:pPr>
+        <w:pStyle w:val="ListParagraph"/>
+        <w:numPr>
+          <w:ilvl w:val="0"/>
+          <w:numId w:val="5"/>
+        </w:numPr>
+        <w:spacing w:line="240" w:lineRule="auto"/>
+        <w:rPr>
+          <w:lang w:val="en-US"/>
+        </w:rPr>
+      </w:pPr>
+      <w:r>
+        <w:rPr>
+          <w:lang w:val="en-US"/>
+        </w:rPr>
+        <w:t>Press Pre-set position button</w:t>
+      </w:r>
+    </w:p>
+    <w:p>
+      <w:pPr>
+        <w:spacing w:line="240" w:lineRule="auto"/>
+        <w:ind w:firstLine="720"/>
+        <w:rPr>
+          <w:lang w:val="en-US"/>
+        </w:rPr>
+      </w:pPr>
       <w:r>
         <w:rPr>
           <w:lang w:val="en-US"/>
         </w:rPr>
         <w:t>StereoPylot</w:t>
       </w:r>
-      <w:proofErr w:type="spellEnd"/>
-      <w:r>
-        <w:rPr>
-          <w:lang w:val="en-US"/>
-        </w:rPr>
-        <w:t xml:space="preserve"> SR</w:t>
-      </w:r>
-    </w:p>
-    <w:p>
-      <w:pPr>
-        <w:pStyle w:val="ListParagraph"/>
-        <w:numPr>
-          <w:ilvl w:val="0"/>
-          <w:numId w:val="5"/>
-        </w:numPr>
-        <w:spacing w:line="240" w:lineRule="auto"/>
-        <w:rPr>
-          <w:lang w:val="en-US"/>
-        </w:rPr>
-      </w:pPr>
-      <w:r>
-        <w:rPr>
-          <w:lang w:val="en-US"/>
-        </w:rPr>
-        <w:t>Move the toggle switch to the desired offset</w:t>
-      </w:r>
-    </w:p>
-    <w:p>
-      <w:pPr>
-        <w:pStyle w:val="ListParagraph"/>
-        <w:numPr>
-          <w:ilvl w:val="0"/>
-          <w:numId w:val="5"/>
+    </w:p>
+    <w:p>
+      <w:pPr>
+        <w:pStyle w:val="ListParagraph"/>
+        <w:numPr>
+          <w:ilvl w:val="0"/>
+          <w:numId w:val="4"/>
         </w:numPr>
         <w:spacing w:line="240" w:lineRule="auto"/>
         <w:rPr>
@@ -784,42 +678,6 @@
         <w:pStyle w:val="ListParagraph"/>
         <w:numPr>
           <w:ilvl w:val="0"/>
-          <w:numId w:val="5"/>
-        </w:numPr>
-        <w:spacing w:line="240" w:lineRule="auto"/>
-        <w:rPr>
-          <w:lang w:val="en-US"/>
-        </w:rPr>
-      </w:pPr>
-      <w:r>
-        <w:rPr>
-          <w:lang w:val="en-US"/>
-        </w:rPr>
-        <w:t>Press Pre-set position button</w:t>
-      </w:r>
-    </w:p>
-    <w:p>
-      <w:pPr>
-        <w:spacing w:line="240" w:lineRule="auto"/>
-        <w:ind w:firstLine="720"/>
-        <w:rPr>
-          <w:lang w:val="en-US"/>
-        </w:rPr>
-      </w:pPr>
-      <w:proofErr w:type="spellStart"/>
-      <w:r>
-        <w:rPr>
-          <w:lang w:val="en-US"/>
-        </w:rPr>
-        <w:t>StereoPylot</w:t>
-      </w:r>
-      <w:proofErr w:type="spellEnd"/>
-    </w:p>
-    <w:p>
-      <w:pPr>
-        <w:pStyle w:val="ListParagraph"/>
-        <w:numPr>
-          <w:ilvl w:val="0"/>
           <w:numId w:val="4"/>
         </w:numPr>
         <w:spacing w:line="240" w:lineRule="auto"/>
@@ -831,6 +689,193 @@
         <w:rPr>
           <w:lang w:val="en-US"/>
         </w:rPr>
+        <w:t>Select the offset</w:t>
+      </w:r>
+    </w:p>
+    <w:p>
+      <w:pPr>
+        <w:spacing w:line="240" w:lineRule="auto"/>
+        <w:rPr>
+          <w:lang w:val="en-US"/>
+        </w:rPr>
+      </w:pPr>
+      <w:r>
+        <w:rPr>
+          <w:lang w:val="en-US"/>
+        </w:rPr>
+        <w:t>Speed</w:t>
+      </w:r>
+    </w:p>
+    <w:p>
+      <w:pPr>
+        <w:spacing w:line="240" w:lineRule="auto"/>
+        <w:rPr>
+          <w:lang w:val="en-US"/>
+        </w:rPr>
+      </w:pPr>
+      <w:r>
+        <w:rPr>
+          <w:lang w:val="en-US"/>
+        </w:rPr>
+        <w:tab/>
+        <w:t>Use the toggle to select the speed, no other buttons required.</w:t>
+      </w:r>
+    </w:p>
+    <w:p>
+      <w:pPr>
+        <w:spacing w:line="240" w:lineRule="auto"/>
+        <w:rPr>
+          <w:lang w:val="en-US"/>
+        </w:rPr>
+      </w:pPr>
+    </w:p>
+    <w:p>
+      <w:pPr>
+        <w:spacing w:line="240" w:lineRule="auto"/>
+        <w:rPr>
+          <w:lang w:val="en-US"/>
+        </w:rPr>
+      </w:pPr>
+      <w:r>
+        <w:rPr>
+          <w:lang w:val="en-US"/>
+        </w:rPr>
+        <w:t>Automated Movements:</w:t>
+      </w:r>
+    </w:p>
+    <w:p>
+      <w:pPr>
+        <w:spacing w:line="240" w:lineRule="auto"/>
+        <w:rPr>
+          <w:lang w:val="en-US"/>
+        </w:rPr>
+      </w:pPr>
+      <w:r>
+        <w:rPr>
+          <w:lang w:val="en-US"/>
+        </w:rPr>
+        <w:tab/>
+        <w:t>StereoPylot SR</w:t>
+      </w:r>
+    </w:p>
+    <w:p>
+      <w:pPr>
+        <w:spacing w:line="240" w:lineRule="auto"/>
+        <w:rPr>
+          <w:lang w:val="en-US"/>
+        </w:rPr>
+      </w:pPr>
+      <w:r>
+        <w:rPr>
+          <w:lang w:val="en-US"/>
+        </w:rPr>
+        <w:tab/>
+      </w:r>
+      <w:r>
+        <w:rPr>
+          <w:lang w:val="en-US"/>
+        </w:rPr>
+        <w:tab/>
+        <w:t xml:space="preserve">3 methods of automated movement </w:t>
+      </w:r>
+    </w:p>
+    <w:p>
+      <w:pPr>
+        <w:pStyle w:val="ListParagraph"/>
+        <w:numPr>
+          <w:ilvl w:val="0"/>
+          <w:numId w:val="6"/>
+        </w:numPr>
+        <w:spacing w:line="240" w:lineRule="auto"/>
+        <w:rPr>
+          <w:lang w:val="en-US"/>
+        </w:rPr>
+      </w:pPr>
+      <w:r>
+        <w:rPr>
+          <w:lang w:val="en-US"/>
+        </w:rPr>
+        <w:t>MakeI</w:t>
+      </w:r>
+      <w:r>
+        <w:rPr>
+          <w:lang w:val="en-US"/>
+        </w:rPr>
+        <w:t>t</w:t>
+      </w:r>
+      <w:r>
+        <w:rPr>
+          <w:lang w:val="en-US"/>
+        </w:rPr>
+        <w:t xml:space="preserve">So - </w:t>
+      </w:r>
+      <w:r>
+        <w:rPr>
+          <w:lang w:val="en-US"/>
+        </w:rPr>
+        <w:t xml:space="preserve">Move to X,Y, and Z via </w:t>
+      </w:r>
+      <w:r>
+        <w:rPr>
+          <w:lang w:val="en-US"/>
+        </w:rPr>
+        <w:t>manual entry or from list.</w:t>
+      </w:r>
+    </w:p>
+    <w:p>
+      <w:pPr>
+        <w:pStyle w:val="ListParagraph"/>
+        <w:numPr>
+          <w:ilvl w:val="0"/>
+          <w:numId w:val="6"/>
+        </w:numPr>
+        <w:spacing w:line="240" w:lineRule="auto"/>
+        <w:rPr>
+          <w:lang w:val="en-US"/>
+        </w:rPr>
+      </w:pPr>
+      <w:r>
+        <w:rPr>
+          <w:lang w:val="en-US"/>
+        </w:rPr>
+        <w:t>DV insert – Move to DV depth from entry from list</w:t>
+      </w:r>
+    </w:p>
+    <w:p>
+      <w:pPr>
+        <w:pStyle w:val="ListParagraph"/>
+        <w:numPr>
+          <w:ilvl w:val="0"/>
+          <w:numId w:val="6"/>
+        </w:numPr>
+        <w:spacing w:line="240" w:lineRule="auto"/>
+        <w:rPr>
+          <w:lang w:val="en-US"/>
+        </w:rPr>
+      </w:pPr>
+      <w:r>
+        <w:rPr>
+          <w:lang w:val="en-US"/>
+        </w:rPr>
+        <w:t>Withdrawl – Withdraw based on parameters from list</w:t>
+      </w:r>
+    </w:p>
+    <w:p>
+      <w:pPr>
+        <w:pStyle w:val="ListParagraph"/>
+        <w:numPr>
+          <w:ilvl w:val="0"/>
+          <w:numId w:val="4"/>
+        </w:numPr>
+        <w:spacing w:line="240" w:lineRule="auto"/>
+        <w:rPr>
+          <w:lang w:val="en-US"/>
+        </w:rPr>
+      </w:pPr>
+      <w:r>
+        <w:rPr>
+          <w:lang w:val="en-US"/>
+        </w:rPr>
         <w:t>Disengage safety</w:t>
       </w:r>
     </w:p>
@@ -850,228 +895,7 @@
         <w:rPr>
           <w:lang w:val="en-US"/>
         </w:rPr>
-        <w:t>Select the offset</w:t>
-      </w:r>
-    </w:p>
-    <w:p>
-      <w:pPr>
-        <w:spacing w:line="240" w:lineRule="auto"/>
-        <w:rPr>
-          <w:lang w:val="en-US"/>
-        </w:rPr>
-      </w:pPr>
-      <w:r>
-        <w:rPr>
-          <w:lang w:val="en-US"/>
-        </w:rPr>
-        <w:t>Speed</w:t>
-      </w:r>
-    </w:p>
-    <w:p>
-      <w:pPr>
-        <w:spacing w:line="240" w:lineRule="auto"/>
-        <w:rPr>
-          <w:lang w:val="en-US"/>
-        </w:rPr>
-      </w:pPr>
-      <w:r>
-        <w:rPr>
-          <w:lang w:val="en-US"/>
-        </w:rPr>
-        <w:tab/>
-      </w:r>
-      <w:r>
-        <w:rPr>
-          <w:lang w:val="en-US"/>
-        </w:rPr>
-        <w:t xml:space="preserve">Use the toggle to select the speed, no other buttons </w:t>
-      </w:r>
-      <w:proofErr w:type="gramStart"/>
-      <w:r>
-        <w:rPr>
-          <w:lang w:val="en-US"/>
-        </w:rPr>
-        <w:t>required</w:t>
-      </w:r>
-      <w:proofErr w:type="gramEnd"/>
-      <w:r>
-        <w:rPr>
-          <w:lang w:val="en-US"/>
-        </w:rPr>
-        <w:t>.</w:t>
-      </w:r>
-    </w:p>
-    <w:p>
-      <w:pPr>
-        <w:spacing w:line="240" w:lineRule="auto"/>
-        <w:rPr>
-          <w:lang w:val="en-US"/>
-        </w:rPr>
-      </w:pPr>
-    </w:p>
-    <w:p>
-      <w:pPr>
-        <w:spacing w:line="240" w:lineRule="auto"/>
-        <w:rPr>
-          <w:lang w:val="en-US"/>
-        </w:rPr>
-      </w:pPr>
-      <w:r>
-        <w:rPr>
-          <w:lang w:val="en-US"/>
-        </w:rPr>
-        <w:t>Automated Movements:</w:t>
-      </w:r>
-    </w:p>
-    <w:p>
-      <w:pPr>
-        <w:spacing w:line="240" w:lineRule="auto"/>
-        <w:rPr>
-          <w:lang w:val="en-US"/>
-        </w:rPr>
-      </w:pPr>
-      <w:r>
-        <w:rPr>
-          <w:lang w:val="en-US"/>
-        </w:rPr>
-        <w:tab/>
-      </w:r>
-      <w:proofErr w:type="spellStart"/>
-      <w:r>
-        <w:rPr>
-          <w:lang w:val="en-US"/>
-        </w:rPr>
-        <w:t>StereoPylot</w:t>
-      </w:r>
-      <w:proofErr w:type="spellEnd"/>
-      <w:r>
-        <w:rPr>
-          <w:lang w:val="en-US"/>
-        </w:rPr>
-        <w:t xml:space="preserve"> SR</w:t>
-      </w:r>
-    </w:p>
-    <w:p>
-      <w:pPr>
-        <w:spacing w:line="240" w:lineRule="auto"/>
-        <w:rPr>
-          <w:lang w:val="en-US"/>
-        </w:rPr>
-      </w:pPr>
-      <w:r>
-        <w:rPr>
-          <w:lang w:val="en-US"/>
-        </w:rPr>
-        <w:tab/>
-      </w:r>
-      <w:r>
-        <w:rPr>
-          <w:lang w:val="en-US"/>
-        </w:rPr>
-        <w:tab/>
-      </w:r>
-      <w:r>
-        <w:rPr>
-          <w:lang w:val="en-US"/>
-        </w:rPr>
-        <w:t xml:space="preserve">3 methods of automated movement </w:t>
-      </w:r>
-    </w:p>
-    <w:p>
-      <w:pPr>
-        <w:pStyle w:val="ListParagraph"/>
-        <w:numPr>
-          <w:ilvl w:val="0"/>
-          <w:numId w:val="6"/>
-        </w:numPr>
-        <w:spacing w:line="240" w:lineRule="auto"/>
-        <w:rPr>
-          <w:lang w:val="en-US"/>
-        </w:rPr>
-      </w:pPr>
-      <w:proofErr w:type="spellStart"/>
-      <w:r>
-        <w:rPr>
-          <w:lang w:val="en-US"/>
-        </w:rPr>
-        <w:t>MakeI</w:t>
-      </w:r>
-      <w:r>
-        <w:rPr>
-          <w:lang w:val="en-US"/>
-        </w:rPr>
-        <w:t>t</w:t>
-      </w:r>
-      <w:r>
-        <w:rPr>
-          <w:lang w:val="en-US"/>
-        </w:rPr>
-        <w:t>So</w:t>
-      </w:r>
-      <w:proofErr w:type="spellEnd"/>
-      <w:r>
-        <w:rPr>
-          <w:lang w:val="en-US"/>
-        </w:rPr>
-        <w:t xml:space="preserve"> - </w:t>
-      </w:r>
-      <w:r>
-        <w:rPr>
-          <w:lang w:val="en-US"/>
-        </w:rPr>
-        <w:t xml:space="preserve">Move to X,Y, and Z via </w:t>
-      </w:r>
-      <w:r>
-        <w:rPr>
-          <w:lang w:val="en-US"/>
-        </w:rPr>
-        <w:t>manual entry or from list.</w:t>
-      </w:r>
-    </w:p>
-    <w:p>
-      <w:pPr>
-        <w:pStyle w:val="ListParagraph"/>
-        <w:numPr>
-          <w:ilvl w:val="0"/>
-          <w:numId w:val="6"/>
-        </w:numPr>
-        <w:spacing w:line="240" w:lineRule="auto"/>
-        <w:rPr>
-          <w:lang w:val="en-US"/>
-        </w:rPr>
-      </w:pPr>
-      <w:r>
-        <w:rPr>
-          <w:lang w:val="en-US"/>
-        </w:rPr>
-        <w:t>DV insert – Move to DV depth from entry from list</w:t>
-      </w:r>
-    </w:p>
-    <w:p>
-      <w:pPr>
-        <w:pStyle w:val="ListParagraph"/>
-        <w:numPr>
-          <w:ilvl w:val="0"/>
-          <w:numId w:val="6"/>
-        </w:numPr>
-        <w:spacing w:line="240" w:lineRule="auto"/>
-        <w:rPr>
-          <w:lang w:val="en-US"/>
-        </w:rPr>
-      </w:pPr>
-      <w:proofErr w:type="spellStart"/>
-      <w:r>
-        <w:rPr>
-          <w:lang w:val="en-US"/>
-        </w:rPr>
-        <w:t>Withdrawl</w:t>
-      </w:r>
-      <w:proofErr w:type="spellEnd"/>
-      <w:r>
-        <w:rPr>
-          <w:lang w:val="en-US"/>
-        </w:rPr>
-        <w:t xml:space="preserve"> – Withdraw based on parameters from list</w:t>
+        <w:t>Select desired movement (MakeItSo, DV insert, Withdraw) within 4 seconds</w:t>
       </w:r>
     </w:p>
     <w:p>
@@ -1090,7 +914,13 @@
         <w:rPr>
           <w:lang w:val="en-US"/>
         </w:rPr>
-        <w:t>Disengage safety</w:t>
+        <w:t>Press Engage within 4 seconds of selecting the movement</w:t>
+      </w:r>
+      <w:r>
+        <w:rPr>
+          <w:lang w:val="en-US"/>
+        </w:rPr>
+        <w:t xml:space="preserve"> selection</w:t>
       </w:r>
     </w:p>
     <w:p>
@@ -1109,64 +939,6 @@
         <w:rPr>
           <w:lang w:val="en-US"/>
         </w:rPr>
-        <w:t>Select desired movement (</w:t>
-      </w:r>
-      <w:proofErr w:type="spellStart"/>
-      <w:r>
-        <w:rPr>
-          <w:lang w:val="en-US"/>
-        </w:rPr>
-        <w:t>MakeItSo</w:t>
-      </w:r>
-      <w:proofErr w:type="spellEnd"/>
-      <w:r>
-        <w:rPr>
-          <w:lang w:val="en-US"/>
-        </w:rPr>
-        <w:t>, DV insert, Withdraw) within 4 seconds</w:t>
-      </w:r>
-    </w:p>
-    <w:p>
-      <w:pPr>
-        <w:pStyle w:val="ListParagraph"/>
-        <w:numPr>
-          <w:ilvl w:val="0"/>
-          <w:numId w:val="4"/>
-        </w:numPr>
-        <w:spacing w:line="240" w:lineRule="auto"/>
-        <w:rPr>
-          <w:lang w:val="en-US"/>
-        </w:rPr>
-      </w:pPr>
-      <w:r>
-        <w:rPr>
-          <w:lang w:val="en-US"/>
-        </w:rPr>
-        <w:t>Press Engage within 4 seconds of selecting the movement</w:t>
-      </w:r>
-      <w:r>
-        <w:rPr>
-          <w:lang w:val="en-US"/>
-        </w:rPr>
-        <w:t xml:space="preserve"> selection</w:t>
-      </w:r>
-    </w:p>
-    <w:p>
-      <w:pPr>
-        <w:pStyle w:val="ListParagraph"/>
-        <w:numPr>
-          <w:ilvl w:val="0"/>
-          <w:numId w:val="4"/>
-        </w:numPr>
-        <w:spacing w:line="240" w:lineRule="auto"/>
-        <w:rPr>
-          <w:lang w:val="en-US"/>
-        </w:rPr>
-      </w:pPr>
-      <w:r>
-        <w:rPr>
-          <w:lang w:val="en-US"/>
-        </w:rPr>
         <w:t>T</w:t>
       </w:r>
       <w:r>
@@ -1185,16 +957,8 @@
         <w:rPr>
           <w:lang w:val="en-US"/>
         </w:rPr>
-        <w:t xml:space="preserve"> of DV insert or </w:t>
-      </w:r>
-      <w:proofErr w:type="spellStart"/>
-      <w:r>
-        <w:rPr>
-          <w:lang w:val="en-US"/>
-        </w:rPr>
-        <w:t>Withdrawl</w:t>
-      </w:r>
-      <w:proofErr w:type="spellEnd"/>
+        <w:t xml:space="preserve"> of DV insert or Withdrawl</w:t>
+      </w:r>
     </w:p>
     <w:p>
       <w:pPr>
@@ -1255,14 +1019,12 @@
           <w:lang w:val="en-US"/>
         </w:rPr>
       </w:pPr>
-      <w:proofErr w:type="spellStart"/>
       <w:r>
         <w:rPr>
           <w:lang w:val="en-US"/>
         </w:rPr>
         <w:t>StereoPylot</w:t>
       </w:r>
-      <w:proofErr w:type="spellEnd"/>
     </w:p>
     <w:p>
       <w:pPr>
@@ -1282,26 +1044,7 @@
           <w:lang w:val="en-US"/>
         </w:rPr>
         <w:tab/>
-      </w:r>
-      <w:r>
-        <w:rPr>
-          <w:lang w:val="en-US"/>
-        </w:rPr>
-        <w:t xml:space="preserve">1 </w:t>
-      </w:r>
-      <w:proofErr w:type="gramStart"/>
-      <w:r>
-        <w:rPr>
-          <w:lang w:val="en-US"/>
-        </w:rPr>
-        <w:t>methods</w:t>
-      </w:r>
-      <w:proofErr w:type="gramEnd"/>
-      <w:r>
-        <w:rPr>
-          <w:lang w:val="en-US"/>
-        </w:rPr>
-        <w:t xml:space="preserve"> of automated movement </w:t>
+        <w:t xml:space="preserve">1 method of automated movement </w:t>
       </w:r>
     </w:p>
     <w:p>
@@ -1316,33 +1059,11 @@
           <w:lang w:val="en-US"/>
         </w:rPr>
       </w:pPr>
-      <w:proofErr w:type="spellStart"/>
-      <w:r>
-        <w:rPr>
-          <w:lang w:val="en-US"/>
-        </w:rPr>
-        <w:t>MakeIsSo</w:t>
-      </w:r>
-      <w:proofErr w:type="spellEnd"/>
-      <w:r>
-        <w:rPr>
-          <w:lang w:val="en-US"/>
-        </w:rPr>
-        <w:t xml:space="preserve"> - Move to </w:t>
-      </w:r>
-      <w:proofErr w:type="gramStart"/>
-      <w:r>
-        <w:rPr>
-          <w:lang w:val="en-US"/>
-        </w:rPr>
-        <w:t>X,Y</w:t>
-      </w:r>
-      <w:proofErr w:type="gramEnd"/>
-      <w:r>
-        <w:rPr>
-          <w:lang w:val="en-US"/>
-        </w:rPr>
-        <w:t>, and Z via manual entry or from list.</w:t>
+      <w:r>
+        <w:rPr>
+          <w:lang w:val="en-US"/>
+        </w:rPr>
+        <w:t>MakeIsSo - Move to X,Y, and Z via manual entry or from list.</w:t>
       </w:r>
     </w:p>
     <w:p>
@@ -1449,7 +1170,7 @@
       </w:pPr>
     </w:p>
     <w:sectPr>
-      <w:pgSz w:w="12240" w:h="15840" w:orient="portrait"/>
+      <w:pgSz w:w="12240" w:h="15840"/>
       <w:pgMar w:top="1440" w:right="1440" w:bottom="1440" w:left="1440" w:header="708" w:footer="708" w:gutter="0"/>
       <w:cols w:space="708"/>
       <w:docGrid w:linePitch="360"/>
@@ -1472,7 +1193,7 @@
         <w:ind w:left="1080" w:hanging="360"/>
       </w:pPr>
       <w:rPr>
-        <w:rFonts w:hint="default" w:ascii="Aptos" w:hAnsi="Aptos" w:eastAsiaTheme="minorHAnsi" w:cstheme="minorBidi"/>
+        <w:rFonts w:ascii="Aptos" w:eastAsiaTheme="minorHAnsi" w:hAnsi="Aptos" w:cstheme="minorBidi" w:hint="default"/>
       </w:rPr>
     </w:lvl>
     <w:lvl w:ilvl="1" w:tplc="10090003">
@@ -1484,7 +1205,7 @@
         <w:ind w:left="1440" w:hanging="360"/>
       </w:pPr>
       <w:rPr>
-        <w:rFonts w:hint="default" w:ascii="Courier New" w:hAnsi="Courier New" w:cs="Courier New"/>
+        <w:rFonts w:ascii="Courier New" w:hAnsi="Courier New" w:cs="Courier New" w:hint="default"/>
       </w:rPr>
     </w:lvl>
     <w:lvl w:ilvl="2" w:tplc="10090005" w:tentative="1">
@@ -1496,7 +1217,7 @@
         <w:ind w:left="2160" w:hanging="360"/>
       </w:pPr>
       <w:rPr>
-        <w:rFonts w:hint="default" w:ascii="Wingdings" w:hAnsi="Wingdings"/>
+        <w:rFonts w:ascii="Wingdings" w:hAnsi="Wingdings" w:hint="default"/>
       </w:rPr>
     </w:lvl>
     <w:lvl w:ilvl="3" w:tplc="10090001" w:tentative="1">
@@ -1508,7 +1229,7 @@
         <w:ind w:left="2880" w:hanging="360"/>
       </w:pPr>
       <w:rPr>
-        <w:rFonts w:hint="default" w:ascii="Symbol" w:hAnsi="Symbol"/>
+        <w:rFonts w:ascii="Symbol" w:hAnsi="Symbol" w:hint="default"/>
       </w:rPr>
     </w:lvl>
     <w:lvl w:ilvl="4" w:tplc="10090003" w:tentative="1">
@@ -1520,7 +1241,7 @@
         <w:ind w:left="3600" w:hanging="360"/>
       </w:pPr>
       <w:rPr>
-        <w:rFonts w:hint="default" w:ascii="Courier New" w:hAnsi="Courier New" w:cs="Courier New"/>
+        <w:rFonts w:ascii="Courier New" w:hAnsi="Courier New" w:cs="Courier New" w:hint="default"/>
       </w:rPr>
     </w:lvl>
     <w:lvl w:ilvl="5" w:tplc="10090005" w:tentative="1">
@@ -1532,7 +1253,7 @@
         <w:ind w:left="4320" w:hanging="360"/>
       </w:pPr>
       <w:rPr>
-        <w:rFonts w:hint="default" w:ascii="Wingdings" w:hAnsi="Wingdings"/>
+        <w:rFonts w:ascii="Wingdings" w:hAnsi="Wingdings" w:hint="default"/>
       </w:rPr>
     </w:lvl>
     <w:lvl w:ilvl="6" w:tplc="10090001" w:tentative="1">
@@ -1544,7 +1265,7 @@
         <w:ind w:left="5040" w:hanging="360"/>
       </w:pPr>
       <w:rPr>
-        <w:rFonts w:hint="default" w:ascii="Symbol" w:hAnsi="Symbol"/>
+        <w:rFonts w:ascii="Symbol" w:hAnsi="Symbol" w:hint="default"/>
       </w:rPr>
     </w:lvl>
     <w:lvl w:ilvl="7" w:tplc="10090003" w:tentative="1">
@@ -1556,7 +1277,7 @@
         <w:ind w:left="5760" w:hanging="360"/>
       </w:pPr>
       <w:rPr>
-        <w:rFonts w:hint="default" w:ascii="Courier New" w:hAnsi="Courier New" w:cs="Courier New"/>
+        <w:rFonts w:ascii="Courier New" w:hAnsi="Courier New" w:cs="Courier New" w:hint="default"/>
       </w:rPr>
     </w:lvl>
     <w:lvl w:ilvl="8" w:tplc="10090005" w:tentative="1">
@@ -1568,7 +1289,7 @@
         <w:ind w:left="6480" w:hanging="360"/>
       </w:pPr>
       <w:rPr>
-        <w:rFonts w:hint="default" w:ascii="Wingdings" w:hAnsi="Wingdings"/>
+        <w:rFonts w:ascii="Wingdings" w:hAnsi="Wingdings" w:hint="default"/>
       </w:rPr>
     </w:lvl>
   </w:abstractNum>
@@ -1584,7 +1305,7 @@
         <w:ind w:left="1080" w:hanging="360"/>
       </w:pPr>
       <w:rPr>
-        <w:rFonts w:hint="default" w:ascii="Aptos" w:hAnsi="Aptos" w:eastAsiaTheme="minorHAnsi" w:cstheme="minorBidi"/>
+        <w:rFonts w:ascii="Aptos" w:eastAsiaTheme="minorHAnsi" w:hAnsi="Aptos" w:cstheme="minorBidi" w:hint="default"/>
       </w:rPr>
     </w:lvl>
     <w:lvl w:ilvl="1" w:tplc="10090003" w:tentative="1">
@@ -1596,7 +1317,7 @@
         <w:ind w:left="1440" w:hanging="360"/>
       </w:pPr>
       <w:rPr>
-        <w:rFonts w:hint="default" w:ascii="Courier New" w:hAnsi="Courier New" w:cs="Courier New"/>
+        <w:rFonts w:ascii="Courier New" w:hAnsi="Courier New" w:cs="Courier New" w:hint="default"/>
       </w:rPr>
     </w:lvl>
     <w:lvl w:ilvl="2" w:tplc="10090005" w:tentative="1">
@@ -1608,7 +1329,7 @@
         <w:ind w:left="2160" w:hanging="360"/>
       </w:pPr>
       <w:rPr>
-        <w:rFonts w:hint="default" w:ascii="Wingdings" w:hAnsi="Wingdings"/>
+        <w:rFonts w:ascii="Wingdings" w:hAnsi="Wingdings" w:hint="default"/>
       </w:rPr>
     </w:lvl>
     <w:lvl w:ilvl="3" w:tplc="10090001" w:tentative="1">
@@ -1620,7 +1341,7 @@
         <w:ind w:left="2880" w:hanging="360"/>
       </w:pPr>
       <w:rPr>
-        <w:rFonts w:hint="default" w:ascii="Symbol" w:hAnsi="Symbol"/>
+        <w:rFonts w:ascii="Symbol" w:hAnsi="Symbol" w:hint="default"/>
       </w:rPr>
     </w:lvl>
     <w:lvl w:ilvl="4" w:tplc="10090003" w:tentative="1">
@@ -1632,7 +1353,7 @@
         <w:ind w:left="3600" w:hanging="360"/>
       </w:pPr>
       <w:rPr>
-        <w:rFonts w:hint="default" w:ascii="Courier New" w:hAnsi="Courier New" w:cs="Courier New"/>
+        <w:rFonts w:ascii="Courier New" w:hAnsi="Courier New" w:cs="Courier New" w:hint="default"/>
       </w:rPr>
     </w:lvl>
     <w:lvl w:ilvl="5" w:tplc="10090005" w:tentative="1">
@@ -1644,7 +1365,7 @@
         <w:ind w:left="4320" w:hanging="360"/>
       </w:pPr>
       <w:rPr>
-        <w:rFonts w:hint="default" w:ascii="Wingdings" w:hAnsi="Wingdings"/>
+        <w:rFonts w:ascii="Wingdings" w:hAnsi="Wingdings" w:hint="default"/>
       </w:rPr>
     </w:lvl>
     <w:lvl w:ilvl="6" w:tplc="10090001" w:tentative="1">
@@ -1656,7 +1377,7 @@
         <w:ind w:left="5040" w:hanging="360"/>
       </w:pPr>
       <w:rPr>
-        <w:rFonts w:hint="default" w:ascii="Symbol" w:hAnsi="Symbol"/>
+        <w:rFonts w:ascii="Symbol" w:hAnsi="Symbol" w:hint="default"/>
       </w:rPr>
     </w:lvl>
     <w:lvl w:ilvl="7" w:tplc="10090003" w:tentative="1">
@@ -1668,7 +1389,7 @@
         <w:ind w:left="5760" w:hanging="360"/>
       </w:pPr>
       <w:rPr>
-        <w:rFonts w:hint="default" w:ascii="Courier New" w:hAnsi="Courier New" w:cs="Courier New"/>
+        <w:rFonts w:ascii="Courier New" w:hAnsi="Courier New" w:cs="Courier New" w:hint="default"/>
       </w:rPr>
     </w:lvl>
     <w:lvl w:ilvl="8" w:tplc="10090005" w:tentative="1">
@@ -1680,7 +1401,7 @@
         <w:ind w:left="6480" w:hanging="360"/>
       </w:pPr>
       <w:rPr>
-        <w:rFonts w:hint="default" w:ascii="Wingdings" w:hAnsi="Wingdings"/>
+        <w:rFonts w:ascii="Wingdings" w:hAnsi="Wingdings" w:hint="default"/>
       </w:rPr>
     </w:lvl>
   </w:abstractNum>
@@ -1696,7 +1417,7 @@
         <w:ind w:left="1440" w:hanging="360"/>
       </w:pPr>
       <w:rPr>
-        <w:rFonts w:hint="default" w:ascii="Aptos" w:hAnsi="Aptos" w:eastAsiaTheme="minorHAnsi" w:cstheme="minorBidi"/>
+        <w:rFonts w:ascii="Aptos" w:eastAsiaTheme="minorHAnsi" w:hAnsi="Aptos" w:cstheme="minorBidi" w:hint="default"/>
       </w:rPr>
     </w:lvl>
     <w:lvl w:ilvl="1" w:tplc="10090003" w:tentative="1">
@@ -1708,7 +1429,7 @@
         <w:ind w:left="2160" w:hanging="360"/>
       </w:pPr>
       <w:rPr>
-        <w:rFonts w:hint="default" w:ascii="Courier New" w:hAnsi="Courier New" w:cs="Courier New"/>
+        <w:rFonts w:ascii="Courier New" w:hAnsi="Courier New" w:cs="Courier New" w:hint="default"/>
       </w:rPr>
     </w:lvl>
     <w:lvl w:ilvl="2" w:tplc="10090005" w:tentative="1">
@@ -1720,7 +1441,7 @@
         <w:ind w:left="2880" w:hanging="360"/>
       </w:pPr>
       <w:rPr>
-        <w:rFonts w:hint="default" w:ascii="Wingdings" w:hAnsi="Wingdings"/>
+        <w:rFonts w:ascii="Wingdings" w:hAnsi="Wingdings" w:hint="default"/>
       </w:rPr>
     </w:lvl>
     <w:lvl w:ilvl="3" w:tplc="10090001" w:tentative="1">
@@ -1732,7 +1453,7 @@
         <w:ind w:left="3600" w:hanging="360"/>
       </w:pPr>
       <w:rPr>
-        <w:rFonts w:hint="default" w:ascii="Symbol" w:hAnsi="Symbol"/>
+        <w:rFonts w:ascii="Symbol" w:hAnsi="Symbol" w:hint="default"/>
       </w:rPr>
     </w:lvl>
     <w:lvl w:ilvl="4" w:tplc="10090003" w:tentative="1">
@@ -1744,7 +1465,7 @@
         <w:ind w:left="4320" w:hanging="360"/>
       </w:pPr>
       <w:rPr>
-        <w:rFonts w:hint="default" w:ascii="Courier New" w:hAnsi="Courier New" w:cs="Courier New"/>
+        <w:rFonts w:ascii="Courier New" w:hAnsi="Courier New" w:cs="Courier New" w:hint="default"/>
       </w:rPr>
     </w:lvl>
     <w:lvl w:ilvl="5" w:tplc="10090005" w:tentative="1">
@@ -1756,7 +1477,7 @@
         <w:ind w:left="5040" w:hanging="360"/>
       </w:pPr>
       <w:rPr>
-        <w:rFonts w:hint="default" w:ascii="Wingdings" w:hAnsi="Wingdings"/>
+        <w:rFonts w:ascii="Wingdings" w:hAnsi="Wingdings" w:hint="default"/>
       </w:rPr>
     </w:lvl>
     <w:lvl w:ilvl="6" w:tplc="10090001" w:tentative="1">
@@ -1768,7 +1489,7 @@
         <w:ind w:left="5760" w:hanging="360"/>
       </w:pPr>
       <w:rPr>
-        <w:rFonts w:hint="default" w:ascii="Symbol" w:hAnsi="Symbol"/>
+        <w:rFonts w:ascii="Symbol" w:hAnsi="Symbol" w:hint="default"/>
       </w:rPr>
     </w:lvl>
     <w:lvl w:ilvl="7" w:tplc="10090003" w:tentative="1">
@@ -1780,7 +1501,7 @@
         <w:ind w:left="6480" w:hanging="360"/>
       </w:pPr>
       <w:rPr>
-        <w:rFonts w:hint="default" w:ascii="Courier New" w:hAnsi="Courier New" w:cs="Courier New"/>
+        <w:rFonts w:ascii="Courier New" w:hAnsi="Courier New" w:cs="Courier New" w:hint="default"/>
       </w:rPr>
     </w:lvl>
     <w:lvl w:ilvl="8" w:tplc="10090005" w:tentative="1">
@@ -1792,7 +1513,7 @@
         <w:ind w:left="7200" w:hanging="360"/>
       </w:pPr>
       <w:rPr>
-        <w:rFonts w:hint="default" w:ascii="Wingdings" w:hAnsi="Wingdings"/>
+        <w:rFonts w:ascii="Wingdings" w:hAnsi="Wingdings" w:hint="default"/>
       </w:rPr>
     </w:lvl>
   </w:abstractNum>
@@ -1809,7 +1530,7 @@
         <w:ind w:left="720" w:hanging="360"/>
       </w:pPr>
       <w:rPr>
-        <w:rFonts w:hint="default" w:ascii="Symbol" w:hAnsi="Symbol"/>
+        <w:rFonts w:ascii="Symbol" w:hAnsi="Symbol" w:hint="default"/>
       </w:rPr>
     </w:lvl>
     <w:lvl w:ilvl="1" w:tplc="10090003" w:tentative="1">
@@ -1821,7 +1542,7 @@
         <w:ind w:left="1440" w:hanging="360"/>
       </w:pPr>
       <w:rPr>
-        <w:rFonts w:hint="default" w:ascii="Courier New" w:hAnsi="Courier New" w:cs="Courier New"/>
+        <w:rFonts w:ascii="Courier New" w:hAnsi="Courier New" w:cs="Courier New" w:hint="default"/>
       </w:rPr>
     </w:lvl>
     <w:lvl w:ilvl="2" w:tplc="10090005" w:tentative="1">
@@ -1833,7 +1554,7 @@
         <w:ind w:left="2160" w:hanging="360"/>
       </w:pPr>
       <w:rPr>
-        <w:rFonts w:hint="default" w:ascii="Wingdings" w:hAnsi="Wingdings"/>
+        <w:rFonts w:ascii="Wingdings" w:hAnsi="Wingdings" w:hint="default"/>
       </w:rPr>
     </w:lvl>
     <w:lvl w:ilvl="3" w:tplc="10090001" w:tentative="1">
@@ -1845,7 +1566,7 @@
         <w:ind w:left="2880" w:hanging="360"/>
       </w:pPr>
       <w:rPr>
-        <w:rFonts w:hint="default" w:ascii="Symbol" w:hAnsi="Symbol"/>
+        <w:rFonts w:ascii="Symbol" w:hAnsi="Symbol" w:hint="default"/>
       </w:rPr>
     </w:lvl>
     <w:lvl w:ilvl="4" w:tplc="10090003" w:tentative="1">
@@ -1857,7 +1578,7 @@
         <w:ind w:left="3600" w:hanging="360"/>
       </w:pPr>
       <w:rPr>
-        <w:rFonts w:hint="default" w:ascii="Courier New" w:hAnsi="Courier New" w:cs="Courier New"/>
+        <w:rFonts w:ascii="Courier New" w:hAnsi="Courier New" w:cs="Courier New" w:hint="default"/>
       </w:rPr>
     </w:lvl>
     <w:lvl w:ilvl="5" w:tplc="10090005" w:tentative="1">
@@ -1869,7 +1590,7 @@
         <w:ind w:left="4320" w:hanging="360"/>
       </w:pPr>
       <w:rPr>
-        <w:rFonts w:hint="default" w:ascii="Wingdings" w:hAnsi="Wingdings"/>
+        <w:rFonts w:ascii="Wingdings" w:hAnsi="Wingdings" w:hint="default"/>
       </w:rPr>
     </w:lvl>
     <w:lvl w:ilvl="6" w:tplc="10090001" w:tentative="1">
@@ -1881,7 +1602,7 @@
         <w:ind w:left="5040" w:hanging="360"/>
       </w:pPr>
       <w:rPr>
-        <w:rFonts w:hint="default" w:ascii="Symbol" w:hAnsi="Symbol"/>
+        <w:rFonts w:ascii="Symbol" w:hAnsi="Symbol" w:hint="default"/>
       </w:rPr>
     </w:lvl>
     <w:lvl w:ilvl="7" w:tplc="10090003" w:tentative="1">
@@ -1893,7 +1614,7 @@
         <w:ind w:left="5760" w:hanging="360"/>
       </w:pPr>
       <w:rPr>
-        <w:rFonts w:hint="default" w:ascii="Courier New" w:hAnsi="Courier New" w:cs="Courier New"/>
+        <w:rFonts w:ascii="Courier New" w:hAnsi="Courier New" w:cs="Courier New" w:hint="default"/>
       </w:rPr>
     </w:lvl>
     <w:lvl w:ilvl="8" w:tplc="10090005" w:tentative="1">
@@ -1905,7 +1626,7 @@
         <w:ind w:left="6480" w:hanging="360"/>
       </w:pPr>
       <w:rPr>
-        <w:rFonts w:hint="default" w:ascii="Wingdings" w:hAnsi="Wingdings"/>
+        <w:rFonts w:ascii="Wingdings" w:hAnsi="Wingdings" w:hint="default"/>
       </w:rPr>
     </w:lvl>
   </w:abstractNum>
@@ -1922,7 +1643,7 @@
         <w:ind w:left="2160" w:hanging="360"/>
       </w:pPr>
       <w:rPr>
-        <w:rFonts w:hint="default" w:ascii="Symbol" w:hAnsi="Symbol"/>
+        <w:rFonts w:ascii="Symbol" w:hAnsi="Symbol" w:hint="default"/>
       </w:rPr>
     </w:lvl>
     <w:lvl w:ilvl="1" w:tplc="10090003" w:tentative="1">
@@ -1934,7 +1655,7 @@
         <w:ind w:left="2880" w:hanging="360"/>
       </w:pPr>
       <w:rPr>
-        <w:rFonts w:hint="default" w:ascii="Courier New" w:hAnsi="Courier New" w:cs="Courier New"/>
+        <w:rFonts w:ascii="Courier New" w:hAnsi="Courier New" w:cs="Courier New" w:hint="default"/>
       </w:rPr>
     </w:lvl>
     <w:lvl w:ilvl="2" w:tplc="10090005" w:tentative="1">
@@ -1946,7 +1667,7 @@
         <w:ind w:left="3600" w:hanging="360"/>
       </w:pPr>
       <w:rPr>
-        <w:rFonts w:hint="default" w:ascii="Wingdings" w:hAnsi="Wingdings"/>
+        <w:rFonts w:ascii="Wingdings" w:hAnsi="Wingdings" w:hint="default"/>
       </w:rPr>
     </w:lvl>
     <w:lvl w:ilvl="3" w:tplc="10090001" w:tentative="1">
@@ -1958,7 +1679,7 @@
         <w:ind w:left="4320" w:hanging="360"/>
       </w:pPr>
       <w:rPr>
-        <w:rFonts w:hint="default" w:ascii="Symbol" w:hAnsi="Symbol"/>
+        <w:rFonts w:ascii="Symbol" w:hAnsi="Symbol" w:hint="default"/>
       </w:rPr>
     </w:lvl>
     <w:lvl w:ilvl="4" w:tplc="10090003" w:tentative="1">
@@ -1970,7 +1691,7 @@
         <w:ind w:left="5040" w:hanging="360"/>
       </w:pPr>
       <w:rPr>
-        <w:rFonts w:hint="default" w:ascii="Courier New" w:hAnsi="Courier New" w:cs="Courier New"/>
+        <w:rFonts w:ascii="Courier New" w:hAnsi="Courier New" w:cs="Courier New" w:hint="default"/>
       </w:rPr>
     </w:lvl>
     <w:lvl w:ilvl="5" w:tplc="10090005" w:tentative="1">
@@ -1982,7 +1703,7 @@
         <w:ind w:left="5760" w:hanging="360"/>
       </w:pPr>
       <w:rPr>
-        <w:rFonts w:hint="default" w:ascii="Wingdings" w:hAnsi="Wingdings"/>
+        <w:rFonts w:ascii="Wingdings" w:hAnsi="Wingdings" w:hint="default"/>
       </w:rPr>
     </w:lvl>
     <w:lvl w:ilvl="6" w:tplc="10090001" w:tentative="1">
@@ -1994,7 +1715,7 @@
         <w:ind w:left="6480" w:hanging="360"/>
       </w:pPr>
       <w:rPr>
-        <w:rFonts w:hint="default" w:ascii="Symbol" w:hAnsi="Symbol"/>
+        <w:rFonts w:ascii="Symbol" w:hAnsi="Symbol" w:hint="default"/>
       </w:rPr>
     </w:lvl>
     <w:lvl w:ilvl="7" w:tplc="10090003" w:tentative="1">
@@ -2006,7 +1727,7 @@
         <w:ind w:left="7200" w:hanging="360"/>
       </w:pPr>
       <w:rPr>
-        <w:rFonts w:hint="default" w:ascii="Courier New" w:hAnsi="Courier New" w:cs="Courier New"/>
+        <w:rFonts w:ascii="Courier New" w:hAnsi="Courier New" w:cs="Courier New" w:hint="default"/>
       </w:rPr>
     </w:lvl>
     <w:lvl w:ilvl="8" w:tplc="10090005" w:tentative="1">
@@ -2018,7 +1739,7 @@
         <w:ind w:left="7920" w:hanging="360"/>
       </w:pPr>
       <w:rPr>
-        <w:rFonts w:hint="default" w:ascii="Wingdings" w:hAnsi="Wingdings"/>
+        <w:rFonts w:ascii="Wingdings" w:hAnsi="Wingdings" w:hint="default"/>
       </w:rPr>
     </w:lvl>
   </w:abstractNum>
@@ -2034,7 +1755,7 @@
         <w:ind w:left="1080" w:hanging="360"/>
       </w:pPr>
       <w:rPr>
-        <w:rFonts w:hint="default" w:ascii="Aptos" w:hAnsi="Aptos" w:eastAsiaTheme="minorHAnsi" w:cstheme="minorBidi"/>
+        <w:rFonts w:ascii="Aptos" w:eastAsiaTheme="minorHAnsi" w:hAnsi="Aptos" w:cstheme="minorBidi" w:hint="default"/>
       </w:rPr>
     </w:lvl>
     <w:lvl w:ilvl="1" w:tplc="10090003" w:tentative="1">
@@ -2046,7 +1767,7 @@
         <w:ind w:left="1440" w:hanging="360"/>
       </w:pPr>
       <w:rPr>
-        <w:rFonts w:hint="default" w:ascii="Courier New" w:hAnsi="Courier New" w:cs="Courier New"/>
+        <w:rFonts w:ascii="Courier New" w:hAnsi="Courier New" w:cs="Courier New" w:hint="default"/>
       </w:rPr>
     </w:lvl>
     <w:lvl w:ilvl="2" w:tplc="10090005" w:tentative="1">
@@ -2058,7 +1779,7 @@
         <w:ind w:left="2160" w:hanging="360"/>
       </w:pPr>
       <w:rPr>
-        <w:rFonts w:hint="default" w:ascii="Wingdings" w:hAnsi="Wingdings"/>
+        <w:rFonts w:ascii="Wingdings" w:hAnsi="Wingdings" w:hint="default"/>
       </w:rPr>
     </w:lvl>
     <w:lvl w:ilvl="3" w:tplc="10090001" w:tentative="1">
@@ -2070,7 +1791,7 @@
         <w:ind w:left="2880" w:hanging="360"/>
       </w:pPr>
       <w:rPr>
-        <w:rFonts w:hint="default" w:ascii="Symbol" w:hAnsi="Symbol"/>
+        <w:rFonts w:ascii="Symbol" w:hAnsi="Symbol" w:hint="default"/>
       </w:rPr>
     </w:lvl>
     <w:lvl w:ilvl="4" w:tplc="10090003" w:tentative="1">
@@ -2082,7 +1803,7 @@
         <w:ind w:left="3600" w:hanging="360"/>
       </w:pPr>
       <w:rPr>
-        <w:rFonts w:hint="default" w:ascii="Courier New" w:hAnsi="Courier New" w:cs="Courier New"/>
+        <w:rFonts w:ascii="Courier New" w:hAnsi="Courier New" w:cs="Courier New" w:hint="default"/>
       </w:rPr>
     </w:lvl>
     <w:lvl w:ilvl="5" w:tplc="10090005" w:tentative="1">
@@ -2094,7 +1815,7 @@
         <w:ind w:left="4320" w:hanging="360"/>
       </w:pPr>
       <w:rPr>
-        <w:rFonts w:hint="default" w:ascii="Wingdings" w:hAnsi="Wingdings"/>
+        <w:rFonts w:ascii="Wingdings" w:hAnsi="Wingdings" w:hint="default"/>
       </w:rPr>
     </w:lvl>
     <w:lvl w:ilvl="6" w:tplc="10090001" w:tentative="1">
@@ -2106,7 +1827,7 @@
         <w:ind w:left="5040" w:hanging="360"/>
       </w:pPr>
       <w:rPr>
-        <w:rFonts w:hint="default" w:ascii="Symbol" w:hAnsi="Symbol"/>
+        <w:rFonts w:ascii="Symbol" w:hAnsi="Symbol" w:hint="default"/>
       </w:rPr>
     </w:lvl>
     <w:lvl w:ilvl="7" w:tplc="10090003" w:tentative="1">
@@ -2118,7 +1839,7 @@
         <w:ind w:left="5760" w:hanging="360"/>
       </w:pPr>
       <w:rPr>
-        <w:rFonts w:hint="default" w:ascii="Courier New" w:hAnsi="Courier New" w:cs="Courier New"/>
+        <w:rFonts w:ascii="Courier New" w:hAnsi="Courier New" w:cs="Courier New" w:hint="default"/>
       </w:rPr>
     </w:lvl>
     <w:lvl w:ilvl="8" w:tplc="10090005" w:tentative="1">
@@ -2130,7 +1851,7 @@
         <w:ind w:left="6480" w:hanging="360"/>
       </w:pPr>
       <w:rPr>
-        <w:rFonts w:hint="default" w:ascii="Wingdings" w:hAnsi="Wingdings"/>
+        <w:rFonts w:ascii="Wingdings" w:hAnsi="Wingdings" w:hint="default"/>
       </w:rPr>
     </w:lvl>
   </w:abstractNum>
@@ -2146,7 +1867,7 @@
         <w:ind w:left="1080" w:hanging="360"/>
       </w:pPr>
       <w:rPr>
-        <w:rFonts w:hint="default" w:ascii="Aptos" w:hAnsi="Aptos" w:eastAsiaTheme="minorHAnsi" w:cstheme="minorBidi"/>
+        <w:rFonts w:ascii="Aptos" w:eastAsiaTheme="minorHAnsi" w:hAnsi="Aptos" w:cstheme="minorBidi" w:hint="default"/>
       </w:rPr>
     </w:lvl>
     <w:lvl w:ilvl="1" w:tplc="10090003" w:tentative="1">
@@ -2158,7 +1879,7 @@
         <w:ind w:left="1800" w:hanging="360"/>
       </w:pPr>
       <w:rPr>
-        <w:rFonts w:hint="default" w:ascii="Courier New" w:hAnsi="Courier New" w:cs="Courier New"/>
+        <w:rFonts w:ascii="Courier New" w:hAnsi="Courier New" w:cs="Courier New" w:hint="default"/>
       </w:rPr>
     </w:lvl>
     <w:lvl w:ilvl="2" w:tplc="10090005" w:tentative="1">
@@ -2170,7 +1891,7 @@
         <w:ind w:left="2520" w:hanging="360"/>
       </w:pPr>
       <w:rPr>
-        <w:rFonts w:hint="default" w:ascii="Wingdings" w:hAnsi="Wingdings"/>
+        <w:rFonts w:ascii="Wingdings" w:hAnsi="Wingdings" w:hint="default"/>
       </w:rPr>
     </w:lvl>
     <w:lvl w:ilvl="3" w:tplc="10090001" w:tentative="1">
@@ -2182,7 +1903,7 @@
         <w:ind w:left="3240" w:hanging="360"/>
       </w:pPr>
       <w:rPr>
-        <w:rFonts w:hint="default" w:ascii="Symbol" w:hAnsi="Symbol"/>
+        <w:rFonts w:ascii="Symbol" w:hAnsi="Symbol" w:hint="default"/>
       </w:rPr>
     </w:lvl>
     <w:lvl w:ilvl="4" w:tplc="10090003" w:tentative="1">
@@ -2194,7 +1915,7 @@
         <w:ind w:left="3960" w:hanging="360"/>
       </w:pPr>
       <w:rPr>
-        <w:rFonts w:hint="default" w:ascii="Courier New" w:hAnsi="Courier New" w:cs="Courier New"/>
+        <w:rFonts w:ascii="Courier New" w:hAnsi="Courier New" w:cs="Courier New" w:hint="default"/>
       </w:rPr>
     </w:lvl>
     <w:lvl w:ilvl="5" w:tplc="10090005" w:tentative="1">
@@ -2206,7 +1927,7 @@
         <w:ind w:left="4680" w:hanging="360"/>
       </w:pPr>
       <w:rPr>
-        <w:rFonts w:hint="default" w:ascii="Wingdings" w:hAnsi="Wingdings"/>
+        <w:rFonts w:ascii="Wingdings" w:hAnsi="Wingdings" w:hint="default"/>
       </w:rPr>
     </w:lvl>
     <w:lvl w:ilvl="6" w:tplc="10090001" w:tentative="1">
@@ -2218,7 +1939,7 @@
         <w:ind w:left="5400" w:hanging="360"/>
       </w:pPr>
       <w:rPr>
-        <w:rFonts w:hint="default" w:ascii="Symbol" w:hAnsi="Symbol"/>
+        <w:rFonts w:ascii="Symbol" w:hAnsi="Symbol" w:hint="default"/>
       </w:rPr>
     </w:lvl>
     <w:lvl w:ilvl="7" w:tplc="10090003" w:tentative="1">
@@ -2230,7 +1951,7 @@
         <w:ind w:left="6120" w:hanging="360"/>
       </w:pPr>
       <w:rPr>
-        <w:rFonts w:hint="default" w:ascii="Courier New" w:hAnsi="Courier New" w:cs="Courier New"/>
+        <w:rFonts w:ascii="Courier New" w:hAnsi="Courier New" w:cs="Courier New" w:hint="default"/>
       </w:rPr>
     </w:lvl>
     <w:lvl w:ilvl="8" w:tplc="10090005" w:tentative="1">
@@ -2242,7 +1963,7 @@
         <w:ind w:left="6840" w:hanging="360"/>
       </w:pPr>
       <w:rPr>
-        <w:rFonts w:hint="default" w:ascii="Wingdings" w:hAnsi="Wingdings"/>
+        <w:rFonts w:ascii="Wingdings" w:hAnsi="Wingdings" w:hint="default"/>
       </w:rPr>
     </w:lvl>
   </w:abstractNum>
@@ -2271,11 +1992,11 @@
 </file>
 
 <file path=word/styles.xml><?xml version="1.0" encoding="utf-8"?>
-<w:styles xmlns:wp14="http://schemas.microsoft.com/office/word/2010/wordprocessingDrawing" xmlns:mc="http://schemas.openxmlformats.org/markup-compatibility/2006" xmlns:r="http://schemas.openxmlformats.org/officeDocument/2006/relationships" xmlns:w="http://schemas.openxmlformats.org/wordprocessingml/2006/main" xmlns:w14="http://schemas.microsoft.com/office/word/2010/wordml" xmlns:w15="http://schemas.microsoft.com/office/word/2012/wordml" xmlns:w16cex="http://schemas.microsoft.com/office/word/2018/wordml/cex" xmlns:w16cid="http://schemas.microsoft.com/office/word/2016/wordml/cid" xmlns:w16="http://schemas.microsoft.com/office/word/2018/wordml" xmlns:w16du="http://schemas.microsoft.com/office/word/2023/wordml/word16du" xmlns:w16sdtdh="http://schemas.microsoft.com/office/word/2020/wordml/sdtdatahash" xmlns:w16sdtfl="http://schemas.microsoft.com/office/word/2024/wordml/sdtformatlock" xmlns:w16se="http://schemas.microsoft.com/office/word/2015/wordml/symex" mc:Ignorable="w14 w15 w16se w16cid w16 w16cex w16sdtdh w16sdtfl w16du wp14">
+<w:styles xmlns:mc="http://schemas.openxmlformats.org/markup-compatibility/2006" xmlns:r="http://schemas.openxmlformats.org/officeDocument/2006/relationships" xmlns:w="http://schemas.openxmlformats.org/wordprocessingml/2006/main" xmlns:w14="http://schemas.microsoft.com/office/word/2010/wordml" xmlns:w15="http://schemas.microsoft.com/office/word/2012/wordml" xmlns:w16cex="http://schemas.microsoft.com/office/word/2018/wordml/cex" xmlns:w16cid="http://schemas.microsoft.com/office/word/2016/wordml/cid" xmlns:w16="http://schemas.microsoft.com/office/word/2018/wordml" xmlns:w16du="http://schemas.microsoft.com/office/word/2023/wordml/word16du" xmlns:w16sdtdh="http://schemas.microsoft.com/office/word/2020/wordml/sdtdatahash" xmlns:w16sdtfl="http://schemas.microsoft.com/office/word/2024/wordml/sdtformatlock" xmlns:w16se="http://schemas.microsoft.com/office/word/2015/wordml/symex" mc:Ignorable="w14 w15 w16se w16cid w16 w16cex w16sdtdh w16sdtfl w16du">
   <w:docDefaults>
     <w:rPrDefault>
       <w:rPr>
-        <w:rFonts w:asciiTheme="minorHAnsi" w:hAnsiTheme="minorHAnsi" w:eastAsiaTheme="minorHAnsi" w:cstheme="minorBidi"/>
+        <w:rFonts w:asciiTheme="minorHAnsi" w:eastAsiaTheme="minorHAnsi" w:hAnsiTheme="minorHAnsi" w:cstheme="minorBidi"/>
         <w:kern w:val="2"/>
         <w:sz w:val="24"/>
         <w:szCs w:val="24"/>
@@ -2292,14 +2013,14 @@
   <w:latentStyles w:defLockedState="0" w:defUIPriority="99" w:defSemiHidden="0" w:defUnhideWhenUsed="0" w:defQFormat="0" w:count="376">
     <w:lsdException w:name="Normal" w:uiPriority="0" w:qFormat="1"/>
     <w:lsdException w:name="heading 1" w:uiPriority="9" w:qFormat="1"/>
-    <w:lsdException w:name="heading 2" w:uiPriority="9" w:semiHidden="1" w:unhideWhenUsed="1" w:qFormat="1"/>
-    <w:lsdException w:name="heading 3" w:uiPriority="9" w:semiHidden="1" w:unhideWhenUsed="1" w:qFormat="1"/>
-    <w:lsdException w:name="heading 4" w:uiPriority="9" w:semiHidden="1" w:unhideWhenUsed="1" w:qFormat="1"/>
-    <w:lsdException w:name="heading 5" w:uiPriority="9" w:semiHidden="1" w:unhideWhenUsed="1" w:qFormat="1"/>
-    <w:lsdException w:name="heading 6" w:uiPriority="9" w:semiHidden="1" w:unhideWhenUsed="1" w:qFormat="1"/>
-    <w:lsdException w:name="heading 7" w:uiPriority="9" w:semiHidden="1" w:unhideWhenUsed="1" w:qFormat="1"/>
-    <w:lsdException w:name="heading 8" w:uiPriority="9" w:semiHidden="1" w:unhideWhenUsed="1" w:qFormat="1"/>
-    <w:lsdException w:name="heading 9" w:uiPriority="9" w:semiHidden="1" w:unhideWhenUsed="1" w:qFormat="1"/>
+    <w:lsdException w:name="heading 2" w:semiHidden="1" w:uiPriority="9" w:unhideWhenUsed="1" w:qFormat="1"/>
+    <w:lsdException w:name="heading 3" w:semiHidden="1" w:uiPriority="9" w:unhideWhenUsed="1" w:qFormat="1"/>
+    <w:lsdException w:name="heading 4" w:semiHidden="1" w:uiPriority="9" w:unhideWhenUsed="1" w:qFormat="1"/>
+    <w:lsdException w:name="heading 5" w:semiHidden="1" w:uiPriority="9" w:unhideWhenUsed="1" w:qFormat="1"/>
+    <w:lsdException w:name="heading 6" w:semiHidden="1" w:uiPriority="9" w:unhideWhenUsed="1" w:qFormat="1"/>
+    <w:lsdException w:name="heading 7" w:semiHidden="1" w:uiPriority="9" w:unhideWhenUsed="1" w:qFormat="1"/>
+    <w:lsdException w:name="heading 8" w:semiHidden="1" w:uiPriority="9" w:unhideWhenUsed="1" w:qFormat="1"/>
+    <w:lsdException w:name="heading 9" w:semiHidden="1" w:uiPriority="9" w:unhideWhenUsed="1" w:qFormat="1"/>
     <w:lsdException w:name="index 1" w:semiHidden="1" w:unhideWhenUsed="1"/>
     <w:lsdException w:name="index 2" w:semiHidden="1" w:unhideWhenUsed="1"/>
     <w:lsdException w:name="index 3" w:semiHidden="1" w:unhideWhenUsed="1"/>
@@ -2309,22 +2030,22 @@
     <w:lsdException w:name="index 7" w:semiHidden="1" w:unhideWhenUsed="1"/>
     <w:lsdException w:name="index 8" w:semiHidden="1" w:unhideWhenUsed="1"/>
     <w:lsdException w:name="index 9" w:semiHidden="1" w:unhideWhenUsed="1"/>
-    <w:lsdException w:name="toc 1" w:uiPriority="39" w:semiHidden="1" w:unhideWhenUsed="1"/>
-    <w:lsdException w:name="toc 2" w:uiPriority="39" w:semiHidden="1" w:unhideWhenUsed="1"/>
-    <w:lsdException w:name="toc 3" w:uiPriority="39" w:semiHidden="1" w:unhideWhenUsed="1"/>
-    <w:lsdException w:name="toc 4" w:uiPriority="39" w:semiHidden="1" w:unhideWhenUsed="1"/>
-    <w:lsdException w:name="toc 5" w:uiPriority="39" w:semiHidden="1" w:unhideWhenUsed="1"/>
-    <w:lsdException w:name="toc 6" w:uiPriority="39" w:semiHidden="1" w:unhideWhenUsed="1"/>
-    <w:lsdException w:name="toc 7" w:uiPriority="39" w:semiHidden="1" w:unhideWhenUsed="1"/>
-    <w:lsdException w:name="toc 8" w:uiPriority="39" w:semiHidden="1" w:unhideWhenUsed="1"/>
-    <w:lsdException w:name="toc 9" w:uiPriority="39" w:semiHidden="1" w:unhideWhenUsed="1"/>
+    <w:lsdException w:name="toc 1" w:semiHidden="1" w:uiPriority="39" w:unhideWhenUsed="1"/>
+    <w:lsdException w:name="toc 2" w:semiHidden="1" w:uiPriority="39" w:unhideWhenUsed="1"/>
+    <w:lsdException w:name="toc 3" w:semiHidden="1" w:uiPriority="39" w:unhideWhenUsed="1"/>
+    <w:lsdException w:name="toc 4" w:semiHidden="1" w:uiPriority="39" w:unhideWhenUsed="1"/>
+    <w:lsdException w:name="toc 5" w:semiHidden="1" w:uiPriority="39" w:unhideWhenUsed="1"/>
+    <w:lsdException w:name="toc 6" w:semiHidden="1" w:uiPriority="39" w:unhideWhenUsed="1"/>
+    <w:lsdException w:name="toc 7" w:semiHidden="1" w:uiPriority="39" w:unhideWhenUsed="1"/>
+    <w:lsdException w:name="toc 8" w:semiHidden="1" w:uiPriority="39" w:unhideWhenUsed="1"/>
+    <w:lsdException w:name="toc 9" w:semiHidden="1" w:uiPriority="39" w:unhideWhenUsed="1"/>
     <w:lsdException w:name="Normal Indent" w:semiHidden="1" w:unhideWhenUsed="1"/>
     <w:lsdException w:name="footnote text" w:semiHidden="1" w:unhideWhenUsed="1"/>
     <w:lsdException w:name="annotation text" w:semiHidden="1" w:unhideWhenUsed="1"/>
     <w:lsdException w:name="header" w:semiHidden="1" w:unhideWhenUsed="1"/>
     <w:lsdException w:name="footer" w:semiHidden="1" w:unhideWhenUsed="1"/>
     <w:lsdException w:name="index heading" w:semiHidden="1" w:unhideWhenUsed="1"/>
-    <w:lsdException w:name="caption" w:uiPriority="35" w:semiHidden="1" w:unhideWhenUsed="1" w:qFormat="1"/>
+    <w:lsdException w:name="caption" w:semiHidden="1" w:uiPriority="35" w:unhideWhenUsed="1" w:qFormat="1"/>
     <w:lsdException w:name="table of figures" w:semiHidden="1" w:unhideWhenUsed="1"/>
     <w:lsdException w:name="envelope address" w:semiHidden="1" w:unhideWhenUsed="1"/>
     <w:lsdException w:name="envelope return" w:semiHidden="1" w:unhideWhenUsed="1"/>
@@ -2355,7 +2076,7 @@
     <w:lsdException w:name="Title" w:uiPriority="10" w:qFormat="1"/>
     <w:lsdException w:name="Closing" w:semiHidden="1" w:unhideWhenUsed="1"/>
     <w:lsdException w:name="Signature" w:semiHidden="1" w:unhideWhenUsed="1"/>
-    <w:lsdException w:name="Default Paragraph Font" w:uiPriority="1" w:semiHidden="1" w:unhideWhenUsed="1"/>
+    <w:lsdException w:name="Default Paragraph Font" w:semiHidden="1" w:uiPriority="1" w:unhideWhenUsed="1"/>
     <w:lsdException w:name="Body Text" w:semiHidden="1" w:unhideWhenUsed="1"/>
     <w:lsdException w:name="Body Text Indent" w:semiHidden="1" w:unhideWhenUsed="1"/>
     <w:lsdException w:name="List Continue" w:semiHidden="1" w:unhideWhenUsed="1"/>
@@ -2555,8 +2276,8 @@
     <w:lsdException w:name="Subtle Reference" w:uiPriority="31" w:qFormat="1"/>
     <w:lsdException w:name="Intense Reference" w:uiPriority="32" w:qFormat="1"/>
     <w:lsdException w:name="Book Title" w:uiPriority="33" w:qFormat="1"/>
-    <w:lsdException w:name="Bibliography" w:uiPriority="37" w:semiHidden="1" w:unhideWhenUsed="1"/>
-    <w:lsdException w:name="TOC Heading" w:uiPriority="39" w:semiHidden="1" w:unhideWhenUsed="1" w:qFormat="1"/>
+    <w:lsdException w:name="Bibliography" w:semiHidden="1" w:uiPriority="37" w:unhideWhenUsed="1"/>
+    <w:lsdException w:name="TOC Heading" w:semiHidden="1" w:uiPriority="39" w:unhideWhenUsed="1" w:qFormat="1"/>
     <w:lsdException w:name="Plain Table 1" w:uiPriority="41"/>
     <w:lsdException w:name="Plain Table 2" w:uiPriority="42"/>
     <w:lsdException w:name="Plain Table 3" w:uiPriority="43"/>
@@ -2667,7 +2388,7 @@
     <w:lsdException w:name="Unresolved Mention" w:semiHidden="1" w:unhideWhenUsed="1"/>
     <w:lsdException w:name="Smart Link" w:semiHidden="1" w:unhideWhenUsed="1"/>
   </w:latentStyles>
-  <w:style w:type="paragraph" w:styleId="Normal" w:default="1">
+  <w:style w:type="paragraph" w:default="1" w:styleId="Normal">
     <w:name w:val="Normal"/>
     <w:qFormat/>
     <w:rsid w:val="009A6CF3"/>
@@ -2687,7 +2408,7 @@
       <w:outlineLvl w:val="0"/>
     </w:pPr>
     <w:rPr>
-      <w:rFonts w:asciiTheme="majorHAnsi" w:hAnsiTheme="majorHAnsi" w:eastAsiaTheme="majorEastAsia" w:cstheme="majorBidi"/>
+      <w:rFonts w:asciiTheme="majorHAnsi" w:eastAsiaTheme="majorEastAsia" w:hAnsiTheme="majorHAnsi" w:cstheme="majorBidi"/>
       <w:color w:val="0F4761" w:themeColor="accent1" w:themeShade="BF"/>
       <w:sz w:val="40"/>
       <w:szCs w:val="40"/>
@@ -2710,7 +2431,7 @@
       <w:outlineLvl w:val="1"/>
     </w:pPr>
     <w:rPr>
-      <w:rFonts w:asciiTheme="majorHAnsi" w:hAnsiTheme="majorHAnsi" w:eastAsiaTheme="majorEastAsia" w:cstheme="majorBidi"/>
+      <w:rFonts w:asciiTheme="majorHAnsi" w:eastAsiaTheme="majorEastAsia" w:hAnsiTheme="majorHAnsi" w:cstheme="majorBidi"/>
       <w:color w:val="0F4761" w:themeColor="accent1" w:themeShade="BF"/>
       <w:sz w:val="32"/>
       <w:szCs w:val="32"/>
@@ -2871,13 +2592,13 @@
       <w:color w:val="272727" w:themeColor="text1" w:themeTint="D8"/>
     </w:rPr>
   </w:style>
-  <w:style w:type="character" w:styleId="DefaultParagraphFont" w:default="1">
+  <w:style w:type="character" w:default="1" w:styleId="DefaultParagraphFont">
     <w:name w:val="Default Paragraph Font"/>
     <w:uiPriority w:val="1"/>
     <w:semiHidden/>
     <w:unhideWhenUsed/>
   </w:style>
-  <w:style w:type="table" w:styleId="TableNormal" w:default="1">
+  <w:style w:type="table" w:default="1" w:styleId="TableNormal">
     <w:name w:val="Normal Table"/>
     <w:uiPriority w:val="99"/>
     <w:semiHidden/>
@@ -2892,26 +2613,26 @@
       </w:tblCellMar>
     </w:tblPr>
   </w:style>
-  <w:style w:type="numbering" w:styleId="NoList" w:default="1">
+  <w:style w:type="numbering" w:default="1" w:styleId="NoList">
     <w:name w:val="No List"/>
     <w:uiPriority w:val="99"/>
     <w:semiHidden/>
     <w:unhideWhenUsed/>
   </w:style>
-  <w:style w:type="character" w:styleId="Heading1Char" w:customStyle="1">
+  <w:style w:type="character" w:customStyle="1" w:styleId="Heading1Char">
     <w:name w:val="Heading 1 Char"/>
     <w:basedOn w:val="DefaultParagraphFont"/>
     <w:link w:val="Heading1"/>
     <w:uiPriority w:val="9"/>
     <w:rsid w:val="00D3067B"/>
     <w:rPr>
-      <w:rFonts w:asciiTheme="majorHAnsi" w:hAnsiTheme="majorHAnsi" w:eastAsiaTheme="majorEastAsia" w:cstheme="majorBidi"/>
+      <w:rFonts w:asciiTheme="majorHAnsi" w:eastAsiaTheme="majorEastAsia" w:hAnsiTheme="majorHAnsi" w:cstheme="majorBidi"/>
       <w:color w:val="0F4761" w:themeColor="accent1" w:themeShade="BF"/>
       <w:sz w:val="40"/>
       <w:szCs w:val="40"/>
     </w:rPr>
   </w:style>
-  <w:style w:type="character" w:styleId="Heading2Char" w:customStyle="1">
+  <w:style w:type="character" w:customStyle="1" w:styleId="Heading2Char">
     <w:name w:val="Heading 2 Char"/>
     <w:basedOn w:val="DefaultParagraphFont"/>
     <w:link w:val="Heading2"/>
@@ -2919,13 +2640,13 @@
     <w:semiHidden/>
     <w:rsid w:val="00D3067B"/>
     <w:rPr>
-      <w:rFonts w:asciiTheme="majorHAnsi" w:hAnsiTheme="majorHAnsi" w:eastAsiaTheme="majorEastAsia" w:cstheme="majorBidi"/>
+      <w:rFonts w:asciiTheme="majorHAnsi" w:eastAsiaTheme="majorEastAsia" w:hAnsiTheme="majorHAnsi" w:cstheme="majorBidi"/>
       <w:color w:val="0F4761" w:themeColor="accent1" w:themeShade="BF"/>
       <w:sz w:val="32"/>
       <w:szCs w:val="32"/>
     </w:rPr>
   </w:style>
-  <w:style w:type="character" w:styleId="Heading3Char" w:customStyle="1">
+  <w:style w:type="character" w:customStyle="1" w:styleId="Heading3Char">
     <w:name w:val="Heading 3 Char"/>
     <w:basedOn w:val="DefaultParagraphFont"/>
     <w:link w:val="Heading3"/>
@@ -2939,7 +2660,7 @@
       <w:szCs w:val="28"/>
     </w:rPr>
   </w:style>
-  <w:style w:type="character" w:styleId="Heading4Char" w:customStyle="1">
+  <w:style w:type="character" w:customStyle="1" w:styleId="Heading4Char">
     <w:name w:val="Heading 4 Char"/>
     <w:basedOn w:val="DefaultParagraphFont"/>
     <w:link w:val="Heading4"/>
@@ -2953,7 +2674,7 @@
       <w:color w:val="0F4761" w:themeColor="accent1" w:themeShade="BF"/>
     </w:rPr>
   </w:style>
-  <w:style w:type="character" w:styleId="Heading5Char" w:customStyle="1">
+  <w:style w:type="character" w:customStyle="1" w:styleId="Heading5Char">
     <w:name w:val="Heading 5 Char"/>
     <w:basedOn w:val="DefaultParagraphFont"/>
     <w:link w:val="Heading5"/>
@@ -2965,7 +2686,7 @@
       <w:color w:val="0F4761" w:themeColor="accent1" w:themeShade="BF"/>
     </w:rPr>
   </w:style>
-  <w:style w:type="character" w:styleId="Heading6Char" w:customStyle="1">
+  <w:style w:type="character" w:customStyle="1" w:styleId="Heading6Char">
     <w:name w:val="Heading 6 Char"/>
     <w:basedOn w:val="DefaultParagraphFont"/>
     <w:link w:val="Heading6"/>
@@ -2979,7 +2700,7 @@
       <w:color w:val="595959" w:themeColor="text1" w:themeTint="A6"/>
     </w:rPr>
   </w:style>
-  <w:style w:type="character" w:styleId="Heading7Char" w:customStyle="1">
+  <w:style w:type="character" w:customStyle="1" w:styleId="Heading7Char">
     <w:name w:val="Heading 7 Char"/>
     <w:basedOn w:val="DefaultParagraphFont"/>
     <w:link w:val="Heading7"/>
@@ -2991,7 +2712,7 @@
       <w:color w:val="595959" w:themeColor="text1" w:themeTint="A6"/>
     </w:rPr>
   </w:style>
-  <w:style w:type="character" w:styleId="Heading8Char" w:customStyle="1">
+  <w:style w:type="character" w:customStyle="1" w:styleId="Heading8Char">
     <w:name w:val="Heading 8 Char"/>
     <w:basedOn w:val="DefaultParagraphFont"/>
     <w:link w:val="Heading8"/>
@@ -3005,7 +2726,7 @@
       <w:color w:val="272727" w:themeColor="text1" w:themeTint="D8"/>
     </w:rPr>
   </w:style>
-  <w:style w:type="character" w:styleId="Heading9Char" w:customStyle="1">
+  <w:style w:type="character" w:customStyle="1" w:styleId="Heading9Char">
     <w:name w:val="Heading 9 Char"/>
     <w:basedOn w:val="DefaultParagraphFont"/>
     <w:link w:val="Heading9"/>
@@ -3030,21 +2751,21 @@
       <w:contextualSpacing/>
     </w:pPr>
     <w:rPr>
-      <w:rFonts w:asciiTheme="majorHAnsi" w:hAnsiTheme="majorHAnsi" w:eastAsiaTheme="majorEastAsia" w:cstheme="majorBidi"/>
+      <w:rFonts w:asciiTheme="majorHAnsi" w:eastAsiaTheme="majorEastAsia" w:hAnsiTheme="majorHAnsi" w:cstheme="majorBidi"/>
       <w:spacing w:val="-10"/>
       <w:kern w:val="28"/>
       <w:sz w:val="56"/>
       <w:szCs w:val="56"/>
     </w:rPr>
   </w:style>
-  <w:style w:type="character" w:styleId="TitleChar" w:customStyle="1">
+  <w:style w:type="character" w:customStyle="1" w:styleId="TitleChar">
     <w:name w:val="Title Char"/>
     <w:basedOn w:val="DefaultParagraphFont"/>
     <w:link w:val="Title"/>
     <w:uiPriority w:val="10"/>
     <w:rsid w:val="00D3067B"/>
     <w:rPr>
-      <w:rFonts w:asciiTheme="majorHAnsi" w:hAnsiTheme="majorHAnsi" w:eastAsiaTheme="majorEastAsia" w:cstheme="majorBidi"/>
+      <w:rFonts w:asciiTheme="majorHAnsi" w:eastAsiaTheme="majorEastAsia" w:hAnsiTheme="majorHAnsi" w:cstheme="majorBidi"/>
       <w:spacing w:val="-10"/>
       <w:kern w:val="28"/>
       <w:sz w:val="56"/>
@@ -3072,7 +2793,7 @@
       <w:szCs w:val="28"/>
     </w:rPr>
   </w:style>
-  <w:style w:type="character" w:styleId="SubtitleChar" w:customStyle="1">
+  <w:style w:type="character" w:customStyle="1" w:styleId="SubtitleChar">
     <w:name w:val="Subtitle Char"/>
     <w:basedOn w:val="DefaultParagraphFont"/>
     <w:link w:val="Subtitle"/>
@@ -3104,7 +2825,7 @@
       <w:color w:val="404040" w:themeColor="text1" w:themeTint="BF"/>
     </w:rPr>
   </w:style>
-  <w:style w:type="character" w:styleId="QuoteChar" w:customStyle="1">
+  <w:style w:type="character" w:customStyle="1" w:styleId="QuoteChar">
     <w:name w:val="Quote Char"/>
     <w:basedOn w:val="DefaultParagraphFont"/>
     <w:link w:val="Quote"/>
@@ -3149,8 +2870,8 @@
     <w:rsid w:val="00D3067B"/>
     <w:pPr>
       <w:pBdr>
-        <w:top w:val="single" w:color="0F4761" w:themeColor="accent1" w:themeShade="BF" w:sz="4" w:space="10"/>
-        <w:bottom w:val="single" w:color="0F4761" w:themeColor="accent1" w:themeShade="BF" w:sz="4" w:space="10"/>
+        <w:top w:val="single" w:sz="4" w:space="10" w:color="0F4761" w:themeColor="accent1" w:themeShade="BF"/>
+        <w:bottom w:val="single" w:sz="4" w:space="10" w:color="0F4761" w:themeColor="accent1" w:themeShade="BF"/>
       </w:pBdr>
       <w:spacing w:before="360" w:after="360"/>
       <w:ind w:left="864" w:right="864"/>
@@ -3162,7 +2883,7 @@
       <w:color w:val="0F4761" w:themeColor="accent1" w:themeShade="BF"/>
     </w:rPr>
   </w:style>
-  <w:style w:type="character" w:styleId="IntenseQuoteChar" w:customStyle="1">
+  <w:style w:type="character" w:customStyle="1" w:styleId="IntenseQuoteChar">
     <w:name w:val="Intense Quote Char"/>
     <w:basedOn w:val="DefaultParagraphFont"/>
     <w:link w:val="IntenseQuote"/>
@@ -3192,7 +2913,7 @@
 </file>
 
 <file path=word/theme/theme1.xml><?xml version="1.0" encoding="utf-8"?>
-<a:theme xmlns:a="http://schemas.openxmlformats.org/drawingml/2006/main" xmlns:thm15="http://schemas.microsoft.com/office/thememl/2012/main" name="Office Theme">
+<a:theme xmlns:a="http://schemas.openxmlformats.org/drawingml/2006/main" name="Office Theme">
   <a:themeElements>
     <a:clrScheme name="Office">
       <a:dk1>

</xml_diff>